<commit_message>
IFRC - Emergencies in the last 30 days
</commit_message>
<xml_diff>
--- a/Open_Data_Enlaces.docx
+++ b/Open_Data_Enlaces.docx
@@ -34,7 +34,7 @@
         <w:pStyle w:val="Date"/>
       </w:pPr>
       <w:r>
-        <w:t xml:space="preserve">2026-05-13</w:t>
+        <w:t xml:space="preserve">2026-07-15</w:t>
       </w:r>
     </w:p>
     <w:p>
@@ -286,7 +286,7 @@
         <w:t xml:space="preserve">)</w:t>
       </w:r>
     </w:p>
-    <w:bookmarkStart w:id="337" w:name="fuentes-de-datos-abiertos-y-apis"/>
+    <w:bookmarkStart w:id="338" w:name="fuentes-de-datos-abiertos-y-apis"/>
     <w:p>
       <w:pPr>
         <w:pStyle w:val="Heading2"/>
@@ -2965,6 +2965,23 @@
           <w:rPr>
             <w:rStyle w:val="Hyperlink"/>
           </w:rPr>
+          <w:t xml:space="preserve">IFRC - Emergencies in the last 30 days</w:t>
+        </w:r>
+      </w:hyperlink>
+    </w:p>
+    <w:p>
+      <w:pPr>
+        <w:pStyle w:val="Compact"/>
+        <w:numPr>
+          <w:ilvl w:val="0"/>
+          <w:numId w:val="1001"/>
+        </w:numPr>
+      </w:pPr>
+      <w:hyperlink r:id="rId166">
+        <w:r>
+          <w:rPr>
+            <w:rStyle w:val="Hyperlink"/>
+          </w:rPr>
           <w:t xml:space="preserve">ImageNet database</w:t>
         </w:r>
       </w:hyperlink>
@@ -2977,7 +2994,7 @@
           <w:numId w:val="1001"/>
         </w:numPr>
       </w:pPr>
-      <w:hyperlink r:id="rId166">
+      <w:hyperlink r:id="rId167">
         <w:r>
           <w:rPr>
             <w:rStyle w:val="Hyperlink"/>
@@ -2994,7 +3011,7 @@
           <w:numId w:val="1001"/>
         </w:numPr>
       </w:pPr>
-      <w:hyperlink r:id="rId167">
+      <w:hyperlink r:id="rId168">
         <w:r>
           <w:rPr>
             <w:rStyle w:val="Hyperlink"/>
@@ -3011,7 +3028,7 @@
           <w:numId w:val="1001"/>
         </w:numPr>
       </w:pPr>
-      <w:hyperlink r:id="rId168">
+      <w:hyperlink r:id="rId169">
         <w:r>
           <w:rPr>
             <w:rStyle w:val="Hyperlink"/>
@@ -3028,7 +3045,7 @@
           <w:numId w:val="1001"/>
         </w:numPr>
       </w:pPr>
-      <w:hyperlink r:id="rId169">
+      <w:hyperlink r:id="rId170">
         <w:r>
           <w:rPr>
             <w:rStyle w:val="Hyperlink"/>
@@ -3045,7 +3062,7 @@
           <w:numId w:val="1001"/>
         </w:numPr>
       </w:pPr>
-      <w:hyperlink r:id="rId170">
+      <w:hyperlink r:id="rId171">
         <w:r>
           <w:rPr>
             <w:rStyle w:val="Hyperlink"/>
@@ -3062,7 +3079,7 @@
           <w:numId w:val="1001"/>
         </w:numPr>
       </w:pPr>
-      <w:hyperlink r:id="rId171">
+      <w:hyperlink r:id="rId172">
         <w:r>
           <w:rPr>
             <w:rStyle w:val="Hyperlink"/>
@@ -3091,7 +3108,7 @@
           <w:numId w:val="1001"/>
         </w:numPr>
       </w:pPr>
-      <w:hyperlink r:id="rId172">
+      <w:hyperlink r:id="rId173">
         <w:r>
           <w:rPr>
             <w:rStyle w:val="Hyperlink"/>
@@ -3108,7 +3125,7 @@
           <w:numId w:val="1001"/>
         </w:numPr>
       </w:pPr>
-      <w:hyperlink r:id="rId173">
+      <w:hyperlink r:id="rId174">
         <w:r>
           <w:rPr>
             <w:rStyle w:val="Hyperlink"/>
@@ -3125,7 +3142,7 @@
           <w:numId w:val="1001"/>
         </w:numPr>
       </w:pPr>
-      <w:hyperlink r:id="rId174">
+      <w:hyperlink r:id="rId175">
         <w:r>
           <w:rPr>
             <w:rStyle w:val="Hyperlink"/>
@@ -3142,7 +3159,7 @@
           <w:numId w:val="1001"/>
         </w:numPr>
       </w:pPr>
-      <w:hyperlink r:id="rId175">
+      <w:hyperlink r:id="rId176">
         <w:r>
           <w:rPr>
             <w:rStyle w:val="Hyperlink"/>
@@ -3159,7 +3176,7 @@
           <w:numId w:val="1001"/>
         </w:numPr>
       </w:pPr>
-      <w:hyperlink r:id="rId176">
+      <w:hyperlink r:id="rId177">
         <w:r>
           <w:rPr>
             <w:rStyle w:val="Hyperlink"/>
@@ -3176,7 +3193,7 @@
           <w:numId w:val="1001"/>
         </w:numPr>
       </w:pPr>
-      <w:hyperlink r:id="rId177">
+      <w:hyperlink r:id="rId178">
         <w:r>
           <w:rPr>
             <w:rStyle w:val="Hyperlink"/>
@@ -3193,7 +3210,7 @@
           <w:numId w:val="1001"/>
         </w:numPr>
       </w:pPr>
-      <w:hyperlink r:id="rId178">
+      <w:hyperlink r:id="rId179">
         <w:r>
           <w:rPr>
             <w:rStyle w:val="Hyperlink"/>
@@ -3210,7 +3227,7 @@
           <w:numId w:val="1001"/>
         </w:numPr>
       </w:pPr>
-      <w:hyperlink r:id="rId179">
+      <w:hyperlink r:id="rId180">
         <w:r>
           <w:rPr>
             <w:rStyle w:val="Hyperlink"/>
@@ -3227,7 +3244,7 @@
           <w:numId w:val="1001"/>
         </w:numPr>
       </w:pPr>
-      <w:hyperlink r:id="rId180">
+      <w:hyperlink r:id="rId181">
         <w:r>
           <w:rPr>
             <w:rStyle w:val="Hyperlink"/>
@@ -3244,7 +3261,7 @@
           <w:numId w:val="1001"/>
         </w:numPr>
       </w:pPr>
-      <w:hyperlink r:id="rId181">
+      <w:hyperlink r:id="rId182">
         <w:r>
           <w:rPr>
             <w:rStyle w:val="Hyperlink"/>
@@ -3261,7 +3278,7 @@
           <w:numId w:val="1001"/>
         </w:numPr>
       </w:pPr>
-      <w:hyperlink r:id="rId182">
+      <w:hyperlink r:id="rId183">
         <w:r>
           <w:rPr>
             <w:rStyle w:val="Hyperlink"/>
@@ -3278,7 +3295,7 @@
           <w:numId w:val="1001"/>
         </w:numPr>
       </w:pPr>
-      <w:hyperlink r:id="rId183">
+      <w:hyperlink r:id="rId184">
         <w:r>
           <w:rPr>
             <w:rStyle w:val="Hyperlink"/>
@@ -3295,7 +3312,7 @@
           <w:numId w:val="1001"/>
         </w:numPr>
       </w:pPr>
-      <w:hyperlink r:id="rId184">
+      <w:hyperlink r:id="rId185">
         <w:r>
           <w:rPr>
             <w:rStyle w:val="Hyperlink"/>
@@ -3312,7 +3329,7 @@
           <w:numId w:val="1001"/>
         </w:numPr>
       </w:pPr>
-      <w:hyperlink r:id="rId185">
+      <w:hyperlink r:id="rId186">
         <w:r>
           <w:rPr>
             <w:rStyle w:val="Hyperlink"/>
@@ -3329,7 +3346,7 @@
           <w:numId w:val="1001"/>
         </w:numPr>
       </w:pPr>
-      <w:hyperlink r:id="rId186">
+      <w:hyperlink r:id="rId187">
         <w:r>
           <w:rPr>
             <w:rStyle w:val="Hyperlink"/>
@@ -3346,7 +3363,7 @@
           <w:numId w:val="1001"/>
         </w:numPr>
       </w:pPr>
-      <w:hyperlink r:id="rId187">
+      <w:hyperlink r:id="rId188">
         <w:r>
           <w:rPr>
             <w:rStyle w:val="Hyperlink"/>
@@ -3363,7 +3380,7 @@
           <w:numId w:val="1001"/>
         </w:numPr>
       </w:pPr>
-      <w:hyperlink r:id="rId188">
+      <w:hyperlink r:id="rId189">
         <w:r>
           <w:rPr>
             <w:rStyle w:val="Hyperlink"/>
@@ -3380,7 +3397,7 @@
           <w:numId w:val="1001"/>
         </w:numPr>
       </w:pPr>
-      <w:hyperlink r:id="rId189">
+      <w:hyperlink r:id="rId190">
         <w:r>
           <w:rPr>
             <w:rStyle w:val="Hyperlink"/>
@@ -3397,7 +3414,7 @@
           <w:numId w:val="1001"/>
         </w:numPr>
       </w:pPr>
-      <w:hyperlink r:id="rId190">
+      <w:hyperlink r:id="rId191">
         <w:r>
           <w:rPr>
             <w:rStyle w:val="Hyperlink"/>
@@ -3414,7 +3431,7 @@
           <w:numId w:val="1001"/>
         </w:numPr>
       </w:pPr>
-      <w:hyperlink r:id="rId191">
+      <w:hyperlink r:id="rId192">
         <w:r>
           <w:rPr>
             <w:rStyle w:val="Hyperlink"/>
@@ -3431,7 +3448,7 @@
           <w:numId w:val="1001"/>
         </w:numPr>
       </w:pPr>
-      <w:hyperlink r:id="rId192">
+      <w:hyperlink r:id="rId193">
         <w:r>
           <w:rPr>
             <w:rStyle w:val="Hyperlink"/>
@@ -3448,7 +3465,7 @@
           <w:numId w:val="1001"/>
         </w:numPr>
       </w:pPr>
-      <w:hyperlink r:id="rId193">
+      <w:hyperlink r:id="rId194">
         <w:r>
           <w:rPr>
             <w:rStyle w:val="Hyperlink"/>
@@ -3471,7 +3488,7 @@
       <w:r>
         <w:t xml:space="preserve"> </w:t>
       </w:r>
-      <w:hyperlink r:id="rId194">
+      <w:hyperlink r:id="rId195">
         <w:r>
           <w:rPr>
             <w:rStyle w:val="Hyperlink"/>
@@ -3482,7 +3499,7 @@
       <w:r>
         <w:t xml:space="preserve"> </w:t>
       </w:r>
-      <w:hyperlink r:id="rId195">
+      <w:hyperlink r:id="rId196">
         <w:r>
           <w:rPr>
             <w:rStyle w:val="Hyperlink"/>
@@ -3505,7 +3522,7 @@
           <w:numId w:val="1001"/>
         </w:numPr>
       </w:pPr>
-      <w:hyperlink r:id="rId196">
+      <w:hyperlink r:id="rId197">
         <w:r>
           <w:rPr>
             <w:rStyle w:val="Hyperlink"/>
@@ -3528,7 +3545,7 @@
           <w:numId w:val="1001"/>
         </w:numPr>
       </w:pPr>
-      <w:hyperlink r:id="rId197">
+      <w:hyperlink r:id="rId198">
         <w:r>
           <w:rPr>
             <w:rStyle w:val="Hyperlink"/>
@@ -3551,7 +3568,7 @@
           <w:numId w:val="1001"/>
         </w:numPr>
       </w:pPr>
-      <w:hyperlink r:id="rId198">
+      <w:hyperlink r:id="rId199">
         <w:r>
           <w:rPr>
             <w:rStyle w:val="Hyperlink"/>
@@ -3568,7 +3585,7 @@
           <w:numId w:val="1001"/>
         </w:numPr>
       </w:pPr>
-      <w:hyperlink r:id="rId199">
+      <w:hyperlink r:id="rId200">
         <w:r>
           <w:rPr>
             <w:rStyle w:val="Hyperlink"/>
@@ -3585,7 +3602,7 @@
           <w:numId w:val="1001"/>
         </w:numPr>
       </w:pPr>
-      <w:hyperlink r:id="rId200">
+      <w:hyperlink r:id="rId201">
         <w:r>
           <w:rPr>
             <w:rStyle w:val="Hyperlink"/>
@@ -3608,7 +3625,7 @@
           <w:numId w:val="1001"/>
         </w:numPr>
       </w:pPr>
-      <w:hyperlink r:id="rId201">
+      <w:hyperlink r:id="rId202">
         <w:r>
           <w:rPr>
             <w:rStyle w:val="Hyperlink"/>
@@ -3631,7 +3648,7 @@
           <w:numId w:val="1001"/>
         </w:numPr>
       </w:pPr>
-      <w:hyperlink r:id="rId202">
+      <w:hyperlink r:id="rId203">
         <w:r>
           <w:rPr>
             <w:rStyle w:val="Hyperlink"/>
@@ -3648,7 +3665,7 @@
           <w:numId w:val="1001"/>
         </w:numPr>
       </w:pPr>
-      <w:hyperlink r:id="rId203">
+      <w:hyperlink r:id="rId204">
         <w:r>
           <w:rPr>
             <w:rStyle w:val="Hyperlink"/>
@@ -3665,7 +3682,7 @@
           <w:numId w:val="1001"/>
         </w:numPr>
       </w:pPr>
-      <w:hyperlink r:id="rId204">
+      <w:hyperlink r:id="rId205">
         <w:r>
           <w:rPr>
             <w:rStyle w:val="Hyperlink"/>
@@ -3682,7 +3699,7 @@
           <w:numId w:val="1001"/>
         </w:numPr>
       </w:pPr>
-      <w:hyperlink r:id="rId205">
+      <w:hyperlink r:id="rId206">
         <w:r>
           <w:rPr>
             <w:rStyle w:val="Hyperlink"/>
@@ -3699,7 +3716,7 @@
           <w:numId w:val="1001"/>
         </w:numPr>
       </w:pPr>
-      <w:hyperlink r:id="rId206">
+      <w:hyperlink r:id="rId207">
         <w:r>
           <w:rPr>
             <w:rStyle w:val="Hyperlink"/>
@@ -3716,7 +3733,7 @@
           <w:numId w:val="1001"/>
         </w:numPr>
       </w:pPr>
-      <w:hyperlink r:id="rId207">
+      <w:hyperlink r:id="rId208">
         <w:r>
           <w:rPr>
             <w:rStyle w:val="Hyperlink"/>
@@ -3733,7 +3750,7 @@
           <w:numId w:val="1001"/>
         </w:numPr>
       </w:pPr>
-      <w:hyperlink r:id="rId208">
+      <w:hyperlink r:id="rId209">
         <w:r>
           <w:rPr>
             <w:rStyle w:val="Hyperlink"/>
@@ -3750,7 +3767,7 @@
           <w:numId w:val="1001"/>
         </w:numPr>
       </w:pPr>
-      <w:hyperlink r:id="rId209">
+      <w:hyperlink r:id="rId210">
         <w:r>
           <w:rPr>
             <w:rStyle w:val="Hyperlink"/>
@@ -3773,7 +3790,7 @@
           <w:numId w:val="1001"/>
         </w:numPr>
       </w:pPr>
-      <w:hyperlink r:id="rId210">
+      <w:hyperlink r:id="rId211">
         <w:r>
           <w:rPr>
             <w:rStyle w:val="Hyperlink"/>
@@ -3790,7 +3807,7 @@
           <w:numId w:val="1001"/>
         </w:numPr>
       </w:pPr>
-      <w:hyperlink r:id="rId211">
+      <w:hyperlink r:id="rId212">
         <w:r>
           <w:rPr>
             <w:rStyle w:val="Hyperlink"/>
@@ -3807,7 +3824,7 @@
           <w:numId w:val="1001"/>
         </w:numPr>
       </w:pPr>
-      <w:hyperlink r:id="rId212">
+      <w:hyperlink r:id="rId213">
         <w:r>
           <w:rPr>
             <w:rStyle w:val="Hyperlink"/>
@@ -3830,7 +3847,7 @@
           <w:numId w:val="1001"/>
         </w:numPr>
       </w:pPr>
-      <w:hyperlink r:id="rId213">
+      <w:hyperlink r:id="rId214">
         <w:r>
           <w:rPr>
             <w:rStyle w:val="Hyperlink"/>
@@ -3847,7 +3864,7 @@
           <w:numId w:val="1001"/>
         </w:numPr>
       </w:pPr>
-      <w:hyperlink r:id="rId214">
+      <w:hyperlink r:id="rId215">
         <w:r>
           <w:rPr>
             <w:rStyle w:val="Hyperlink"/>
@@ -3864,7 +3881,7 @@
           <w:numId w:val="1001"/>
         </w:numPr>
       </w:pPr>
-      <w:hyperlink r:id="rId215">
+      <w:hyperlink r:id="rId216">
         <w:r>
           <w:rPr>
             <w:rStyle w:val="Hyperlink"/>
@@ -3881,7 +3898,7 @@
           <w:numId w:val="1001"/>
         </w:numPr>
       </w:pPr>
-      <w:hyperlink r:id="rId216">
+      <w:hyperlink r:id="rId217">
         <w:r>
           <w:rPr>
             <w:rStyle w:val="Hyperlink"/>
@@ -3898,7 +3915,7 @@
           <w:numId w:val="1001"/>
         </w:numPr>
       </w:pPr>
-      <w:hyperlink r:id="rId217">
+      <w:hyperlink r:id="rId218">
         <w:r>
           <w:rPr>
             <w:rStyle w:val="Hyperlink"/>
@@ -3915,7 +3932,7 @@
           <w:numId w:val="1001"/>
         </w:numPr>
       </w:pPr>
-      <w:hyperlink r:id="rId218">
+      <w:hyperlink r:id="rId219">
         <w:r>
           <w:rPr>
             <w:rStyle w:val="Hyperlink"/>
@@ -3932,7 +3949,7 @@
           <w:numId w:val="1001"/>
         </w:numPr>
       </w:pPr>
-      <w:hyperlink r:id="rId219">
+      <w:hyperlink r:id="rId220">
         <w:r>
           <w:rPr>
             <w:rStyle w:val="Hyperlink"/>
@@ -3949,7 +3966,7 @@
           <w:numId w:val="1001"/>
         </w:numPr>
       </w:pPr>
-      <w:hyperlink r:id="rId220">
+      <w:hyperlink r:id="rId221">
         <w:r>
           <w:rPr>
             <w:rStyle w:val="Hyperlink"/>
@@ -3972,7 +3989,7 @@
           <w:numId w:val="1001"/>
         </w:numPr>
       </w:pPr>
-      <w:hyperlink r:id="rId221">
+      <w:hyperlink r:id="rId222">
         <w:r>
           <w:rPr>
             <w:rStyle w:val="Hyperlink"/>
@@ -3989,7 +4006,7 @@
           <w:numId w:val="1001"/>
         </w:numPr>
       </w:pPr>
-      <w:hyperlink r:id="rId222">
+      <w:hyperlink r:id="rId223">
         <w:r>
           <w:rPr>
             <w:rStyle w:val="Hyperlink"/>
@@ -4006,7 +4023,7 @@
           <w:numId w:val="1001"/>
         </w:numPr>
       </w:pPr>
-      <w:hyperlink r:id="rId223">
+      <w:hyperlink r:id="rId224">
         <w:r>
           <w:rPr>
             <w:rStyle w:val="Hyperlink"/>
@@ -4023,7 +4040,7 @@
           <w:numId w:val="1001"/>
         </w:numPr>
       </w:pPr>
-      <w:hyperlink r:id="rId224">
+      <w:hyperlink r:id="rId225">
         <w:r>
           <w:rPr>
             <w:rStyle w:val="Hyperlink"/>
@@ -4040,7 +4057,7 @@
           <w:numId w:val="1001"/>
         </w:numPr>
       </w:pPr>
-      <w:hyperlink r:id="rId225">
+      <w:hyperlink r:id="rId226">
         <w:r>
           <w:rPr>
             <w:rStyle w:val="Hyperlink"/>
@@ -4067,7 +4084,7 @@
           <w:numId w:val="1001"/>
         </w:numPr>
       </w:pPr>
-      <w:hyperlink r:id="rId226">
+      <w:hyperlink r:id="rId227">
         <w:r>
           <w:rPr>
             <w:rStyle w:val="Hyperlink"/>
@@ -4084,7 +4101,7 @@
           <w:numId w:val="1001"/>
         </w:numPr>
       </w:pPr>
-      <w:hyperlink r:id="rId227">
+      <w:hyperlink r:id="rId228">
         <w:r>
           <w:rPr>
             <w:rStyle w:val="Hyperlink"/>
@@ -4101,7 +4118,7 @@
           <w:numId w:val="1001"/>
         </w:numPr>
       </w:pPr>
-      <w:hyperlink r:id="rId228">
+      <w:hyperlink r:id="rId229">
         <w:r>
           <w:rPr>
             <w:rStyle w:val="Hyperlink"/>
@@ -4118,7 +4135,7 @@
           <w:numId w:val="1001"/>
         </w:numPr>
       </w:pPr>
-      <w:hyperlink r:id="rId229">
+      <w:hyperlink r:id="rId230">
         <w:r>
           <w:rPr>
             <w:rStyle w:val="Hyperlink"/>
@@ -4135,7 +4152,7 @@
           <w:numId w:val="1001"/>
         </w:numPr>
       </w:pPr>
-      <w:hyperlink r:id="rId230">
+      <w:hyperlink r:id="rId231">
         <w:r>
           <w:rPr>
             <w:rStyle w:val="Hyperlink"/>
@@ -4158,7 +4175,7 @@
       <w:r>
         <w:t xml:space="preserve"> </w:t>
       </w:r>
-      <w:hyperlink r:id="rId231">
+      <w:hyperlink r:id="rId232">
         <w:r>
           <w:rPr>
             <w:rStyle w:val="Hyperlink"/>
@@ -4169,7 +4186,7 @@
       <w:r>
         <w:t xml:space="preserve"> </w:t>
       </w:r>
-      <w:hyperlink r:id="rId232">
+      <w:hyperlink r:id="rId233">
         <w:r>
           <w:rPr>
             <w:rStyle w:val="Hyperlink"/>
@@ -4180,7 +4197,7 @@
       <w:r>
         <w:t xml:space="preserve"> </w:t>
       </w:r>
-      <w:hyperlink r:id="rId233">
+      <w:hyperlink r:id="rId234">
         <w:r>
           <w:rPr>
             <w:rStyle w:val="Hyperlink"/>
@@ -4203,7 +4220,7 @@
           <w:numId w:val="1001"/>
         </w:numPr>
       </w:pPr>
-      <w:hyperlink r:id="rId234">
+      <w:hyperlink r:id="rId235">
         <w:r>
           <w:rPr>
             <w:rStyle w:val="Hyperlink"/>
@@ -4220,7 +4237,7 @@
           <w:numId w:val="1001"/>
         </w:numPr>
       </w:pPr>
-      <w:hyperlink r:id="rId235">
+      <w:hyperlink r:id="rId236">
         <w:r>
           <w:rPr>
             <w:rStyle w:val="Hyperlink"/>
@@ -4237,7 +4254,7 @@
           <w:numId w:val="1001"/>
         </w:numPr>
       </w:pPr>
-      <w:hyperlink r:id="rId236">
+      <w:hyperlink r:id="rId237">
         <w:r>
           <w:rPr>
             <w:rStyle w:val="Hyperlink"/>
@@ -4266,7 +4283,7 @@
           <w:numId w:val="1001"/>
         </w:numPr>
       </w:pPr>
-      <w:hyperlink r:id="rId237">
+      <w:hyperlink r:id="rId238">
         <w:r>
           <w:rPr>
             <w:rStyle w:val="Hyperlink"/>
@@ -4283,7 +4300,7 @@
           <w:numId w:val="1001"/>
         </w:numPr>
       </w:pPr>
-      <w:hyperlink r:id="rId238">
+      <w:hyperlink r:id="rId239">
         <w:r>
           <w:rPr>
             <w:rStyle w:val="Hyperlink"/>
@@ -4300,7 +4317,7 @@
           <w:numId w:val="1001"/>
         </w:numPr>
       </w:pPr>
-      <w:hyperlink r:id="rId239">
+      <w:hyperlink r:id="rId240">
         <w:r>
           <w:rPr>
             <w:rStyle w:val="Hyperlink"/>
@@ -4317,7 +4334,7 @@
           <w:numId w:val="1001"/>
         </w:numPr>
       </w:pPr>
-      <w:hyperlink r:id="rId240">
+      <w:hyperlink r:id="rId241">
         <w:r>
           <w:rPr>
             <w:rStyle w:val="Hyperlink"/>
@@ -4334,7 +4351,7 @@
           <w:numId w:val="1001"/>
         </w:numPr>
       </w:pPr>
-      <w:hyperlink r:id="rId241">
+      <w:hyperlink r:id="rId242">
         <w:r>
           <w:rPr>
             <w:rStyle w:val="Hyperlink"/>
@@ -4351,7 +4368,7 @@
           <w:numId w:val="1001"/>
         </w:numPr>
       </w:pPr>
-      <w:hyperlink r:id="rId242">
+      <w:hyperlink r:id="rId243">
         <w:r>
           <w:rPr>
             <w:rStyle w:val="Hyperlink"/>
@@ -4368,7 +4385,7 @@
           <w:numId w:val="1001"/>
         </w:numPr>
       </w:pPr>
-      <w:hyperlink r:id="rId243">
+      <w:hyperlink r:id="rId244">
         <w:r>
           <w:rPr>
             <w:rStyle w:val="Hyperlink"/>
@@ -4385,7 +4402,7 @@
           <w:numId w:val="1001"/>
         </w:numPr>
       </w:pPr>
-      <w:hyperlink r:id="rId244">
+      <w:hyperlink r:id="rId245">
         <w:r>
           <w:rPr>
             <w:rStyle w:val="Hyperlink"/>
@@ -4402,7 +4419,7 @@
           <w:numId w:val="1001"/>
         </w:numPr>
       </w:pPr>
-      <w:hyperlink r:id="rId245">
+      <w:hyperlink r:id="rId246">
         <w:r>
           <w:rPr>
             <w:rStyle w:val="Hyperlink"/>
@@ -4419,7 +4436,7 @@
           <w:numId w:val="1001"/>
         </w:numPr>
       </w:pPr>
-      <w:hyperlink r:id="rId246">
+      <w:hyperlink r:id="rId247">
         <w:r>
           <w:rPr>
             <w:rStyle w:val="Hyperlink"/>
@@ -4436,7 +4453,7 @@
           <w:numId w:val="1001"/>
         </w:numPr>
       </w:pPr>
-      <w:hyperlink r:id="rId247">
+      <w:hyperlink r:id="rId248">
         <w:r>
           <w:rPr>
             <w:rStyle w:val="Hyperlink"/>
@@ -4453,7 +4470,7 @@
           <w:numId w:val="1001"/>
         </w:numPr>
       </w:pPr>
-      <w:hyperlink r:id="rId248">
+      <w:hyperlink r:id="rId249">
         <w:r>
           <w:rPr>
             <w:rStyle w:val="Hyperlink"/>
@@ -4470,7 +4487,7 @@
           <w:numId w:val="1001"/>
         </w:numPr>
       </w:pPr>
-      <w:hyperlink r:id="rId249">
+      <w:hyperlink r:id="rId250">
         <w:r>
           <w:rPr>
             <w:rStyle w:val="Hyperlink"/>
@@ -4487,7 +4504,7 @@
           <w:numId w:val="1001"/>
         </w:numPr>
       </w:pPr>
-      <w:hyperlink r:id="rId250">
+      <w:hyperlink r:id="rId251">
         <w:r>
           <w:rPr>
             <w:rStyle w:val="Hyperlink"/>
@@ -4504,7 +4521,7 @@
           <w:numId w:val="1001"/>
         </w:numPr>
       </w:pPr>
-      <w:hyperlink r:id="rId251">
+      <w:hyperlink r:id="rId252">
         <w:r>
           <w:rPr>
             <w:rStyle w:val="Hyperlink"/>
@@ -4521,7 +4538,7 @@
           <w:numId w:val="1001"/>
         </w:numPr>
       </w:pPr>
-      <w:hyperlink r:id="rId252">
+      <w:hyperlink r:id="rId253">
         <w:r>
           <w:rPr>
             <w:rStyle w:val="Hyperlink"/>
@@ -4538,7 +4555,7 @@
           <w:numId w:val="1001"/>
         </w:numPr>
       </w:pPr>
-      <w:hyperlink r:id="rId253">
+      <w:hyperlink r:id="rId254">
         <w:r>
           <w:rPr>
             <w:rStyle w:val="Hyperlink"/>
@@ -4555,7 +4572,7 @@
           <w:numId w:val="1001"/>
         </w:numPr>
       </w:pPr>
-      <w:hyperlink r:id="rId254">
+      <w:hyperlink r:id="rId255">
         <w:r>
           <w:rPr>
             <w:rStyle w:val="Hyperlink"/>
@@ -4572,7 +4589,7 @@
           <w:numId w:val="1001"/>
         </w:numPr>
       </w:pPr>
-      <w:hyperlink r:id="rId255">
+      <w:hyperlink r:id="rId256">
         <w:r>
           <w:rPr>
             <w:rStyle w:val="Hyperlink"/>
@@ -4589,7 +4606,7 @@
           <w:numId w:val="1001"/>
         </w:numPr>
       </w:pPr>
-      <w:hyperlink r:id="rId256">
+      <w:hyperlink r:id="rId257">
         <w:r>
           <w:rPr>
             <w:rStyle w:val="Hyperlink"/>
@@ -4606,7 +4623,7 @@
           <w:numId w:val="1001"/>
         </w:numPr>
       </w:pPr>
-      <w:hyperlink r:id="rId257">
+      <w:hyperlink r:id="rId258">
         <w:r>
           <w:rPr>
             <w:rStyle w:val="Hyperlink"/>
@@ -4623,7 +4640,7 @@
           <w:numId w:val="1001"/>
         </w:numPr>
       </w:pPr>
-      <w:hyperlink r:id="rId258">
+      <w:hyperlink r:id="rId259">
         <w:r>
           <w:rPr>
             <w:rStyle w:val="Hyperlink"/>
@@ -4640,7 +4657,7 @@
           <w:numId w:val="1001"/>
         </w:numPr>
       </w:pPr>
-      <w:hyperlink r:id="rId259">
+      <w:hyperlink r:id="rId260">
         <w:r>
           <w:rPr>
             <w:rStyle w:val="Hyperlink"/>
@@ -4657,7 +4674,7 @@
           <w:numId w:val="1001"/>
         </w:numPr>
       </w:pPr>
-      <w:hyperlink r:id="rId260">
+      <w:hyperlink r:id="rId261">
         <w:r>
           <w:rPr>
             <w:rStyle w:val="Hyperlink"/>
@@ -4674,7 +4691,7 @@
           <w:numId w:val="1001"/>
         </w:numPr>
       </w:pPr>
-      <w:hyperlink r:id="rId261">
+      <w:hyperlink r:id="rId262">
         <w:r>
           <w:rPr>
             <w:rStyle w:val="Hyperlink"/>
@@ -4691,7 +4708,7 @@
           <w:numId w:val="1001"/>
         </w:numPr>
       </w:pPr>
-      <w:hyperlink r:id="rId262">
+      <w:hyperlink r:id="rId263">
         <w:r>
           <w:rPr>
             <w:rStyle w:val="Hyperlink"/>
@@ -4708,7 +4725,7 @@
           <w:numId w:val="1001"/>
         </w:numPr>
       </w:pPr>
-      <w:hyperlink r:id="rId263">
+      <w:hyperlink r:id="rId264">
         <w:r>
           <w:rPr>
             <w:rStyle w:val="Hyperlink"/>
@@ -4728,7 +4745,7 @@
       <w:r>
         <w:t xml:space="preserve">Socioeconomic Data and Applications Center (SEDAC)</w:t>
       </w:r>
-      <w:hyperlink r:id="rId264">
+      <w:hyperlink r:id="rId265">
         <w:r>
           <w:rPr>
             <w:rStyle w:val="Hyperlink"/>
@@ -4745,7 +4762,7 @@
       <w:r>
         <w:t xml:space="preserve"> </w:t>
       </w:r>
-      <w:hyperlink r:id="rId265">
+      <w:hyperlink r:id="rId266">
         <w:r>
           <w:rPr>
             <w:rStyle w:val="Hyperlink"/>
@@ -4762,7 +4779,7 @@
           <w:numId w:val="1001"/>
         </w:numPr>
       </w:pPr>
-      <w:hyperlink r:id="rId266">
+      <w:hyperlink r:id="rId267">
         <w:r>
           <w:rPr>
             <w:rStyle w:val="Hyperlink"/>
@@ -4779,7 +4796,7 @@
           <w:numId w:val="1001"/>
         </w:numPr>
       </w:pPr>
-      <w:hyperlink r:id="rId267">
+      <w:hyperlink r:id="rId268">
         <w:r>
           <w:rPr>
             <w:rStyle w:val="Hyperlink"/>
@@ -4796,7 +4813,7 @@
           <w:numId w:val="1001"/>
         </w:numPr>
       </w:pPr>
-      <w:hyperlink r:id="rId268">
+      <w:hyperlink r:id="rId269">
         <w:r>
           <w:rPr>
             <w:rStyle w:val="Hyperlink"/>
@@ -4813,7 +4830,7 @@
           <w:numId w:val="1001"/>
         </w:numPr>
       </w:pPr>
-      <w:hyperlink r:id="rId269">
+      <w:hyperlink r:id="rId270">
         <w:r>
           <w:rPr>
             <w:rStyle w:val="Hyperlink"/>
@@ -4830,7 +4847,7 @@
           <w:numId w:val="1001"/>
         </w:numPr>
       </w:pPr>
-      <w:hyperlink r:id="rId270">
+      <w:hyperlink r:id="rId271">
         <w:r>
           <w:rPr>
             <w:rStyle w:val="Hyperlink"/>
@@ -4847,7 +4864,7 @@
           <w:numId w:val="1001"/>
         </w:numPr>
       </w:pPr>
-      <w:hyperlink r:id="rId271">
+      <w:hyperlink r:id="rId272">
         <w:r>
           <w:rPr>
             <w:rStyle w:val="Hyperlink"/>
@@ -4864,7 +4881,7 @@
           <w:numId w:val="1001"/>
         </w:numPr>
       </w:pPr>
-      <w:hyperlink r:id="rId272">
+      <w:hyperlink r:id="rId273">
         <w:r>
           <w:rPr>
             <w:rStyle w:val="Hyperlink"/>
@@ -4881,7 +4898,7 @@
           <w:numId w:val="1001"/>
         </w:numPr>
       </w:pPr>
-      <w:hyperlink r:id="rId273">
+      <w:hyperlink r:id="rId274">
         <w:r>
           <w:rPr>
             <w:rStyle w:val="Hyperlink"/>
@@ -4904,7 +4921,7 @@
           <w:numId w:val="1001"/>
         </w:numPr>
       </w:pPr>
-      <w:hyperlink r:id="rId274">
+      <w:hyperlink r:id="rId275">
         <w:r>
           <w:rPr>
             <w:rStyle w:val="Hyperlink"/>
@@ -4921,7 +4938,7 @@
           <w:numId w:val="1001"/>
         </w:numPr>
       </w:pPr>
-      <w:hyperlink r:id="rId275">
+      <w:hyperlink r:id="rId276">
         <w:r>
           <w:rPr>
             <w:rStyle w:val="Hyperlink"/>
@@ -4938,7 +4955,7 @@
           <w:numId w:val="1001"/>
         </w:numPr>
       </w:pPr>
-      <w:hyperlink r:id="rId276">
+      <w:hyperlink r:id="rId277">
         <w:r>
           <w:rPr>
             <w:rStyle w:val="Hyperlink"/>
@@ -4955,7 +4972,7 @@
           <w:numId w:val="1001"/>
         </w:numPr>
       </w:pPr>
-      <w:hyperlink r:id="rId277">
+      <w:hyperlink r:id="rId278">
         <w:r>
           <w:rPr>
             <w:rStyle w:val="Hyperlink"/>
@@ -4978,7 +4995,7 @@
           <w:numId w:val="1001"/>
         </w:numPr>
       </w:pPr>
-      <w:hyperlink r:id="rId278">
+      <w:hyperlink r:id="rId279">
         <w:r>
           <w:rPr>
             <w:rStyle w:val="Hyperlink"/>
@@ -4995,7 +5012,7 @@
           <w:numId w:val="1001"/>
         </w:numPr>
       </w:pPr>
-      <w:hyperlink r:id="rId279">
+      <w:hyperlink r:id="rId280">
         <w:r>
           <w:rPr>
             <w:rStyle w:val="Hyperlink"/>
@@ -5012,7 +5029,7 @@
           <w:numId w:val="1001"/>
         </w:numPr>
       </w:pPr>
-      <w:hyperlink r:id="rId280">
+      <w:hyperlink r:id="rId281">
         <w:r>
           <w:rPr>
             <w:rStyle w:val="Hyperlink"/>
@@ -5029,7 +5046,7 @@
           <w:numId w:val="1001"/>
         </w:numPr>
       </w:pPr>
-      <w:hyperlink r:id="rId281">
+      <w:hyperlink r:id="rId282">
         <w:r>
           <w:rPr>
             <w:rStyle w:val="Hyperlink"/>
@@ -5046,7 +5063,7 @@
           <w:numId w:val="1001"/>
         </w:numPr>
       </w:pPr>
-      <w:hyperlink r:id="rId282">
+      <w:hyperlink r:id="rId283">
         <w:r>
           <w:rPr>
             <w:rStyle w:val="Hyperlink"/>
@@ -5063,7 +5080,7 @@
           <w:numId w:val="1001"/>
         </w:numPr>
       </w:pPr>
-      <w:hyperlink r:id="rId283">
+      <w:hyperlink r:id="rId284">
         <w:r>
           <w:rPr>
             <w:rStyle w:val="Hyperlink"/>
@@ -5080,7 +5097,7 @@
           <w:numId w:val="1001"/>
         </w:numPr>
       </w:pPr>
-      <w:hyperlink r:id="rId284">
+      <w:hyperlink r:id="rId285">
         <w:r>
           <w:rPr>
             <w:rStyle w:val="Hyperlink"/>
@@ -5097,7 +5114,7 @@
           <w:numId w:val="1001"/>
         </w:numPr>
       </w:pPr>
-      <w:hyperlink r:id="rId285">
+      <w:hyperlink r:id="rId286">
         <w:r>
           <w:rPr>
             <w:rStyle w:val="Hyperlink"/>
@@ -5114,7 +5131,7 @@
           <w:numId w:val="1001"/>
         </w:numPr>
       </w:pPr>
-      <w:hyperlink r:id="rId286">
+      <w:hyperlink r:id="rId287">
         <w:r>
           <w:rPr>
             <w:rStyle w:val="Hyperlink"/>
@@ -5131,7 +5148,7 @@
           <w:numId w:val="1001"/>
         </w:numPr>
       </w:pPr>
-      <w:hyperlink r:id="rId287">
+      <w:hyperlink r:id="rId288">
         <w:r>
           <w:rPr>
             <w:rStyle w:val="Hyperlink"/>
@@ -5148,7 +5165,7 @@
           <w:numId w:val="1001"/>
         </w:numPr>
       </w:pPr>
-      <w:hyperlink r:id="rId288">
+      <w:hyperlink r:id="rId289">
         <w:r>
           <w:rPr>
             <w:rStyle w:val="Hyperlink"/>
@@ -5165,7 +5182,7 @@
           <w:numId w:val="1001"/>
         </w:numPr>
       </w:pPr>
-      <w:hyperlink r:id="rId289">
+      <w:hyperlink r:id="rId290">
         <w:r>
           <w:rPr>
             <w:rStyle w:val="Hyperlink"/>
@@ -5182,7 +5199,7 @@
           <w:numId w:val="1001"/>
         </w:numPr>
       </w:pPr>
-      <w:hyperlink r:id="rId290">
+      <w:hyperlink r:id="rId291">
         <w:r>
           <w:rPr>
             <w:rStyle w:val="Hyperlink"/>
@@ -5199,7 +5216,7 @@
           <w:numId w:val="1001"/>
         </w:numPr>
       </w:pPr>
-      <w:hyperlink r:id="rId291">
+      <w:hyperlink r:id="rId292">
         <w:r>
           <w:rPr>
             <w:rStyle w:val="Hyperlink"/>
@@ -5216,7 +5233,7 @@
           <w:numId w:val="1001"/>
         </w:numPr>
       </w:pPr>
-      <w:hyperlink r:id="rId292">
+      <w:hyperlink r:id="rId293">
         <w:r>
           <w:rPr>
             <w:rStyle w:val="Hyperlink"/>
@@ -5233,7 +5250,7 @@
           <w:numId w:val="1001"/>
         </w:numPr>
       </w:pPr>
-      <w:hyperlink r:id="rId293">
+      <w:hyperlink r:id="rId294">
         <w:r>
           <w:rPr>
             <w:rStyle w:val="Hyperlink"/>
@@ -5250,7 +5267,7 @@
           <w:numId w:val="1001"/>
         </w:numPr>
       </w:pPr>
-      <w:hyperlink r:id="rId294">
+      <w:hyperlink r:id="rId295">
         <w:r>
           <w:rPr>
             <w:rStyle w:val="Hyperlink"/>
@@ -5267,7 +5284,7 @@
           <w:numId w:val="1001"/>
         </w:numPr>
       </w:pPr>
-      <w:hyperlink r:id="rId295">
+      <w:hyperlink r:id="rId296">
         <w:r>
           <w:rPr>
             <w:rStyle w:val="Hyperlink"/>
@@ -5284,7 +5301,7 @@
           <w:numId w:val="1001"/>
         </w:numPr>
       </w:pPr>
-      <w:hyperlink r:id="rId296">
+      <w:hyperlink r:id="rId297">
         <w:r>
           <w:rPr>
             <w:rStyle w:val="Hyperlink"/>
@@ -5301,7 +5318,7 @@
           <w:numId w:val="1001"/>
         </w:numPr>
       </w:pPr>
-      <w:hyperlink r:id="rId297">
+      <w:hyperlink r:id="rId298">
         <w:r>
           <w:rPr>
             <w:rStyle w:val="Hyperlink"/>
@@ -5318,7 +5335,7 @@
           <w:numId w:val="1001"/>
         </w:numPr>
       </w:pPr>
-      <w:hyperlink r:id="rId298">
+      <w:hyperlink r:id="rId299">
         <w:r>
           <w:rPr>
             <w:rStyle w:val="Hyperlink"/>
@@ -5335,7 +5352,7 @@
           <w:numId w:val="1001"/>
         </w:numPr>
       </w:pPr>
-      <w:hyperlink r:id="rId299">
+      <w:hyperlink r:id="rId300">
         <w:r>
           <w:rPr>
             <w:rStyle w:val="Hyperlink"/>
@@ -5352,7 +5369,7 @@
           <w:numId w:val="1001"/>
         </w:numPr>
       </w:pPr>
-      <w:hyperlink r:id="rId300">
+      <w:hyperlink r:id="rId301">
         <w:r>
           <w:rPr>
             <w:rStyle w:val="Hyperlink"/>
@@ -5369,7 +5386,7 @@
           <w:numId w:val="1001"/>
         </w:numPr>
       </w:pPr>
-      <w:hyperlink r:id="rId301">
+      <w:hyperlink r:id="rId302">
         <w:r>
           <w:rPr>
             <w:rStyle w:val="Hyperlink"/>
@@ -5386,7 +5403,7 @@
           <w:numId w:val="1001"/>
         </w:numPr>
       </w:pPr>
-      <w:hyperlink r:id="rId302">
+      <w:hyperlink r:id="rId303">
         <w:r>
           <w:rPr>
             <w:rStyle w:val="Hyperlink"/>
@@ -5403,7 +5420,7 @@
           <w:numId w:val="1001"/>
         </w:numPr>
       </w:pPr>
-      <w:hyperlink r:id="rId303">
+      <w:hyperlink r:id="rId304">
         <w:r>
           <w:rPr>
             <w:rStyle w:val="Hyperlink"/>
@@ -5420,7 +5437,7 @@
           <w:numId w:val="1001"/>
         </w:numPr>
       </w:pPr>
-      <w:hyperlink r:id="rId304">
+      <w:hyperlink r:id="rId305">
         <w:r>
           <w:rPr>
             <w:rStyle w:val="Hyperlink"/>
@@ -5443,7 +5460,7 @@
           <w:numId w:val="1001"/>
         </w:numPr>
       </w:pPr>
-      <w:hyperlink r:id="rId305">
+      <w:hyperlink r:id="rId306">
         <w:r>
           <w:rPr>
             <w:rStyle w:val="Hyperlink"/>
@@ -5466,7 +5483,7 @@
           <w:numId w:val="1001"/>
         </w:numPr>
       </w:pPr>
-      <w:hyperlink r:id="rId306">
+      <w:hyperlink r:id="rId307">
         <w:r>
           <w:rPr>
             <w:rStyle w:val="Hyperlink"/>
@@ -5483,7 +5500,7 @@
           <w:numId w:val="1001"/>
         </w:numPr>
       </w:pPr>
-      <w:hyperlink r:id="rId307">
+      <w:hyperlink r:id="rId308">
         <w:r>
           <w:rPr>
             <w:rStyle w:val="Hyperlink"/>
@@ -5500,7 +5517,7 @@
           <w:numId w:val="1001"/>
         </w:numPr>
       </w:pPr>
-      <w:hyperlink r:id="rId308">
+      <w:hyperlink r:id="rId309">
         <w:r>
           <w:rPr>
             <w:rStyle w:val="Hyperlink"/>
@@ -5520,7 +5537,7 @@
       <w:r>
         <w:t xml:space="preserve">WorldCereal open global harmonized reference data repository [Data]](</w:t>
       </w:r>
-      <w:hyperlink r:id="rId309">
+      <w:hyperlink r:id="rId310">
         <w:r>
           <w:rPr>
             <w:rStyle w:val="Hyperlink"/>
@@ -5534,7 +5551,7 @@
       <w:r>
         <w:t xml:space="preserve"> </w:t>
       </w:r>
-      <w:hyperlink r:id="rId310">
+      <w:hyperlink r:id="rId311">
         <w:r>
           <w:rPr>
             <w:rStyle w:val="Hyperlink"/>
@@ -5551,7 +5568,7 @@
           <w:numId w:val="1001"/>
         </w:numPr>
       </w:pPr>
-      <w:hyperlink r:id="rId311">
+      <w:hyperlink r:id="rId312">
         <w:r>
           <w:rPr>
             <w:rStyle w:val="Hyperlink"/>
@@ -5568,7 +5585,7 @@
       <w:r>
         <w:t xml:space="preserve"> </w:t>
       </w:r>
-      <w:hyperlink r:id="rId312">
+      <w:hyperlink r:id="rId313">
         <w:r>
           <w:rPr>
             <w:rStyle w:val="Hyperlink"/>
@@ -5585,7 +5602,7 @@
           <w:numId w:val="1001"/>
         </w:numPr>
       </w:pPr>
-      <w:hyperlink r:id="rId313">
+      <w:hyperlink r:id="rId314">
         <w:r>
           <w:rPr>
             <w:rStyle w:val="Hyperlink"/>
@@ -5602,7 +5619,7 @@
           <w:numId w:val="1001"/>
         </w:numPr>
       </w:pPr>
-      <w:hyperlink r:id="rId314">
+      <w:hyperlink r:id="rId315">
         <w:r>
           <w:rPr>
             <w:rStyle w:val="Hyperlink"/>
@@ -5625,7 +5642,7 @@
       <w:r>
         <w:t xml:space="preserve"> </w:t>
       </w:r>
-      <w:hyperlink r:id="rId315">
+      <w:hyperlink r:id="rId316">
         <w:r>
           <w:rPr>
             <w:rStyle w:val="Hyperlink"/>
@@ -5642,7 +5659,7 @@
       <w:r>
         <w:t xml:space="preserve"> </w:t>
       </w:r>
-      <w:hyperlink r:id="rId316">
+      <w:hyperlink r:id="rId317">
         <w:r>
           <w:rPr>
             <w:rStyle w:val="Hyperlink"/>
@@ -5665,7 +5682,7 @@
       <w:r>
         <w:t xml:space="preserve"> </w:t>
       </w:r>
-      <w:hyperlink r:id="rId317">
+      <w:hyperlink r:id="rId318">
         <w:r>
           <w:rPr>
             <w:rStyle w:val="Hyperlink"/>
@@ -5676,7 +5693,7 @@
       <w:r>
         <w:t xml:space="preserve"> </w:t>
       </w:r>
-      <w:hyperlink r:id="rId318">
+      <w:hyperlink r:id="rId319">
         <w:r>
           <w:rPr>
             <w:rStyle w:val="Hyperlink"/>
@@ -5696,7 +5713,7 @@
       <w:r>
         <w:t xml:space="preserve">Facebook Neural-Code-Search-Evaluation-Dataset [dataset]](</w:t>
       </w:r>
-      <w:hyperlink r:id="rId319">
+      <w:hyperlink r:id="rId320">
         <w:r>
           <w:rPr>
             <w:rStyle w:val="Hyperlink"/>
@@ -5710,7 +5727,7 @@
       <w:r>
         <w:t xml:space="preserve"> </w:t>
       </w:r>
-      <w:hyperlink r:id="rId320">
+      <w:hyperlink r:id="rId321">
         <w:r>
           <w:rPr>
             <w:rStyle w:val="Hyperlink"/>
@@ -5733,7 +5750,7 @@
       <w:r>
         <w:t xml:space="preserve"> </w:t>
       </w:r>
-      <w:hyperlink r:id="rId321">
+      <w:hyperlink r:id="rId322">
         <w:r>
           <w:rPr>
             <w:rStyle w:val="Hyperlink"/>
@@ -5750,7 +5767,7 @@
       <w:r>
         <w:t xml:space="preserve"> </w:t>
       </w:r>
-      <w:hyperlink r:id="rId322">
+      <w:hyperlink r:id="rId323">
         <w:r>
           <w:rPr>
             <w:rStyle w:val="Hyperlink"/>
@@ -5773,7 +5790,7 @@
       <w:r>
         <w:t xml:space="preserve"> </w:t>
       </w:r>
-      <w:hyperlink r:id="rId323">
+      <w:hyperlink r:id="rId324">
         <w:r>
           <w:rPr>
             <w:rStyle w:val="Hyperlink"/>
@@ -5790,7 +5807,7 @@
       <w:r>
         <w:t xml:space="preserve"> </w:t>
       </w:r>
-      <w:hyperlink r:id="rId324">
+      <w:hyperlink r:id="rId325">
         <w:r>
           <w:rPr>
             <w:rStyle w:val="Hyperlink"/>
@@ -5813,7 +5830,7 @@
       <w:r>
         <w:t xml:space="preserve"> </w:t>
       </w:r>
-      <w:hyperlink r:id="rId325">
+      <w:hyperlink r:id="rId326">
         <w:r>
           <w:rPr>
             <w:rStyle w:val="Hyperlink"/>
@@ -5830,7 +5847,7 @@
       <w:r>
         <w:t xml:space="preserve"> </w:t>
       </w:r>
-      <w:hyperlink r:id="rId326">
+      <w:hyperlink r:id="rId327">
         <w:r>
           <w:rPr>
             <w:rStyle w:val="Hyperlink"/>
@@ -5853,7 +5870,7 @@
       <w:r>
         <w:t xml:space="preserve"> </w:t>
       </w:r>
-      <w:hyperlink r:id="rId327">
+      <w:hyperlink r:id="rId328">
         <w:r>
           <w:rPr>
             <w:rStyle w:val="Hyperlink"/>
@@ -5870,7 +5887,7 @@
       <w:r>
         <w:t xml:space="preserve"> </w:t>
       </w:r>
-      <w:hyperlink r:id="rId328">
+      <w:hyperlink r:id="rId329">
         <w:r>
           <w:rPr>
             <w:rStyle w:val="Hyperlink"/>
@@ -5893,7 +5910,7 @@
       <w:r>
         <w:t xml:space="preserve"> </w:t>
       </w:r>
-      <w:hyperlink r:id="rId329">
+      <w:hyperlink r:id="rId330">
         <w:r>
           <w:rPr>
             <w:rStyle w:val="Hyperlink"/>
@@ -5910,7 +5927,7 @@
       <w:r>
         <w:t xml:space="preserve"> </w:t>
       </w:r>
-      <w:hyperlink r:id="rId330">
+      <w:hyperlink r:id="rId331">
         <w:r>
           <w:rPr>
             <w:rStyle w:val="Hyperlink"/>
@@ -5933,7 +5950,7 @@
       <w:r>
         <w:t xml:space="preserve"> </w:t>
       </w:r>
-      <w:hyperlink r:id="rId331">
+      <w:hyperlink r:id="rId332">
         <w:r>
           <w:rPr>
             <w:rStyle w:val="Hyperlink"/>
@@ -5950,7 +5967,7 @@
       <w:r>
         <w:t xml:space="preserve"> </w:t>
       </w:r>
-      <w:hyperlink r:id="rId332">
+      <w:hyperlink r:id="rId333">
         <w:r>
           <w:rPr>
             <w:rStyle w:val="Hyperlink"/>
@@ -5973,7 +5990,7 @@
       <w:r>
         <w:t xml:space="preserve"> </w:t>
       </w:r>
-      <w:hyperlink r:id="rId333">
+      <w:hyperlink r:id="rId334">
         <w:r>
           <w:rPr>
             <w:rStyle w:val="Hyperlink"/>
@@ -5984,7 +6001,7 @@
       <w:r>
         <w:t xml:space="preserve"> </w:t>
       </w:r>
-      <w:hyperlink r:id="rId334">
+      <w:hyperlink r:id="rId335">
         <w:r>
           <w:rPr>
             <w:rStyle w:val="Hyperlink"/>
@@ -6007,7 +6024,7 @@
       <w:r>
         <w:t xml:space="preserve"> </w:t>
       </w:r>
-      <w:hyperlink r:id="rId335">
+      <w:hyperlink r:id="rId336">
         <w:r>
           <w:rPr>
             <w:rStyle w:val="Hyperlink"/>
@@ -6024,7 +6041,7 @@
       <w:r>
         <w:t xml:space="preserve"> </w:t>
       </w:r>
-      <w:hyperlink r:id="rId336">
+      <w:hyperlink r:id="rId337">
         <w:r>
           <w:rPr>
             <w:rStyle w:val="Hyperlink"/>
@@ -6033,8 +6050,8 @@
         </w:r>
       </w:hyperlink>
     </w:p>
-    <w:bookmarkEnd w:id="337"/>
-    <w:bookmarkStart w:id="455" w:name="otras-referencias-interesantes"/>
+    <w:bookmarkEnd w:id="338"/>
+    <w:bookmarkStart w:id="456" w:name="otras-referencias-interesantes"/>
     <w:p>
       <w:pPr>
         <w:pStyle w:val="Heading2"/>
@@ -6051,7 +6068,7 @@
           <w:numId w:val="1002"/>
         </w:numPr>
       </w:pPr>
-      <w:hyperlink r:id="rId338">
+      <w:hyperlink r:id="rId339">
         <w:r>
           <w:rPr>
             <w:rStyle w:val="Hyperlink"/>
@@ -6068,7 +6085,7 @@
           <w:numId w:val="1002"/>
         </w:numPr>
       </w:pPr>
-      <w:hyperlink r:id="rId339">
+      <w:hyperlink r:id="rId340">
         <w:r>
           <w:rPr>
             <w:rStyle w:val="Hyperlink"/>
@@ -6085,7 +6102,7 @@
           <w:numId w:val="1002"/>
         </w:numPr>
       </w:pPr>
-      <w:hyperlink r:id="rId340">
+      <w:hyperlink r:id="rId341">
         <w:r>
           <w:rPr>
             <w:rStyle w:val="Hyperlink"/>
@@ -6102,7 +6119,7 @@
           <w:numId w:val="1002"/>
         </w:numPr>
       </w:pPr>
-      <w:hyperlink r:id="rId341">
+      <w:hyperlink r:id="rId342">
         <w:r>
           <w:rPr>
             <w:rStyle w:val="Hyperlink"/>
@@ -6119,7 +6136,7 @@
           <w:numId w:val="1002"/>
         </w:numPr>
       </w:pPr>
-      <w:hyperlink r:id="rId342">
+      <w:hyperlink r:id="rId343">
         <w:r>
           <w:rPr>
             <w:rStyle w:val="Hyperlink"/>
@@ -6136,7 +6153,7 @@
           <w:numId w:val="1002"/>
         </w:numPr>
       </w:pPr>
-      <w:hyperlink r:id="rId343">
+      <w:hyperlink r:id="rId344">
         <w:r>
           <w:rPr>
             <w:rStyle w:val="Hyperlink"/>
@@ -6153,7 +6170,7 @@
           <w:numId w:val="1002"/>
         </w:numPr>
       </w:pPr>
-      <w:hyperlink r:id="rId344">
+      <w:hyperlink r:id="rId345">
         <w:r>
           <w:rPr>
             <w:rStyle w:val="Hyperlink"/>
@@ -6170,7 +6187,7 @@
           <w:numId w:val="1002"/>
         </w:numPr>
       </w:pPr>
-      <w:hyperlink r:id="rId345">
+      <w:hyperlink r:id="rId346">
         <w:r>
           <w:rPr>
             <w:rStyle w:val="Hyperlink"/>
@@ -6187,7 +6204,7 @@
           <w:numId w:val="1002"/>
         </w:numPr>
       </w:pPr>
-      <w:hyperlink r:id="rId346">
+      <w:hyperlink r:id="rId347">
         <w:r>
           <w:rPr>
             <w:rStyle w:val="Hyperlink"/>
@@ -6204,7 +6221,7 @@
           <w:numId w:val="1002"/>
         </w:numPr>
       </w:pPr>
-      <w:hyperlink r:id="rId347">
+      <w:hyperlink r:id="rId348">
         <w:r>
           <w:rPr>
             <w:rStyle w:val="Hyperlink"/>
@@ -6221,7 +6238,7 @@
           <w:numId w:val="1002"/>
         </w:numPr>
       </w:pPr>
-      <w:hyperlink r:id="rId348">
+      <w:hyperlink r:id="rId349">
         <w:r>
           <w:rPr>
             <w:rStyle w:val="Hyperlink"/>
@@ -6238,7 +6255,7 @@
           <w:numId w:val="1002"/>
         </w:numPr>
       </w:pPr>
-      <w:hyperlink r:id="rId349">
+      <w:hyperlink r:id="rId350">
         <w:r>
           <w:rPr>
             <w:rStyle w:val="Hyperlink"/>
@@ -6255,7 +6272,7 @@
           <w:numId w:val="1002"/>
         </w:numPr>
       </w:pPr>
-      <w:hyperlink r:id="rId350">
+      <w:hyperlink r:id="rId351">
         <w:r>
           <w:rPr>
             <w:rStyle w:val="Hyperlink"/>
@@ -6272,7 +6289,7 @@
       <w:r>
         <w:t xml:space="preserve"> </w:t>
       </w:r>
-      <w:hyperlink r:id="rId351">
+      <w:hyperlink r:id="rId352">
         <w:r>
           <w:rPr>
             <w:rStyle w:val="Hyperlink"/>
@@ -6289,7 +6306,7 @@
           <w:numId w:val="1002"/>
         </w:numPr>
       </w:pPr>
-      <w:hyperlink r:id="rId352">
+      <w:hyperlink r:id="rId353">
         <w:r>
           <w:rPr>
             <w:rStyle w:val="Hyperlink"/>
@@ -6309,7 +6326,7 @@
           <w:numId w:val="1002"/>
         </w:numPr>
       </w:pPr>
-      <w:hyperlink r:id="rId353">
+      <w:hyperlink r:id="rId354">
         <w:r>
           <w:rPr>
             <w:rStyle w:val="Hyperlink"/>
@@ -6326,7 +6343,7 @@
           <w:numId w:val="1002"/>
         </w:numPr>
       </w:pPr>
-      <w:hyperlink r:id="rId354">
+      <w:hyperlink r:id="rId355">
         <w:r>
           <w:rPr>
             <w:rStyle w:val="Hyperlink"/>
@@ -6343,7 +6360,7 @@
           <w:numId w:val="1002"/>
         </w:numPr>
       </w:pPr>
-      <w:hyperlink r:id="rId355">
+      <w:hyperlink r:id="rId356">
         <w:r>
           <w:rPr>
             <w:rStyle w:val="Hyperlink"/>
@@ -6360,7 +6377,7 @@
           <w:numId w:val="1002"/>
         </w:numPr>
       </w:pPr>
-      <w:hyperlink r:id="rId356">
+      <w:hyperlink r:id="rId357">
         <w:r>
           <w:rPr>
             <w:rStyle w:val="Hyperlink"/>
@@ -6377,7 +6394,7 @@
           <w:numId w:val="1002"/>
         </w:numPr>
       </w:pPr>
-      <w:hyperlink r:id="rId357">
+      <w:hyperlink r:id="rId358">
         <w:r>
           <w:rPr>
             <w:rStyle w:val="Hyperlink"/>
@@ -6394,7 +6411,7 @@
           <w:numId w:val="1002"/>
         </w:numPr>
       </w:pPr>
-      <w:hyperlink r:id="rId358">
+      <w:hyperlink r:id="rId359">
         <w:r>
           <w:rPr>
             <w:rStyle w:val="Hyperlink"/>
@@ -6411,7 +6428,7 @@
           <w:numId w:val="1002"/>
         </w:numPr>
       </w:pPr>
-      <w:hyperlink r:id="rId359">
+      <w:hyperlink r:id="rId360">
         <w:r>
           <w:rPr>
             <w:rStyle w:val="Hyperlink"/>
@@ -6428,7 +6445,7 @@
           <w:numId w:val="1002"/>
         </w:numPr>
       </w:pPr>
-      <w:hyperlink r:id="rId360">
+      <w:hyperlink r:id="rId361">
         <w:r>
           <w:rPr>
             <w:rStyle w:val="Hyperlink"/>
@@ -6445,7 +6462,7 @@
           <w:numId w:val="1002"/>
         </w:numPr>
       </w:pPr>
-      <w:hyperlink r:id="rId361">
+      <w:hyperlink r:id="rId362">
         <w:r>
           <w:rPr>
             <w:rStyle w:val="Hyperlink"/>
@@ -6462,7 +6479,7 @@
           <w:numId w:val="1002"/>
         </w:numPr>
       </w:pPr>
-      <w:hyperlink r:id="rId362">
+      <w:hyperlink r:id="rId363">
         <w:r>
           <w:rPr>
             <w:rStyle w:val="Hyperlink"/>
@@ -6479,7 +6496,7 @@
           <w:numId w:val="1002"/>
         </w:numPr>
       </w:pPr>
-      <w:hyperlink r:id="rId363">
+      <w:hyperlink r:id="rId364">
         <w:r>
           <w:rPr>
             <w:rStyle w:val="Hyperlink"/>
@@ -6496,7 +6513,7 @@
           <w:numId w:val="1002"/>
         </w:numPr>
       </w:pPr>
-      <w:hyperlink r:id="rId364">
+      <w:hyperlink r:id="rId365">
         <w:r>
           <w:rPr>
             <w:rStyle w:val="Hyperlink"/>
@@ -6513,7 +6530,7 @@
           <w:numId w:val="1002"/>
         </w:numPr>
       </w:pPr>
-      <w:hyperlink r:id="rId365">
+      <w:hyperlink r:id="rId366">
         <w:r>
           <w:rPr>
             <w:rStyle w:val="Hyperlink"/>
@@ -6530,7 +6547,7 @@
           <w:numId w:val="1002"/>
         </w:numPr>
       </w:pPr>
-      <w:hyperlink r:id="rId366">
+      <w:hyperlink r:id="rId367">
         <w:r>
           <w:rPr>
             <w:rStyle w:val="Hyperlink"/>
@@ -6547,7 +6564,7 @@
           <w:numId w:val="1002"/>
         </w:numPr>
       </w:pPr>
-      <w:hyperlink r:id="rId367">
+      <w:hyperlink r:id="rId368">
         <w:r>
           <w:rPr>
             <w:rStyle w:val="Hyperlink"/>
@@ -6564,7 +6581,7 @@
           <w:numId w:val="1002"/>
         </w:numPr>
       </w:pPr>
-      <w:hyperlink r:id="rId368">
+      <w:hyperlink r:id="rId369">
         <w:r>
           <w:rPr>
             <w:rStyle w:val="Hyperlink"/>
@@ -6581,7 +6598,7 @@
           <w:numId w:val="1002"/>
         </w:numPr>
       </w:pPr>
-      <w:hyperlink r:id="rId369">
+      <w:hyperlink r:id="rId370">
         <w:r>
           <w:rPr>
             <w:rStyle w:val="Hyperlink"/>
@@ -6598,7 +6615,7 @@
           <w:numId w:val="1002"/>
         </w:numPr>
       </w:pPr>
-      <w:hyperlink r:id="rId370">
+      <w:hyperlink r:id="rId371">
         <w:r>
           <w:rPr>
             <w:rStyle w:val="Hyperlink"/>
@@ -6615,7 +6632,7 @@
           <w:numId w:val="1002"/>
         </w:numPr>
       </w:pPr>
-      <w:hyperlink r:id="rId371">
+      <w:hyperlink r:id="rId372">
         <w:r>
           <w:rPr>
             <w:rStyle w:val="Hyperlink"/>
@@ -6632,7 +6649,7 @@
           <w:numId w:val="1002"/>
         </w:numPr>
       </w:pPr>
-      <w:hyperlink r:id="rId372">
+      <w:hyperlink r:id="rId373">
         <w:r>
           <w:rPr>
             <w:rStyle w:val="Hyperlink"/>
@@ -6649,7 +6666,7 @@
           <w:numId w:val="1002"/>
         </w:numPr>
       </w:pPr>
-      <w:hyperlink r:id="rId373">
+      <w:hyperlink r:id="rId374">
         <w:r>
           <w:rPr>
             <w:rStyle w:val="Hyperlink"/>
@@ -6666,7 +6683,7 @@
           <w:numId w:val="1002"/>
         </w:numPr>
       </w:pPr>
-      <w:hyperlink r:id="rId374">
+      <w:hyperlink r:id="rId375">
         <w:r>
           <w:rPr>
             <w:rStyle w:val="Hyperlink"/>
@@ -6683,7 +6700,7 @@
           <w:numId w:val="1002"/>
         </w:numPr>
       </w:pPr>
-      <w:hyperlink r:id="rId375">
+      <w:hyperlink r:id="rId376">
         <w:r>
           <w:rPr>
             <w:rStyle w:val="Hyperlink"/>
@@ -6700,7 +6717,7 @@
           <w:numId w:val="1002"/>
         </w:numPr>
       </w:pPr>
-      <w:hyperlink r:id="rId376">
+      <w:hyperlink r:id="rId377">
         <w:r>
           <w:rPr>
             <w:rStyle w:val="Hyperlink"/>
@@ -6717,7 +6734,7 @@
           <w:numId w:val="1002"/>
         </w:numPr>
       </w:pPr>
-      <w:hyperlink r:id="rId377">
+      <w:hyperlink r:id="rId378">
         <w:r>
           <w:rPr>
             <w:rStyle w:val="Hyperlink"/>
@@ -6734,7 +6751,7 @@
           <w:numId w:val="1002"/>
         </w:numPr>
       </w:pPr>
-      <w:hyperlink r:id="rId378">
+      <w:hyperlink r:id="rId379">
         <w:r>
           <w:rPr>
             <w:rStyle w:val="Hyperlink"/>
@@ -6751,7 +6768,7 @@
           <w:numId w:val="1002"/>
         </w:numPr>
       </w:pPr>
-      <w:hyperlink r:id="rId379">
+      <w:hyperlink r:id="rId380">
         <w:r>
           <w:rPr>
             <w:rStyle w:val="Hyperlink"/>
@@ -6768,7 +6785,7 @@
           <w:numId w:val="1002"/>
         </w:numPr>
       </w:pPr>
-      <w:hyperlink r:id="rId380">
+      <w:hyperlink r:id="rId381">
         <w:r>
           <w:rPr>
             <w:rStyle w:val="Hyperlink"/>
@@ -6785,7 +6802,7 @@
           <w:numId w:val="1002"/>
         </w:numPr>
       </w:pPr>
-      <w:hyperlink r:id="rId381">
+      <w:hyperlink r:id="rId382">
         <w:r>
           <w:rPr>
             <w:rStyle w:val="Hyperlink"/>
@@ -6802,7 +6819,7 @@
           <w:numId w:val="1002"/>
         </w:numPr>
       </w:pPr>
-      <w:hyperlink r:id="rId382">
+      <w:hyperlink r:id="rId383">
         <w:r>
           <w:rPr>
             <w:rStyle w:val="Hyperlink"/>
@@ -6819,7 +6836,7 @@
           <w:numId w:val="1002"/>
         </w:numPr>
       </w:pPr>
-      <w:hyperlink r:id="rId383">
+      <w:hyperlink r:id="rId384">
         <w:r>
           <w:rPr>
             <w:rStyle w:val="Hyperlink"/>
@@ -6836,7 +6853,7 @@
           <w:numId w:val="1002"/>
         </w:numPr>
       </w:pPr>
-      <w:hyperlink r:id="rId384">
+      <w:hyperlink r:id="rId385">
         <w:r>
           <w:rPr>
             <w:rStyle w:val="Hyperlink"/>
@@ -6853,7 +6870,7 @@
           <w:numId w:val="1002"/>
         </w:numPr>
       </w:pPr>
-      <w:hyperlink r:id="rId385">
+      <w:hyperlink r:id="rId386">
         <w:r>
           <w:rPr>
             <w:rStyle w:val="Hyperlink"/>
@@ -6870,7 +6887,7 @@
           <w:numId w:val="1002"/>
         </w:numPr>
       </w:pPr>
-      <w:hyperlink r:id="rId386">
+      <w:hyperlink r:id="rId387">
         <w:r>
           <w:rPr>
             <w:rStyle w:val="Hyperlink"/>
@@ -6890,7 +6907,7 @@
           <w:numId w:val="1002"/>
         </w:numPr>
       </w:pPr>
-      <w:hyperlink r:id="rId387">
+      <w:hyperlink r:id="rId388">
         <w:r>
           <w:rPr>
             <w:rStyle w:val="Hyperlink"/>
@@ -6907,7 +6924,7 @@
           <w:numId w:val="1002"/>
         </w:numPr>
       </w:pPr>
-      <w:hyperlink r:id="rId388">
+      <w:hyperlink r:id="rId389">
         <w:r>
           <w:rPr>
             <w:rStyle w:val="Hyperlink"/>
@@ -6924,7 +6941,7 @@
           <w:numId w:val="1002"/>
         </w:numPr>
       </w:pPr>
-      <w:hyperlink r:id="rId389">
+      <w:hyperlink r:id="rId390">
         <w:r>
           <w:rPr>
             <w:rStyle w:val="Hyperlink"/>
@@ -6941,7 +6958,7 @@
           <w:numId w:val="1002"/>
         </w:numPr>
       </w:pPr>
-      <w:hyperlink r:id="rId390">
+      <w:hyperlink r:id="rId391">
         <w:r>
           <w:rPr>
             <w:rStyle w:val="Hyperlink"/>
@@ -6958,7 +6975,7 @@
           <w:numId w:val="1002"/>
         </w:numPr>
       </w:pPr>
-      <w:hyperlink r:id="rId391">
+      <w:hyperlink r:id="rId392">
         <w:r>
           <w:rPr>
             <w:rStyle w:val="Hyperlink"/>
@@ -6975,7 +6992,7 @@
           <w:numId w:val="1002"/>
         </w:numPr>
       </w:pPr>
-      <w:hyperlink r:id="rId392">
+      <w:hyperlink r:id="rId393">
         <w:r>
           <w:rPr>
             <w:rStyle w:val="Hyperlink"/>
@@ -6992,7 +7009,7 @@
           <w:numId w:val="1002"/>
         </w:numPr>
       </w:pPr>
-      <w:hyperlink r:id="rId393">
+      <w:hyperlink r:id="rId394">
         <w:r>
           <w:rPr>
             <w:rStyle w:val="Hyperlink"/>
@@ -7009,7 +7026,7 @@
           <w:numId w:val="1002"/>
         </w:numPr>
       </w:pPr>
-      <w:hyperlink r:id="rId394">
+      <w:hyperlink r:id="rId395">
         <w:r>
           <w:rPr>
             <w:rStyle w:val="Hyperlink"/>
@@ -7026,7 +7043,7 @@
           <w:numId w:val="1002"/>
         </w:numPr>
       </w:pPr>
-      <w:hyperlink r:id="rId395">
+      <w:hyperlink r:id="rId396">
         <w:r>
           <w:rPr>
             <w:rStyle w:val="Hyperlink"/>
@@ -7043,7 +7060,7 @@
           <w:numId w:val="1002"/>
         </w:numPr>
       </w:pPr>
-      <w:hyperlink r:id="rId396">
+      <w:hyperlink r:id="rId397">
         <w:r>
           <w:rPr>
             <w:rStyle w:val="Hyperlink"/>
@@ -7060,7 +7077,7 @@
           <w:numId w:val="1002"/>
         </w:numPr>
       </w:pPr>
-      <w:hyperlink r:id="rId397">
+      <w:hyperlink r:id="rId398">
         <w:r>
           <w:rPr>
             <w:rStyle w:val="Hyperlink"/>
@@ -7077,7 +7094,7 @@
           <w:numId w:val="1002"/>
         </w:numPr>
       </w:pPr>
-      <w:hyperlink r:id="rId398">
+      <w:hyperlink r:id="rId399">
         <w:r>
           <w:rPr>
             <w:rStyle w:val="Hyperlink"/>
@@ -7094,7 +7111,7 @@
           <w:numId w:val="1002"/>
         </w:numPr>
       </w:pPr>
-      <w:hyperlink r:id="rId399">
+      <w:hyperlink r:id="rId400">
         <w:r>
           <w:rPr>
             <w:rStyle w:val="Hyperlink"/>
@@ -7111,7 +7128,7 @@
           <w:numId w:val="1002"/>
         </w:numPr>
       </w:pPr>
-      <w:hyperlink r:id="rId400">
+      <w:hyperlink r:id="rId401">
         <w:r>
           <w:rPr>
             <w:rStyle w:val="Hyperlink"/>
@@ -7128,7 +7145,7 @@
           <w:numId w:val="1002"/>
         </w:numPr>
       </w:pPr>
-      <w:hyperlink r:id="rId401">
+      <w:hyperlink r:id="rId402">
         <w:r>
           <w:rPr>
             <w:rStyle w:val="Hyperlink"/>
@@ -7145,7 +7162,7 @@
           <w:numId w:val="1002"/>
         </w:numPr>
       </w:pPr>
-      <w:hyperlink r:id="rId402">
+      <w:hyperlink r:id="rId403">
         <w:r>
           <w:rPr>
             <w:rStyle w:val="Hyperlink"/>
@@ -7162,7 +7179,7 @@
           <w:numId w:val="1002"/>
         </w:numPr>
       </w:pPr>
-      <w:hyperlink r:id="rId403">
+      <w:hyperlink r:id="rId404">
         <w:r>
           <w:rPr>
             <w:rStyle w:val="Hyperlink"/>
@@ -7179,7 +7196,7 @@
           <w:numId w:val="1002"/>
         </w:numPr>
       </w:pPr>
-      <w:hyperlink r:id="rId404">
+      <w:hyperlink r:id="rId405">
         <w:r>
           <w:rPr>
             <w:rStyle w:val="Hyperlink"/>
@@ -7196,7 +7213,7 @@
           <w:numId w:val="1002"/>
         </w:numPr>
       </w:pPr>
-      <w:hyperlink r:id="rId405">
+      <w:hyperlink r:id="rId406">
         <w:r>
           <w:rPr>
             <w:rStyle w:val="Hyperlink"/>
@@ -7213,7 +7230,7 @@
           <w:numId w:val="1002"/>
         </w:numPr>
       </w:pPr>
-      <w:hyperlink r:id="rId406">
+      <w:hyperlink r:id="rId407">
         <w:r>
           <w:rPr>
             <w:rStyle w:val="Hyperlink"/>
@@ -7230,7 +7247,7 @@
           <w:numId w:val="1002"/>
         </w:numPr>
       </w:pPr>
-      <w:hyperlink r:id="rId407">
+      <w:hyperlink r:id="rId408">
         <w:r>
           <w:rPr>
             <w:rStyle w:val="Hyperlink"/>
@@ -7247,7 +7264,7 @@
           <w:numId w:val="1002"/>
         </w:numPr>
       </w:pPr>
-      <w:hyperlink r:id="rId408">
+      <w:hyperlink r:id="rId409">
         <w:r>
           <w:rPr>
             <w:rStyle w:val="Hyperlink"/>
@@ -7264,7 +7281,7 @@
           <w:numId w:val="1002"/>
         </w:numPr>
       </w:pPr>
-      <w:hyperlink r:id="rId409">
+      <w:hyperlink r:id="rId410">
         <w:r>
           <w:rPr>
             <w:rStyle w:val="Hyperlink"/>
@@ -7281,7 +7298,7 @@
           <w:numId w:val="1002"/>
         </w:numPr>
       </w:pPr>
-      <w:hyperlink r:id="rId410">
+      <w:hyperlink r:id="rId411">
         <w:r>
           <w:rPr>
             <w:rStyle w:val="Hyperlink"/>
@@ -7298,7 +7315,7 @@
           <w:numId w:val="1002"/>
         </w:numPr>
       </w:pPr>
-      <w:hyperlink r:id="rId411">
+      <w:hyperlink r:id="rId412">
         <w:r>
           <w:rPr>
             <w:rStyle w:val="Hyperlink"/>
@@ -7315,7 +7332,7 @@
           <w:numId w:val="1002"/>
         </w:numPr>
       </w:pPr>
-      <w:hyperlink r:id="rId412">
+      <w:hyperlink r:id="rId413">
         <w:r>
           <w:rPr>
             <w:rStyle w:val="Hyperlink"/>
@@ -7332,7 +7349,7 @@
           <w:numId w:val="1002"/>
         </w:numPr>
       </w:pPr>
-      <w:hyperlink r:id="rId413">
+      <w:hyperlink r:id="rId414">
         <w:r>
           <w:rPr>
             <w:rStyle w:val="Hyperlink"/>
@@ -7349,7 +7366,7 @@
           <w:numId w:val="1002"/>
         </w:numPr>
       </w:pPr>
-      <w:hyperlink r:id="rId414">
+      <w:hyperlink r:id="rId415">
         <w:r>
           <w:rPr>
             <w:rStyle w:val="Hyperlink"/>
@@ -7366,7 +7383,7 @@
           <w:numId w:val="1002"/>
         </w:numPr>
       </w:pPr>
-      <w:hyperlink r:id="rId415">
+      <w:hyperlink r:id="rId416">
         <w:r>
           <w:rPr>
             <w:rStyle w:val="Hyperlink"/>
@@ -7383,7 +7400,7 @@
           <w:numId w:val="1002"/>
         </w:numPr>
       </w:pPr>
-      <w:hyperlink r:id="rId416">
+      <w:hyperlink r:id="rId417">
         <w:r>
           <w:rPr>
             <w:rStyle w:val="Hyperlink"/>
@@ -7400,7 +7417,7 @@
           <w:numId w:val="1002"/>
         </w:numPr>
       </w:pPr>
-      <w:hyperlink r:id="rId417">
+      <w:hyperlink r:id="rId418">
         <w:r>
           <w:rPr>
             <w:rStyle w:val="Hyperlink"/>
@@ -7417,7 +7434,7 @@
           <w:numId w:val="1002"/>
         </w:numPr>
       </w:pPr>
-      <w:hyperlink r:id="rId418">
+      <w:hyperlink r:id="rId419">
         <w:r>
           <w:rPr>
             <w:rStyle w:val="Hyperlink"/>
@@ -7434,7 +7451,7 @@
           <w:numId w:val="1002"/>
         </w:numPr>
       </w:pPr>
-      <w:hyperlink r:id="rId419">
+      <w:hyperlink r:id="rId420">
         <w:r>
           <w:rPr>
             <w:rStyle w:val="Hyperlink"/>
@@ -7451,7 +7468,7 @@
           <w:numId w:val="1002"/>
         </w:numPr>
       </w:pPr>
-      <w:hyperlink r:id="rId420">
+      <w:hyperlink r:id="rId421">
         <w:r>
           <w:rPr>
             <w:rStyle w:val="Hyperlink"/>
@@ -7468,7 +7485,7 @@
           <w:numId w:val="1002"/>
         </w:numPr>
       </w:pPr>
-      <w:hyperlink r:id="rId421">
+      <w:hyperlink r:id="rId422">
         <w:r>
           <w:rPr>
             <w:rStyle w:val="Hyperlink"/>
@@ -7485,7 +7502,7 @@
           <w:numId w:val="1002"/>
         </w:numPr>
       </w:pPr>
-      <w:hyperlink r:id="rId422">
+      <w:hyperlink r:id="rId423">
         <w:r>
           <w:rPr>
             <w:rStyle w:val="Hyperlink"/>
@@ -7502,7 +7519,7 @@
           <w:numId w:val="1002"/>
         </w:numPr>
       </w:pPr>
-      <w:hyperlink r:id="rId423">
+      <w:hyperlink r:id="rId424">
         <w:r>
           <w:rPr>
             <w:rStyle w:val="Hyperlink"/>
@@ -7519,7 +7536,7 @@
           <w:numId w:val="1002"/>
         </w:numPr>
       </w:pPr>
-      <w:hyperlink r:id="rId424">
+      <w:hyperlink r:id="rId425">
         <w:r>
           <w:rPr>
             <w:rStyle w:val="Hyperlink"/>
@@ -7536,7 +7553,7 @@
           <w:numId w:val="1002"/>
         </w:numPr>
       </w:pPr>
-      <w:hyperlink r:id="rId425">
+      <w:hyperlink r:id="rId426">
         <w:r>
           <w:rPr>
             <w:rStyle w:val="Hyperlink"/>
@@ -7553,7 +7570,7 @@
           <w:numId w:val="1002"/>
         </w:numPr>
       </w:pPr>
-      <w:hyperlink r:id="rId426">
+      <w:hyperlink r:id="rId427">
         <w:r>
           <w:rPr>
             <w:rStyle w:val="Hyperlink"/>
@@ -7570,7 +7587,7 @@
           <w:numId w:val="1002"/>
         </w:numPr>
       </w:pPr>
-      <w:hyperlink r:id="rId427">
+      <w:hyperlink r:id="rId428">
         <w:r>
           <w:rPr>
             <w:rStyle w:val="Hyperlink"/>
@@ -7587,7 +7604,7 @@
           <w:numId w:val="1002"/>
         </w:numPr>
       </w:pPr>
-      <w:hyperlink r:id="rId428">
+      <w:hyperlink r:id="rId429">
         <w:r>
           <w:rPr>
             <w:rStyle w:val="Hyperlink"/>
@@ -7604,7 +7621,7 @@
           <w:numId w:val="1002"/>
         </w:numPr>
       </w:pPr>
-      <w:hyperlink r:id="rId429">
+      <w:hyperlink r:id="rId430">
         <w:r>
           <w:rPr>
             <w:rStyle w:val="Hyperlink"/>
@@ -7621,7 +7638,7 @@
           <w:numId w:val="1002"/>
         </w:numPr>
       </w:pPr>
-      <w:hyperlink r:id="rId430">
+      <w:hyperlink r:id="rId431">
         <w:r>
           <w:rPr>
             <w:rStyle w:val="Hyperlink"/>
@@ -7638,7 +7655,7 @@
           <w:numId w:val="1002"/>
         </w:numPr>
       </w:pPr>
-      <w:hyperlink r:id="rId431">
+      <w:hyperlink r:id="rId432">
         <w:r>
           <w:rPr>
             <w:rStyle w:val="Hyperlink"/>
@@ -7655,7 +7672,7 @@
           <w:numId w:val="1002"/>
         </w:numPr>
       </w:pPr>
-      <w:hyperlink r:id="rId432">
+      <w:hyperlink r:id="rId433">
         <w:r>
           <w:rPr>
             <w:rStyle w:val="Hyperlink"/>
@@ -7672,7 +7689,7 @@
           <w:numId w:val="1002"/>
         </w:numPr>
       </w:pPr>
-      <w:hyperlink r:id="rId433">
+      <w:hyperlink r:id="rId434">
         <w:r>
           <w:rPr>
             <w:rStyle w:val="Hyperlink"/>
@@ -7689,7 +7706,7 @@
           <w:numId w:val="1002"/>
         </w:numPr>
       </w:pPr>
-      <w:hyperlink r:id="rId434">
+      <w:hyperlink r:id="rId435">
         <w:r>
           <w:rPr>
             <w:rStyle w:val="Hyperlink"/>
@@ -7706,7 +7723,7 @@
           <w:numId w:val="1002"/>
         </w:numPr>
       </w:pPr>
-      <w:hyperlink r:id="rId435">
+      <w:hyperlink r:id="rId436">
         <w:r>
           <w:rPr>
             <w:rStyle w:val="Hyperlink"/>
@@ -7729,7 +7746,7 @@
       <w:r>
         <w:t xml:space="preserve"> </w:t>
       </w:r>
-      <w:hyperlink r:id="rId436">
+      <w:hyperlink r:id="rId437">
         <w:r>
           <w:rPr>
             <w:rStyle w:val="Hyperlink"/>
@@ -7746,7 +7763,7 @@
       <w:r>
         <w:t xml:space="preserve"> </w:t>
       </w:r>
-      <w:hyperlink r:id="rId437">
+      <w:hyperlink r:id="rId438">
         <w:r>
           <w:rPr>
             <w:rStyle w:val="Hyperlink"/>
@@ -7763,7 +7780,7 @@
           <w:numId w:val="1002"/>
         </w:numPr>
       </w:pPr>
-      <w:hyperlink r:id="rId438">
+      <w:hyperlink r:id="rId439">
         <w:r>
           <w:rPr>
             <w:rStyle w:val="Hyperlink"/>
@@ -7780,7 +7797,7 @@
           <w:numId w:val="1002"/>
         </w:numPr>
       </w:pPr>
-      <w:hyperlink r:id="rId439">
+      <w:hyperlink r:id="rId440">
         <w:r>
           <w:rPr>
             <w:rStyle w:val="Hyperlink"/>
@@ -7803,7 +7820,7 @@
       <w:r>
         <w:t xml:space="preserve"> </w:t>
       </w:r>
-      <w:hyperlink r:id="rId440">
+      <w:hyperlink r:id="rId441">
         <w:r>
           <w:rPr>
             <w:rStyle w:val="Hyperlink"/>
@@ -7817,7 +7834,7 @@
       <w:r>
         <w:t xml:space="preserve"> </w:t>
       </w:r>
-      <w:hyperlink r:id="rId441">
+      <w:hyperlink r:id="rId442">
         <w:r>
           <w:rPr>
             <w:rStyle w:val="Hyperlink"/>
@@ -7831,7 +7848,7 @@
       <w:r>
         <w:t xml:space="preserve"> </w:t>
       </w:r>
-      <w:hyperlink r:id="rId442">
+      <w:hyperlink r:id="rId443">
         <w:r>
           <w:rPr>
             <w:rStyle w:val="Hyperlink"/>
@@ -7845,7 +7862,7 @@
       <w:r>
         <w:t xml:space="preserve"> </w:t>
       </w:r>
-      <w:hyperlink r:id="rId443">
+      <w:hyperlink r:id="rId444">
         <w:r>
           <w:rPr>
             <w:rStyle w:val="Hyperlink"/>
@@ -7862,7 +7879,7 @@
       <w:r>
         <w:t xml:space="preserve"> </w:t>
       </w:r>
-      <w:hyperlink r:id="rId444">
+      <w:hyperlink r:id="rId445">
         <w:r>
           <w:rPr>
             <w:rStyle w:val="Hyperlink"/>
@@ -7885,7 +7902,7 @@
       <w:r>
         <w:t xml:space="preserve"> </w:t>
       </w:r>
-      <w:hyperlink r:id="rId445">
+      <w:hyperlink r:id="rId446">
         <w:r>
           <w:rPr>
             <w:rStyle w:val="Hyperlink"/>
@@ -7908,7 +7925,7 @@
       <w:r>
         <w:t xml:space="preserve"> </w:t>
       </w:r>
-      <w:hyperlink r:id="rId446">
+      <w:hyperlink r:id="rId447">
         <w:r>
           <w:rPr>
             <w:rStyle w:val="Hyperlink"/>
@@ -7922,7 +7939,7 @@
       <w:r>
         <w:t xml:space="preserve"> </w:t>
       </w:r>
-      <w:hyperlink r:id="rId447">
+      <w:hyperlink r:id="rId448">
         <w:r>
           <w:rPr>
             <w:rStyle w:val="Hyperlink"/>
@@ -7939,7 +7956,7 @@
       <w:r>
         <w:t xml:space="preserve"> </w:t>
       </w:r>
-      <w:hyperlink r:id="rId448">
+      <w:hyperlink r:id="rId449">
         <w:r>
           <w:rPr>
             <w:rStyle w:val="Hyperlink"/>
@@ -7962,7 +7979,7 @@
       <w:r>
         <w:t xml:space="preserve"> </w:t>
       </w:r>
-      <w:hyperlink r:id="rId449">
+      <w:hyperlink r:id="rId450">
         <w:r>
           <w:rPr>
             <w:rStyle w:val="Hyperlink"/>
@@ -7979,7 +7996,7 @@
       <w:r>
         <w:t xml:space="preserve"> </w:t>
       </w:r>
-      <w:hyperlink r:id="rId450">
+      <w:hyperlink r:id="rId451">
         <w:r>
           <w:rPr>
             <w:rStyle w:val="Hyperlink"/>
@@ -8002,7 +8019,7 @@
       <w:r>
         <w:t xml:space="preserve"> </w:t>
       </w:r>
-      <w:hyperlink r:id="rId451">
+      <w:hyperlink r:id="rId452">
         <w:r>
           <w:rPr>
             <w:rStyle w:val="Hyperlink"/>
@@ -8016,7 +8033,7 @@
       <w:r>
         <w:t xml:space="preserve"> </w:t>
       </w:r>
-      <w:hyperlink r:id="rId452">
+      <w:hyperlink r:id="rId453">
         <w:r>
           <w:rPr>
             <w:rStyle w:val="Hyperlink"/>
@@ -8030,7 +8047,7 @@
       <w:r>
         <w:t xml:space="preserve"> </w:t>
       </w:r>
-      <w:hyperlink r:id="rId453">
+      <w:hyperlink r:id="rId454">
         <w:r>
           <w:rPr>
             <w:rStyle w:val="Hyperlink"/>
@@ -8047,7 +8064,7 @@
       <w:r>
         <w:t xml:space="preserve"> </w:t>
       </w:r>
-      <w:hyperlink r:id="rId454">
+      <w:hyperlink r:id="rId455">
         <w:r>
           <w:rPr>
             <w:rStyle w:val="Hyperlink"/>
@@ -8056,8 +8073,8 @@
         </w:r>
       </w:hyperlink>
     </w:p>
-    <w:bookmarkEnd w:id="455"/>
-    <w:bookmarkStart w:id="591" w:name="libros"/>
+    <w:bookmarkEnd w:id="456"/>
+    <w:bookmarkStart w:id="592" w:name="libros"/>
     <w:p>
       <w:pPr>
         <w:pStyle w:val="Heading2"/>
@@ -8074,7 +8091,7 @@
           <w:numId w:val="1003"/>
         </w:numPr>
       </w:pPr>
-      <w:hyperlink r:id="rId456">
+      <w:hyperlink r:id="rId457">
         <w:r>
           <w:rPr>
             <w:rStyle w:val="Hyperlink"/>
@@ -8091,7 +8108,7 @@
           <w:numId w:val="1003"/>
         </w:numPr>
       </w:pPr>
-      <w:hyperlink r:id="rId457">
+      <w:hyperlink r:id="rId458">
         <w:r>
           <w:rPr>
             <w:rStyle w:val="Hyperlink"/>
@@ -8108,7 +8125,7 @@
           <w:numId w:val="1003"/>
         </w:numPr>
       </w:pPr>
-      <w:hyperlink r:id="rId458">
+      <w:hyperlink r:id="rId459">
         <w:r>
           <w:rPr>
             <w:rStyle w:val="Hyperlink"/>
@@ -8125,7 +8142,7 @@
           <w:numId w:val="1003"/>
         </w:numPr>
       </w:pPr>
-      <w:hyperlink r:id="rId459">
+      <w:hyperlink r:id="rId460">
         <w:r>
           <w:rPr>
             <w:rStyle w:val="Hyperlink"/>
@@ -8142,7 +8159,7 @@
           <w:numId w:val="1003"/>
         </w:numPr>
       </w:pPr>
-      <w:hyperlink r:id="rId460">
+      <w:hyperlink r:id="rId461">
         <w:r>
           <w:rPr>
             <w:rStyle w:val="Hyperlink"/>
@@ -8159,7 +8176,7 @@
           <w:numId w:val="1003"/>
         </w:numPr>
       </w:pPr>
-      <w:hyperlink r:id="rId461">
+      <w:hyperlink r:id="rId462">
         <w:r>
           <w:rPr>
             <w:rStyle w:val="Hyperlink"/>
@@ -8176,7 +8193,7 @@
           <w:numId w:val="1003"/>
         </w:numPr>
       </w:pPr>
-      <w:hyperlink r:id="rId462">
+      <w:hyperlink r:id="rId463">
         <w:r>
           <w:rPr>
             <w:rStyle w:val="Hyperlink"/>
@@ -8193,7 +8210,7 @@
           <w:numId w:val="1003"/>
         </w:numPr>
       </w:pPr>
-      <w:hyperlink r:id="rId463">
+      <w:hyperlink r:id="rId464">
         <w:r>
           <w:rPr>
             <w:rStyle w:val="Hyperlink"/>
@@ -8210,7 +8227,7 @@
           <w:numId w:val="1003"/>
         </w:numPr>
       </w:pPr>
-      <w:hyperlink r:id="rId464">
+      <w:hyperlink r:id="rId465">
         <w:r>
           <w:rPr>
             <w:rStyle w:val="Hyperlink"/>
@@ -8227,7 +8244,7 @@
           <w:numId w:val="1003"/>
         </w:numPr>
       </w:pPr>
-      <w:hyperlink r:id="rId465">
+      <w:hyperlink r:id="rId466">
         <w:r>
           <w:rPr>
             <w:rStyle w:val="Hyperlink"/>
@@ -8244,7 +8261,7 @@
           <w:numId w:val="1003"/>
         </w:numPr>
       </w:pPr>
-      <w:hyperlink r:id="rId466">
+      <w:hyperlink r:id="rId467">
         <w:r>
           <w:rPr>
             <w:rStyle w:val="Hyperlink"/>
@@ -8261,7 +8278,7 @@
           <w:numId w:val="1003"/>
         </w:numPr>
       </w:pPr>
-      <w:hyperlink r:id="rId467">
+      <w:hyperlink r:id="rId468">
         <w:r>
           <w:rPr>
             <w:rStyle w:val="Hyperlink"/>
@@ -8278,7 +8295,7 @@
           <w:numId w:val="1003"/>
         </w:numPr>
       </w:pPr>
-      <w:hyperlink r:id="rId468">
+      <w:hyperlink r:id="rId469">
         <w:r>
           <w:rPr>
             <w:rStyle w:val="Hyperlink"/>
@@ -8295,7 +8312,7 @@
           <w:numId w:val="1003"/>
         </w:numPr>
       </w:pPr>
-      <w:hyperlink r:id="rId469">
+      <w:hyperlink r:id="rId470">
         <w:r>
           <w:rPr>
             <w:rStyle w:val="Hyperlink"/>
@@ -8312,7 +8329,7 @@
           <w:numId w:val="1003"/>
         </w:numPr>
       </w:pPr>
-      <w:hyperlink r:id="rId470">
+      <w:hyperlink r:id="rId471">
         <w:r>
           <w:rPr>
             <w:rStyle w:val="Hyperlink"/>
@@ -8329,7 +8346,7 @@
           <w:numId w:val="1003"/>
         </w:numPr>
       </w:pPr>
-      <w:hyperlink r:id="rId471">
+      <w:hyperlink r:id="rId472">
         <w:r>
           <w:rPr>
             <w:rStyle w:val="Hyperlink"/>
@@ -8346,7 +8363,7 @@
           <w:numId w:val="1003"/>
         </w:numPr>
       </w:pPr>
-      <w:hyperlink r:id="rId472">
+      <w:hyperlink r:id="rId473">
         <w:r>
           <w:rPr>
             <w:rStyle w:val="Hyperlink"/>
@@ -8363,7 +8380,7 @@
           <w:numId w:val="1003"/>
         </w:numPr>
       </w:pPr>
-      <w:hyperlink r:id="rId473">
+      <w:hyperlink r:id="rId474">
         <w:r>
           <w:rPr>
             <w:rStyle w:val="Hyperlink"/>
@@ -8380,7 +8397,7 @@
           <w:numId w:val="1003"/>
         </w:numPr>
       </w:pPr>
-      <w:hyperlink r:id="rId474">
+      <w:hyperlink r:id="rId475">
         <w:r>
           <w:rPr>
             <w:rStyle w:val="Hyperlink"/>
@@ -8397,7 +8414,7 @@
           <w:numId w:val="1003"/>
         </w:numPr>
       </w:pPr>
-      <w:hyperlink r:id="rId475">
+      <w:hyperlink r:id="rId476">
         <w:r>
           <w:rPr>
             <w:rStyle w:val="Hyperlink"/>
@@ -8414,7 +8431,7 @@
           <w:numId w:val="1003"/>
         </w:numPr>
       </w:pPr>
-      <w:hyperlink r:id="rId476">
+      <w:hyperlink r:id="rId477">
         <w:r>
           <w:rPr>
             <w:rStyle w:val="Hyperlink"/>
@@ -8431,7 +8448,7 @@
           <w:numId w:val="1003"/>
         </w:numPr>
       </w:pPr>
-      <w:hyperlink r:id="rId477">
+      <w:hyperlink r:id="rId478">
         <w:r>
           <w:rPr>
             <w:rStyle w:val="Hyperlink"/>
@@ -8448,7 +8465,7 @@
           <w:numId w:val="1003"/>
         </w:numPr>
       </w:pPr>
-      <w:hyperlink r:id="rId478">
+      <w:hyperlink r:id="rId479">
         <w:r>
           <w:rPr>
             <w:rStyle w:val="Hyperlink"/>
@@ -8465,7 +8482,7 @@
           <w:numId w:val="1003"/>
         </w:numPr>
       </w:pPr>
-      <w:hyperlink r:id="rId479">
+      <w:hyperlink r:id="rId480">
         <w:r>
           <w:rPr>
             <w:rStyle w:val="Hyperlink"/>
@@ -8482,7 +8499,7 @@
           <w:numId w:val="1003"/>
         </w:numPr>
       </w:pPr>
-      <w:hyperlink r:id="rId480">
+      <w:hyperlink r:id="rId481">
         <w:r>
           <w:rPr>
             <w:rStyle w:val="Hyperlink"/>
@@ -8499,7 +8516,7 @@
           <w:numId w:val="1003"/>
         </w:numPr>
       </w:pPr>
-      <w:hyperlink r:id="rId481">
+      <w:hyperlink r:id="rId482">
         <w:r>
           <w:rPr>
             <w:rStyle w:val="Hyperlink"/>
@@ -8516,7 +8533,7 @@
           <w:numId w:val="1003"/>
         </w:numPr>
       </w:pPr>
-      <w:hyperlink r:id="rId482">
+      <w:hyperlink r:id="rId483">
         <w:r>
           <w:rPr>
             <w:rStyle w:val="Hyperlink"/>
@@ -8533,7 +8550,7 @@
           <w:numId w:val="1003"/>
         </w:numPr>
       </w:pPr>
-      <w:hyperlink r:id="rId483">
+      <w:hyperlink r:id="rId484">
         <w:r>
           <w:rPr>
             <w:rStyle w:val="Hyperlink"/>
@@ -8550,7 +8567,7 @@
           <w:numId w:val="1003"/>
         </w:numPr>
       </w:pPr>
-      <w:hyperlink r:id="rId484">
+      <w:hyperlink r:id="rId485">
         <w:r>
           <w:rPr>
             <w:rStyle w:val="Hyperlink"/>
@@ -8567,7 +8584,7 @@
           <w:numId w:val="1003"/>
         </w:numPr>
       </w:pPr>
-      <w:hyperlink r:id="rId485">
+      <w:hyperlink r:id="rId486">
         <w:r>
           <w:rPr>
             <w:rStyle w:val="Hyperlink"/>
@@ -8584,7 +8601,7 @@
           <w:numId w:val="1003"/>
         </w:numPr>
       </w:pPr>
-      <w:hyperlink r:id="rId486">
+      <w:hyperlink r:id="rId487">
         <w:r>
           <w:rPr>
             <w:rStyle w:val="Hyperlink"/>
@@ -8601,7 +8618,7 @@
           <w:numId w:val="1003"/>
         </w:numPr>
       </w:pPr>
-      <w:hyperlink r:id="rId487">
+      <w:hyperlink r:id="rId488">
         <w:r>
           <w:rPr>
             <w:rStyle w:val="Hyperlink"/>
@@ -8618,7 +8635,7 @@
           <w:numId w:val="1003"/>
         </w:numPr>
       </w:pPr>
-      <w:hyperlink r:id="rId488">
+      <w:hyperlink r:id="rId489">
         <w:r>
           <w:rPr>
             <w:rStyle w:val="Hyperlink"/>
@@ -8635,7 +8652,7 @@
           <w:numId w:val="1003"/>
         </w:numPr>
       </w:pPr>
-      <w:hyperlink r:id="rId489">
+      <w:hyperlink r:id="rId490">
         <w:r>
           <w:rPr>
             <w:rStyle w:val="Hyperlink"/>
@@ -8652,7 +8669,7 @@
           <w:numId w:val="1003"/>
         </w:numPr>
       </w:pPr>
-      <w:hyperlink r:id="rId490">
+      <w:hyperlink r:id="rId491">
         <w:r>
           <w:rPr>
             <w:rStyle w:val="Hyperlink"/>
@@ -8669,7 +8686,7 @@
           <w:numId w:val="1003"/>
         </w:numPr>
       </w:pPr>
-      <w:hyperlink r:id="rId491">
+      <w:hyperlink r:id="rId492">
         <w:r>
           <w:rPr>
             <w:rStyle w:val="Hyperlink"/>
@@ -8686,7 +8703,7 @@
           <w:numId w:val="1003"/>
         </w:numPr>
       </w:pPr>
-      <w:hyperlink r:id="rId492">
+      <w:hyperlink r:id="rId493">
         <w:r>
           <w:rPr>
             <w:rStyle w:val="Hyperlink"/>
@@ -8703,7 +8720,7 @@
           <w:numId w:val="1003"/>
         </w:numPr>
       </w:pPr>
-      <w:hyperlink r:id="rId493">
+      <w:hyperlink r:id="rId494">
         <w:r>
           <w:rPr>
             <w:rStyle w:val="Hyperlink"/>
@@ -8720,7 +8737,7 @@
           <w:numId w:val="1003"/>
         </w:numPr>
       </w:pPr>
-      <w:hyperlink r:id="rId494">
+      <w:hyperlink r:id="rId495">
         <w:r>
           <w:rPr>
             <w:rStyle w:val="Hyperlink"/>
@@ -8737,7 +8754,7 @@
           <w:numId w:val="1003"/>
         </w:numPr>
       </w:pPr>
-      <w:hyperlink r:id="rId495">
+      <w:hyperlink r:id="rId496">
         <w:r>
           <w:rPr>
             <w:rStyle w:val="Hyperlink"/>
@@ -8754,7 +8771,7 @@
           <w:numId w:val="1003"/>
         </w:numPr>
       </w:pPr>
-      <w:hyperlink r:id="rId496">
+      <w:hyperlink r:id="rId497">
         <w:r>
           <w:rPr>
             <w:rStyle w:val="Hyperlink"/>
@@ -8771,7 +8788,7 @@
           <w:numId w:val="1003"/>
         </w:numPr>
       </w:pPr>
-      <w:hyperlink r:id="rId497">
+      <w:hyperlink r:id="rId498">
         <w:r>
           <w:rPr>
             <w:rStyle w:val="Hyperlink"/>
@@ -8788,7 +8805,7 @@
           <w:numId w:val="1003"/>
         </w:numPr>
       </w:pPr>
-      <w:hyperlink r:id="rId498">
+      <w:hyperlink r:id="rId499">
         <w:r>
           <w:rPr>
             <w:rStyle w:val="Hyperlink"/>
@@ -8805,7 +8822,7 @@
           <w:numId w:val="1003"/>
         </w:numPr>
       </w:pPr>
-      <w:hyperlink r:id="rId499">
+      <w:hyperlink r:id="rId500">
         <w:r>
           <w:rPr>
             <w:rStyle w:val="Hyperlink"/>
@@ -8822,7 +8839,7 @@
           <w:numId w:val="1003"/>
         </w:numPr>
       </w:pPr>
-      <w:hyperlink r:id="rId500">
+      <w:hyperlink r:id="rId501">
         <w:r>
           <w:rPr>
             <w:rStyle w:val="Hyperlink"/>
@@ -8839,7 +8856,7 @@
           <w:numId w:val="1003"/>
         </w:numPr>
       </w:pPr>
-      <w:hyperlink r:id="rId501">
+      <w:hyperlink r:id="rId502">
         <w:r>
           <w:rPr>
             <w:rStyle w:val="Hyperlink"/>
@@ -8856,7 +8873,7 @@
           <w:numId w:val="1003"/>
         </w:numPr>
       </w:pPr>
-      <w:hyperlink r:id="rId502">
+      <w:hyperlink r:id="rId503">
         <w:r>
           <w:rPr>
             <w:rStyle w:val="Hyperlink"/>
@@ -8873,7 +8890,7 @@
           <w:numId w:val="1003"/>
         </w:numPr>
       </w:pPr>
-      <w:hyperlink r:id="rId503">
+      <w:hyperlink r:id="rId504">
         <w:r>
           <w:rPr>
             <w:rStyle w:val="Hyperlink"/>
@@ -8890,7 +8907,7 @@
           <w:numId w:val="1003"/>
         </w:numPr>
       </w:pPr>
-      <w:hyperlink r:id="rId504">
+      <w:hyperlink r:id="rId505">
         <w:r>
           <w:rPr>
             <w:rStyle w:val="Hyperlink"/>
@@ -8907,7 +8924,7 @@
           <w:numId w:val="1003"/>
         </w:numPr>
       </w:pPr>
-      <w:hyperlink r:id="rId505">
+      <w:hyperlink r:id="rId506">
         <w:r>
           <w:rPr>
             <w:rStyle w:val="Hyperlink"/>
@@ -8924,7 +8941,7 @@
           <w:numId w:val="1003"/>
         </w:numPr>
       </w:pPr>
-      <w:hyperlink r:id="rId506">
+      <w:hyperlink r:id="rId507">
         <w:r>
           <w:rPr>
             <w:rStyle w:val="Hyperlink"/>
@@ -8941,7 +8958,7 @@
           <w:numId w:val="1003"/>
         </w:numPr>
       </w:pPr>
-      <w:hyperlink r:id="rId507">
+      <w:hyperlink r:id="rId508">
         <w:r>
           <w:rPr>
             <w:rStyle w:val="Hyperlink"/>
@@ -8958,7 +8975,7 @@
           <w:numId w:val="1003"/>
         </w:numPr>
       </w:pPr>
-      <w:hyperlink r:id="rId508">
+      <w:hyperlink r:id="rId509">
         <w:r>
           <w:rPr>
             <w:rStyle w:val="Hyperlink"/>
@@ -8975,7 +8992,7 @@
           <w:numId w:val="1003"/>
         </w:numPr>
       </w:pPr>
-      <w:hyperlink r:id="rId509">
+      <w:hyperlink r:id="rId510">
         <w:r>
           <w:rPr>
             <w:rStyle w:val="Hyperlink"/>
@@ -8992,7 +9009,7 @@
           <w:numId w:val="1003"/>
         </w:numPr>
       </w:pPr>
-      <w:hyperlink r:id="rId510">
+      <w:hyperlink r:id="rId511">
         <w:r>
           <w:rPr>
             <w:rStyle w:val="Hyperlink"/>
@@ -9009,7 +9026,7 @@
           <w:numId w:val="1003"/>
         </w:numPr>
       </w:pPr>
-      <w:hyperlink r:id="rId511">
+      <w:hyperlink r:id="rId512">
         <w:r>
           <w:rPr>
             <w:rStyle w:val="Hyperlink"/>
@@ -9026,7 +9043,7 @@
           <w:numId w:val="1003"/>
         </w:numPr>
       </w:pPr>
-      <w:hyperlink r:id="rId512">
+      <w:hyperlink r:id="rId513">
         <w:r>
           <w:rPr>
             <w:rStyle w:val="Hyperlink"/>
@@ -9043,7 +9060,7 @@
           <w:numId w:val="1003"/>
         </w:numPr>
       </w:pPr>
-      <w:hyperlink r:id="rId513">
+      <w:hyperlink r:id="rId514">
         <w:r>
           <w:rPr>
             <w:rStyle w:val="Hyperlink"/>
@@ -9060,7 +9077,7 @@
           <w:numId w:val="1003"/>
         </w:numPr>
       </w:pPr>
-      <w:hyperlink r:id="rId514">
+      <w:hyperlink r:id="rId515">
         <w:r>
           <w:rPr>
             <w:rStyle w:val="Hyperlink"/>
@@ -9077,7 +9094,7 @@
           <w:numId w:val="1003"/>
         </w:numPr>
       </w:pPr>
-      <w:hyperlink r:id="rId515">
+      <w:hyperlink r:id="rId516">
         <w:r>
           <w:rPr>
             <w:rStyle w:val="Hyperlink"/>
@@ -9094,7 +9111,7 @@
           <w:numId w:val="1003"/>
         </w:numPr>
       </w:pPr>
-      <w:hyperlink r:id="rId516">
+      <w:hyperlink r:id="rId517">
         <w:r>
           <w:rPr>
             <w:rStyle w:val="Hyperlink"/>
@@ -9111,7 +9128,7 @@
           <w:numId w:val="1003"/>
         </w:numPr>
       </w:pPr>
-      <w:hyperlink r:id="rId517">
+      <w:hyperlink r:id="rId518">
         <w:r>
           <w:rPr>
             <w:rStyle w:val="Hyperlink"/>
@@ -9128,7 +9145,7 @@
           <w:numId w:val="1003"/>
         </w:numPr>
       </w:pPr>
-      <w:hyperlink r:id="rId518">
+      <w:hyperlink r:id="rId519">
         <w:r>
           <w:rPr>
             <w:rStyle w:val="Hyperlink"/>
@@ -9145,7 +9162,7 @@
           <w:numId w:val="1003"/>
         </w:numPr>
       </w:pPr>
-      <w:hyperlink r:id="rId519">
+      <w:hyperlink r:id="rId520">
         <w:r>
           <w:rPr>
             <w:rStyle w:val="Hyperlink"/>
@@ -9162,7 +9179,7 @@
           <w:numId w:val="1003"/>
         </w:numPr>
       </w:pPr>
-      <w:hyperlink r:id="rId520">
+      <w:hyperlink r:id="rId521">
         <w:r>
           <w:rPr>
             <w:rStyle w:val="Hyperlink"/>
@@ -9179,7 +9196,7 @@
           <w:numId w:val="1003"/>
         </w:numPr>
       </w:pPr>
-      <w:hyperlink r:id="rId521">
+      <w:hyperlink r:id="rId522">
         <w:r>
           <w:rPr>
             <w:rStyle w:val="Hyperlink"/>
@@ -9196,7 +9213,7 @@
           <w:numId w:val="1003"/>
         </w:numPr>
       </w:pPr>
-      <w:hyperlink r:id="rId522">
+      <w:hyperlink r:id="rId523">
         <w:r>
           <w:rPr>
             <w:rStyle w:val="Hyperlink"/>
@@ -9213,7 +9230,7 @@
           <w:numId w:val="1003"/>
         </w:numPr>
       </w:pPr>
-      <w:hyperlink r:id="rId523">
+      <w:hyperlink r:id="rId524">
         <w:r>
           <w:rPr>
             <w:rStyle w:val="Hyperlink"/>
@@ -9230,7 +9247,7 @@
           <w:numId w:val="1003"/>
         </w:numPr>
       </w:pPr>
-      <w:hyperlink r:id="rId524">
+      <w:hyperlink r:id="rId525">
         <w:r>
           <w:rPr>
             <w:rStyle w:val="Hyperlink"/>
@@ -9247,7 +9264,7 @@
           <w:numId w:val="1003"/>
         </w:numPr>
       </w:pPr>
-      <w:hyperlink r:id="rId525">
+      <w:hyperlink r:id="rId526">
         <w:r>
           <w:rPr>
             <w:rStyle w:val="Hyperlink"/>
@@ -9264,7 +9281,7 @@
           <w:numId w:val="1003"/>
         </w:numPr>
       </w:pPr>
-      <w:hyperlink r:id="rId526">
+      <w:hyperlink r:id="rId527">
         <w:r>
           <w:rPr>
             <w:rStyle w:val="Hyperlink"/>
@@ -9281,7 +9298,7 @@
           <w:numId w:val="1003"/>
         </w:numPr>
       </w:pPr>
-      <w:hyperlink r:id="rId527">
+      <w:hyperlink r:id="rId528">
         <w:r>
           <w:rPr>
             <w:rStyle w:val="Hyperlink"/>
@@ -9298,7 +9315,7 @@
           <w:numId w:val="1003"/>
         </w:numPr>
       </w:pPr>
-      <w:hyperlink r:id="rId528">
+      <w:hyperlink r:id="rId529">
         <w:r>
           <w:rPr>
             <w:rStyle w:val="Hyperlink"/>
@@ -9315,7 +9332,7 @@
           <w:numId w:val="1003"/>
         </w:numPr>
       </w:pPr>
-      <w:hyperlink r:id="rId529">
+      <w:hyperlink r:id="rId530">
         <w:r>
           <w:rPr>
             <w:rStyle w:val="Hyperlink"/>
@@ -9332,7 +9349,7 @@
           <w:numId w:val="1003"/>
         </w:numPr>
       </w:pPr>
-      <w:hyperlink r:id="rId530">
+      <w:hyperlink r:id="rId531">
         <w:r>
           <w:rPr>
             <w:rStyle w:val="Hyperlink"/>
@@ -9349,7 +9366,7 @@
           <w:numId w:val="1003"/>
         </w:numPr>
       </w:pPr>
-      <w:hyperlink r:id="rId531">
+      <w:hyperlink r:id="rId532">
         <w:r>
           <w:rPr>
             <w:rStyle w:val="Hyperlink"/>
@@ -9366,7 +9383,7 @@
           <w:numId w:val="1003"/>
         </w:numPr>
       </w:pPr>
-      <w:hyperlink r:id="rId532">
+      <w:hyperlink r:id="rId533">
         <w:r>
           <w:rPr>
             <w:rStyle w:val="Hyperlink"/>
@@ -9383,7 +9400,7 @@
           <w:numId w:val="1003"/>
         </w:numPr>
       </w:pPr>
-      <w:hyperlink r:id="rId533">
+      <w:hyperlink r:id="rId534">
         <w:r>
           <w:rPr>
             <w:rStyle w:val="Hyperlink"/>
@@ -9400,7 +9417,7 @@
           <w:numId w:val="1003"/>
         </w:numPr>
       </w:pPr>
-      <w:hyperlink r:id="rId534">
+      <w:hyperlink r:id="rId535">
         <w:r>
           <w:rPr>
             <w:rStyle w:val="Hyperlink"/>
@@ -9417,7 +9434,7 @@
           <w:numId w:val="1003"/>
         </w:numPr>
       </w:pPr>
-      <w:hyperlink r:id="rId535">
+      <w:hyperlink r:id="rId536">
         <w:r>
           <w:rPr>
             <w:rStyle w:val="Hyperlink"/>
@@ -9434,7 +9451,7 @@
           <w:numId w:val="1003"/>
         </w:numPr>
       </w:pPr>
-      <w:hyperlink r:id="rId536">
+      <w:hyperlink r:id="rId537">
         <w:r>
           <w:rPr>
             <w:rStyle w:val="Hyperlink"/>
@@ -9451,7 +9468,7 @@
           <w:numId w:val="1003"/>
         </w:numPr>
       </w:pPr>
-      <w:hyperlink r:id="rId537">
+      <w:hyperlink r:id="rId538">
         <w:r>
           <w:rPr>
             <w:rStyle w:val="Hyperlink"/>
@@ -9468,7 +9485,7 @@
           <w:numId w:val="1003"/>
         </w:numPr>
       </w:pPr>
-      <w:hyperlink r:id="rId538">
+      <w:hyperlink r:id="rId539">
         <w:r>
           <w:rPr>
             <w:rStyle w:val="Hyperlink"/>
@@ -9485,7 +9502,7 @@
           <w:numId w:val="1003"/>
         </w:numPr>
       </w:pPr>
-      <w:hyperlink r:id="rId539">
+      <w:hyperlink r:id="rId540">
         <w:r>
           <w:rPr>
             <w:rStyle w:val="Hyperlink"/>
@@ -9502,7 +9519,7 @@
           <w:numId w:val="1003"/>
         </w:numPr>
       </w:pPr>
-      <w:hyperlink r:id="rId540">
+      <w:hyperlink r:id="rId541">
         <w:r>
           <w:rPr>
             <w:rStyle w:val="Hyperlink"/>
@@ -9519,7 +9536,7 @@
           <w:numId w:val="1003"/>
         </w:numPr>
       </w:pPr>
-      <w:hyperlink r:id="rId541">
+      <w:hyperlink r:id="rId542">
         <w:r>
           <w:rPr>
             <w:rStyle w:val="Hyperlink"/>
@@ -9536,7 +9553,7 @@
           <w:numId w:val="1003"/>
         </w:numPr>
       </w:pPr>
-      <w:hyperlink r:id="rId542">
+      <w:hyperlink r:id="rId543">
         <w:r>
           <w:rPr>
             <w:rStyle w:val="Hyperlink"/>
@@ -9553,7 +9570,7 @@
           <w:numId w:val="1003"/>
         </w:numPr>
       </w:pPr>
-      <w:hyperlink r:id="rId543">
+      <w:hyperlink r:id="rId544">
         <w:r>
           <w:rPr>
             <w:rStyle w:val="Hyperlink"/>
@@ -9570,7 +9587,7 @@
           <w:numId w:val="1003"/>
         </w:numPr>
       </w:pPr>
-      <w:hyperlink r:id="rId544">
+      <w:hyperlink r:id="rId545">
         <w:r>
           <w:rPr>
             <w:rStyle w:val="Hyperlink"/>
@@ -9587,7 +9604,7 @@
           <w:numId w:val="1003"/>
         </w:numPr>
       </w:pPr>
-      <w:hyperlink r:id="rId545">
+      <w:hyperlink r:id="rId546">
         <w:r>
           <w:rPr>
             <w:rStyle w:val="Hyperlink"/>
@@ -9604,7 +9621,7 @@
           <w:numId w:val="1003"/>
         </w:numPr>
       </w:pPr>
-      <w:hyperlink r:id="rId546">
+      <w:hyperlink r:id="rId547">
         <w:r>
           <w:rPr>
             <w:rStyle w:val="Hyperlink"/>
@@ -9621,7 +9638,7 @@
           <w:numId w:val="1003"/>
         </w:numPr>
       </w:pPr>
-      <w:hyperlink r:id="rId547">
+      <w:hyperlink r:id="rId548">
         <w:r>
           <w:rPr>
             <w:rStyle w:val="Hyperlink"/>
@@ -9638,7 +9655,7 @@
           <w:numId w:val="1003"/>
         </w:numPr>
       </w:pPr>
-      <w:hyperlink r:id="rId548">
+      <w:hyperlink r:id="rId549">
         <w:r>
           <w:rPr>
             <w:rStyle w:val="Hyperlink"/>
@@ -9655,7 +9672,7 @@
           <w:numId w:val="1003"/>
         </w:numPr>
       </w:pPr>
-      <w:hyperlink r:id="rId549">
+      <w:hyperlink r:id="rId550">
         <w:r>
           <w:rPr>
             <w:rStyle w:val="Hyperlink"/>
@@ -9672,7 +9689,7 @@
           <w:numId w:val="1003"/>
         </w:numPr>
       </w:pPr>
-      <w:hyperlink r:id="rId550">
+      <w:hyperlink r:id="rId551">
         <w:r>
           <w:rPr>
             <w:rStyle w:val="Hyperlink"/>
@@ -9689,7 +9706,7 @@
           <w:numId w:val="1003"/>
         </w:numPr>
       </w:pPr>
-      <w:hyperlink r:id="rId551">
+      <w:hyperlink r:id="rId552">
         <w:r>
           <w:rPr>
             <w:rStyle w:val="Hyperlink"/>
@@ -9706,7 +9723,7 @@
           <w:numId w:val="1003"/>
         </w:numPr>
       </w:pPr>
-      <w:hyperlink r:id="rId552">
+      <w:hyperlink r:id="rId553">
         <w:r>
           <w:rPr>
             <w:rStyle w:val="Hyperlink"/>
@@ -9723,7 +9740,7 @@
           <w:numId w:val="1003"/>
         </w:numPr>
       </w:pPr>
-      <w:hyperlink r:id="rId553">
+      <w:hyperlink r:id="rId554">
         <w:r>
           <w:rPr>
             <w:rStyle w:val="Hyperlink"/>
@@ -9740,7 +9757,7 @@
           <w:numId w:val="1003"/>
         </w:numPr>
       </w:pPr>
-      <w:hyperlink r:id="rId554">
+      <w:hyperlink r:id="rId555">
         <w:r>
           <w:rPr>
             <w:rStyle w:val="Hyperlink"/>
@@ -9757,7 +9774,7 @@
           <w:numId w:val="1003"/>
         </w:numPr>
       </w:pPr>
-      <w:hyperlink r:id="rId555">
+      <w:hyperlink r:id="rId556">
         <w:r>
           <w:rPr>
             <w:rStyle w:val="Hyperlink"/>
@@ -9774,7 +9791,7 @@
           <w:numId w:val="1003"/>
         </w:numPr>
       </w:pPr>
-      <w:hyperlink r:id="rId556">
+      <w:hyperlink r:id="rId557">
         <w:r>
           <w:rPr>
             <w:rStyle w:val="Hyperlink"/>
@@ -9791,7 +9808,7 @@
           <w:numId w:val="1003"/>
         </w:numPr>
       </w:pPr>
-      <w:hyperlink r:id="rId557">
+      <w:hyperlink r:id="rId558">
         <w:r>
           <w:rPr>
             <w:rStyle w:val="Hyperlink"/>
@@ -9808,7 +9825,7 @@
           <w:numId w:val="1003"/>
         </w:numPr>
       </w:pPr>
-      <w:hyperlink r:id="rId558">
+      <w:hyperlink r:id="rId559">
         <w:r>
           <w:rPr>
             <w:rStyle w:val="Hyperlink"/>
@@ -9825,7 +9842,7 @@
           <w:numId w:val="1003"/>
         </w:numPr>
       </w:pPr>
-      <w:hyperlink r:id="rId559">
+      <w:hyperlink r:id="rId560">
         <w:r>
           <w:rPr>
             <w:rStyle w:val="Hyperlink"/>
@@ -9842,7 +9859,7 @@
           <w:numId w:val="1003"/>
         </w:numPr>
       </w:pPr>
-      <w:hyperlink r:id="rId560">
+      <w:hyperlink r:id="rId561">
         <w:r>
           <w:rPr>
             <w:rStyle w:val="Hyperlink"/>
@@ -9859,7 +9876,7 @@
           <w:numId w:val="1003"/>
         </w:numPr>
       </w:pPr>
-      <w:hyperlink r:id="rId561">
+      <w:hyperlink r:id="rId562">
         <w:r>
           <w:rPr>
             <w:rStyle w:val="Hyperlink"/>
@@ -9876,7 +9893,7 @@
           <w:numId w:val="1003"/>
         </w:numPr>
       </w:pPr>
-      <w:hyperlink r:id="rId562">
+      <w:hyperlink r:id="rId563">
         <w:r>
           <w:rPr>
             <w:rStyle w:val="Hyperlink"/>
@@ -9893,7 +9910,7 @@
           <w:numId w:val="1003"/>
         </w:numPr>
       </w:pPr>
-      <w:hyperlink r:id="rId563">
+      <w:hyperlink r:id="rId564">
         <w:r>
           <w:rPr>
             <w:rStyle w:val="Hyperlink"/>
@@ -9910,7 +9927,7 @@
           <w:numId w:val="1003"/>
         </w:numPr>
       </w:pPr>
-      <w:hyperlink r:id="rId564">
+      <w:hyperlink r:id="rId565">
         <w:r>
           <w:rPr>
             <w:rStyle w:val="Hyperlink"/>
@@ -9927,7 +9944,7 @@
           <w:numId w:val="1003"/>
         </w:numPr>
       </w:pPr>
-      <w:hyperlink r:id="rId565">
+      <w:hyperlink r:id="rId566">
         <w:r>
           <w:rPr>
             <w:rStyle w:val="Hyperlink"/>
@@ -9944,7 +9961,7 @@
           <w:numId w:val="1003"/>
         </w:numPr>
       </w:pPr>
-      <w:hyperlink r:id="rId566">
+      <w:hyperlink r:id="rId567">
         <w:r>
           <w:rPr>
             <w:rStyle w:val="Hyperlink"/>
@@ -9961,7 +9978,7 @@
           <w:numId w:val="1003"/>
         </w:numPr>
       </w:pPr>
-      <w:hyperlink r:id="rId567">
+      <w:hyperlink r:id="rId568">
         <w:r>
           <w:rPr>
             <w:rStyle w:val="Hyperlink"/>
@@ -9978,7 +9995,7 @@
           <w:numId w:val="1003"/>
         </w:numPr>
       </w:pPr>
-      <w:hyperlink r:id="rId568">
+      <w:hyperlink r:id="rId569">
         <w:r>
           <w:rPr>
             <w:rStyle w:val="Hyperlink"/>
@@ -9995,7 +10012,7 @@
           <w:numId w:val="1003"/>
         </w:numPr>
       </w:pPr>
-      <w:hyperlink r:id="rId569">
+      <w:hyperlink r:id="rId570">
         <w:r>
           <w:rPr>
             <w:rStyle w:val="Hyperlink"/>
@@ -10012,7 +10029,7 @@
           <w:numId w:val="1003"/>
         </w:numPr>
       </w:pPr>
-      <w:hyperlink r:id="rId570">
+      <w:hyperlink r:id="rId571">
         <w:r>
           <w:rPr>
             <w:rStyle w:val="Hyperlink"/>
@@ -10029,7 +10046,7 @@
           <w:numId w:val="1003"/>
         </w:numPr>
       </w:pPr>
-      <w:hyperlink r:id="rId571">
+      <w:hyperlink r:id="rId572">
         <w:r>
           <w:rPr>
             <w:rStyle w:val="Hyperlink"/>
@@ -10046,7 +10063,7 @@
           <w:numId w:val="1003"/>
         </w:numPr>
       </w:pPr>
-      <w:hyperlink r:id="rId572">
+      <w:hyperlink r:id="rId573">
         <w:r>
           <w:rPr>
             <w:rStyle w:val="Hyperlink"/>
@@ -10069,7 +10086,7 @@
       <w:r>
         <w:t xml:space="preserve"> </w:t>
       </w:r>
-      <w:hyperlink r:id="rId573">
+      <w:hyperlink r:id="rId574">
         <w:r>
           <w:rPr>
             <w:rStyle w:val="Hyperlink"/>
@@ -10086,7 +10103,7 @@
       <w:r>
         <w:t xml:space="preserve"> </w:t>
       </w:r>
-      <w:hyperlink r:id="rId574">
+      <w:hyperlink r:id="rId575">
         <w:r>
           <w:rPr>
             <w:rStyle w:val="Hyperlink"/>
@@ -10109,7 +10126,7 @@
       <w:r>
         <w:t xml:space="preserve"> </w:t>
       </w:r>
-      <w:hyperlink r:id="rId575">
+      <w:hyperlink r:id="rId576">
         <w:r>
           <w:rPr>
             <w:rStyle w:val="Hyperlink"/>
@@ -10126,7 +10143,7 @@
       <w:r>
         <w:t xml:space="preserve"> </w:t>
       </w:r>
-      <w:hyperlink r:id="rId576">
+      <w:hyperlink r:id="rId577">
         <w:r>
           <w:rPr>
             <w:rStyle w:val="Hyperlink"/>
@@ -10149,7 +10166,7 @@
       <w:r>
         <w:t xml:space="preserve"> </w:t>
       </w:r>
-      <w:hyperlink r:id="rId577">
+      <w:hyperlink r:id="rId578">
         <w:r>
           <w:rPr>
             <w:rStyle w:val="Hyperlink"/>
@@ -10166,7 +10183,7 @@
       <w:r>
         <w:t xml:space="preserve"> </w:t>
       </w:r>
-      <w:hyperlink r:id="rId578">
+      <w:hyperlink r:id="rId579">
         <w:r>
           <w:rPr>
             <w:rStyle w:val="Hyperlink"/>
@@ -10189,7 +10206,7 @@
       <w:r>
         <w:t xml:space="preserve"> </w:t>
       </w:r>
-      <w:hyperlink r:id="rId579">
+      <w:hyperlink r:id="rId580">
         <w:r>
           <w:rPr>
             <w:rStyle w:val="Hyperlink"/>
@@ -10206,7 +10223,7 @@
       <w:r>
         <w:t xml:space="preserve"> </w:t>
       </w:r>
-      <w:hyperlink r:id="rId580">
+      <w:hyperlink r:id="rId581">
         <w:r>
           <w:rPr>
             <w:rStyle w:val="Hyperlink"/>
@@ -10229,7 +10246,7 @@
       <w:r>
         <w:t xml:space="preserve"> </w:t>
       </w:r>
-      <w:hyperlink r:id="rId581">
+      <w:hyperlink r:id="rId582">
         <w:r>
           <w:rPr>
             <w:rStyle w:val="Hyperlink"/>
@@ -10246,7 +10263,7 @@
       <w:r>
         <w:t xml:space="preserve"> </w:t>
       </w:r>
-      <w:hyperlink r:id="rId582">
+      <w:hyperlink r:id="rId583">
         <w:r>
           <w:rPr>
             <w:rStyle w:val="Hyperlink"/>
@@ -10269,7 +10286,7 @@
       <w:r>
         <w:t xml:space="preserve"> </w:t>
       </w:r>
-      <w:hyperlink r:id="rId583">
+      <w:hyperlink r:id="rId584">
         <w:r>
           <w:rPr>
             <w:rStyle w:val="Hyperlink"/>
@@ -10286,7 +10303,7 @@
       <w:r>
         <w:t xml:space="preserve"> </w:t>
       </w:r>
-      <w:hyperlink r:id="rId584">
+      <w:hyperlink r:id="rId585">
         <w:r>
           <w:rPr>
             <w:rStyle w:val="Hyperlink"/>
@@ -10309,7 +10326,7 @@
       <w:r>
         <w:t xml:space="preserve"> </w:t>
       </w:r>
-      <w:hyperlink r:id="rId585">
+      <w:hyperlink r:id="rId586">
         <w:r>
           <w:rPr>
             <w:rStyle w:val="Hyperlink"/>
@@ -10326,7 +10343,7 @@
       <w:r>
         <w:t xml:space="preserve"> </w:t>
       </w:r>
-      <w:hyperlink r:id="rId586">
+      <w:hyperlink r:id="rId587">
         <w:r>
           <w:rPr>
             <w:rStyle w:val="Hyperlink"/>
@@ -10349,7 +10366,7 @@
       <w:r>
         <w:t xml:space="preserve"> </w:t>
       </w:r>
-      <w:hyperlink r:id="rId587">
+      <w:hyperlink r:id="rId588">
         <w:r>
           <w:rPr>
             <w:rStyle w:val="Hyperlink"/>
@@ -10366,7 +10383,7 @@
       <w:r>
         <w:t xml:space="preserve"> </w:t>
       </w:r>
-      <w:hyperlink r:id="rId588">
+      <w:hyperlink r:id="rId589">
         <w:r>
           <w:rPr>
             <w:rStyle w:val="Hyperlink"/>
@@ -10389,7 +10406,7 @@
       <w:r>
         <w:t xml:space="preserve"> </w:t>
       </w:r>
-      <w:hyperlink r:id="rId589">
+      <w:hyperlink r:id="rId590">
         <w:r>
           <w:rPr>
             <w:rStyle w:val="Hyperlink"/>
@@ -10406,7 +10423,7 @@
       <w:r>
         <w:t xml:space="preserve"> </w:t>
       </w:r>
-      <w:hyperlink r:id="rId590">
+      <w:hyperlink r:id="rId591">
         <w:r>
           <w:rPr>
             <w:rStyle w:val="Hyperlink"/>
@@ -10415,8 +10432,8 @@
         </w:r>
       </w:hyperlink>
     </w:p>
-    <w:bookmarkEnd w:id="591"/>
-    <w:bookmarkStart w:id="594" w:name="revisar-los-links"/>
+    <w:bookmarkEnd w:id="592"/>
+    <w:bookmarkStart w:id="595" w:name="revisar-los-links"/>
     <w:p>
       <w:pPr>
         <w:pStyle w:val="Heading2"/>
@@ -10435,7 +10452,7 @@
       <w:r>
         <w:t xml:space="preserve"> </w:t>
       </w:r>
-      <w:hyperlink r:id="rId592">
+      <w:hyperlink r:id="rId593">
         <w:r>
           <w:rPr>
             <w:rStyle w:val="VerbatimChar"/>
@@ -10469,7 +10486,7 @@
       <w:r>
         <w:t xml:space="preserve"> </w:t>
       </w:r>
-      <w:hyperlink r:id="rId593">
+      <w:hyperlink r:id="rId594">
         <w:r>
           <w:rPr>
             <w:rStyle w:val="Hyperlink"/>
@@ -10493,7 +10510,7 @@
         <w:t xml:space="preserve">.</w:t>
       </w:r>
     </w:p>
-    <w:bookmarkEnd w:id="594"/>
+    <w:bookmarkEnd w:id="595"/>
     <w:sectPr>
       <w:footnotePr>
         <w:numRestart w:val="eachSect"/>

</xml_diff>

<commit_message>
Actualizaciones del los links tras el pull request
</commit_message>
<xml_diff>
--- a/Open_Data_Enlaces.docx
+++ b/Open_Data_Enlaces.docx
@@ -34,7 +34,7 @@
         <w:pStyle w:val="Date"/>
       </w:pPr>
       <w:r>
-        <w:t xml:space="preserve">2026-07-16</w:t>
+        <w:t xml:space="preserve">2026-08-25</w:t>
       </w:r>
     </w:p>
     <w:p>
@@ -286,7 +286,7 @@
         <w:t xml:space="preserve">)</w:t>
       </w:r>
     </w:p>
-    <w:bookmarkStart w:id="337" w:name="fuentes-de-datos-abiertos-y-apis"/>
+    <w:bookmarkStart w:id="339" w:name="fuentes-de-datos-abiertos-y-apis"/>
     <w:p>
       <w:pPr>
         <w:pStyle w:val="Heading2"/>
@@ -1217,9 +1217,15 @@
           <w:rPr>
             <w:rStyle w:val="Hyperlink"/>
           </w:rPr>
-          <w:t xml:space="preserve">Copernicus Open Access Hub</w:t>
-        </w:r>
-      </w:hyperlink>
+          <w:t xml:space="preserve">Copernicus Data Space Ecosystem</w:t>
+        </w:r>
+      </w:hyperlink>
+      <w:r>
+        <w:t xml:space="preserve"> </w:t>
+      </w:r>
+      <w:r>
+        <w:t xml:space="preserve">- Sucesor del antiguo Copernicus Open Access Hub (scihub), retirado.</w:t>
+      </w:r>
     </w:p>
     <w:p>
       <w:pPr>
@@ -1450,6 +1456,29 @@
           <w:rPr>
             <w:rStyle w:val="Hyperlink"/>
           </w:rPr>
+          <w:t xml:space="preserve">Databook</w:t>
+        </w:r>
+      </w:hyperlink>
+      <w:r>
+        <w:t xml:space="preserve"> </w:t>
+      </w:r>
+      <w:r>
+        <w:t xml:space="preserve">- Indicadores públicos consolidados por país: 244 países, 108 conjuntos de datos con licencia abierta (Banco Mundial WDI, OMS, UNESCO, ONU DESA, CIA World Factbook). Cada cifra con su fuente y año. En 25 idiomas.</w:t>
+      </w:r>
+    </w:p>
+    <w:p>
+      <w:pPr>
+        <w:pStyle w:val="Compact"/>
+        <w:numPr>
+          <w:ilvl w:val="0"/>
+          <w:numId w:val="1001"/>
+        </w:numPr>
+      </w:pPr>
+      <w:hyperlink r:id="rId79">
+        <w:r>
+          <w:rPr>
+            <w:rStyle w:val="Hyperlink"/>
+          </w:rPr>
           <w:t xml:space="preserve">Datasets de ejemplo de IBM Watson Analytics</w:t>
         </w:r>
       </w:hyperlink>
@@ -1462,7 +1491,7 @@
           <w:numId w:val="1001"/>
         </w:numPr>
       </w:pPr>
-      <w:hyperlink r:id="rId79">
+      <w:hyperlink r:id="rId80">
         <w:r>
           <w:rPr>
             <w:rStyle w:val="Hyperlink"/>
@@ -1479,7 +1508,7 @@
           <w:numId w:val="1001"/>
         </w:numPr>
       </w:pPr>
-      <w:hyperlink r:id="rId80">
+      <w:hyperlink r:id="rId81">
         <w:r>
           <w:rPr>
             <w:rStyle w:val="Hyperlink"/>
@@ -1496,7 +1525,7 @@
           <w:numId w:val="1001"/>
         </w:numPr>
       </w:pPr>
-      <w:hyperlink r:id="rId81">
+      <w:hyperlink r:id="rId82">
         <w:r>
           <w:rPr>
             <w:rStyle w:val="Hyperlink"/>
@@ -1513,7 +1542,7 @@
           <w:numId w:val="1001"/>
         </w:numPr>
       </w:pPr>
-      <w:hyperlink r:id="rId82">
+      <w:hyperlink r:id="rId83">
         <w:r>
           <w:rPr>
             <w:rStyle w:val="Hyperlink"/>
@@ -1530,7 +1559,7 @@
           <w:numId w:val="1001"/>
         </w:numPr>
       </w:pPr>
-      <w:hyperlink r:id="rId83">
+      <w:hyperlink r:id="rId84">
         <w:r>
           <w:rPr>
             <w:rStyle w:val="Hyperlink"/>
@@ -1547,7 +1576,7 @@
           <w:numId w:val="1001"/>
         </w:numPr>
       </w:pPr>
-      <w:hyperlink r:id="rId84">
+      <w:hyperlink r:id="rId85">
         <w:r>
           <w:rPr>
             <w:rStyle w:val="Hyperlink"/>
@@ -1564,7 +1593,7 @@
           <w:numId w:val="1001"/>
         </w:numPr>
       </w:pPr>
-      <w:hyperlink r:id="rId85">
+      <w:hyperlink r:id="rId86">
         <w:r>
           <w:rPr>
             <w:rStyle w:val="Hyperlink"/>
@@ -1581,7 +1610,7 @@
           <w:numId w:val="1001"/>
         </w:numPr>
       </w:pPr>
-      <w:hyperlink r:id="rId86">
+      <w:hyperlink r:id="rId87">
         <w:r>
           <w:rPr>
             <w:rStyle w:val="Hyperlink"/>
@@ -1598,7 +1627,7 @@
           <w:numId w:val="1001"/>
         </w:numPr>
       </w:pPr>
-      <w:hyperlink r:id="rId87">
+      <w:hyperlink r:id="rId88">
         <w:r>
           <w:rPr>
             <w:rStyle w:val="Hyperlink"/>
@@ -1615,7 +1644,7 @@
           <w:numId w:val="1001"/>
         </w:numPr>
       </w:pPr>
-      <w:hyperlink r:id="rId88">
+      <w:hyperlink r:id="rId89">
         <w:r>
           <w:rPr>
             <w:rStyle w:val="Hyperlink"/>
@@ -1632,7 +1661,7 @@
           <w:numId w:val="1001"/>
         </w:numPr>
       </w:pPr>
-      <w:hyperlink r:id="rId89">
+      <w:hyperlink r:id="rId90">
         <w:r>
           <w:rPr>
             <w:rStyle w:val="Hyperlink"/>
@@ -1649,7 +1678,7 @@
           <w:numId w:val="1001"/>
         </w:numPr>
       </w:pPr>
-      <w:hyperlink r:id="rId90">
+      <w:hyperlink r:id="rId91">
         <w:r>
           <w:rPr>
             <w:rStyle w:val="Hyperlink"/>
@@ -1666,7 +1695,7 @@
           <w:numId w:val="1001"/>
         </w:numPr>
       </w:pPr>
-      <w:hyperlink r:id="rId91">
+      <w:hyperlink r:id="rId92">
         <w:r>
           <w:rPr>
             <w:rStyle w:val="Hyperlink"/>
@@ -1683,7 +1712,7 @@
           <w:numId w:val="1001"/>
         </w:numPr>
       </w:pPr>
-      <w:hyperlink r:id="rId92">
+      <w:hyperlink r:id="rId93">
         <w:r>
           <w:rPr>
             <w:rStyle w:val="Hyperlink"/>
@@ -1700,7 +1729,7 @@
           <w:numId w:val="1001"/>
         </w:numPr>
       </w:pPr>
-      <w:hyperlink r:id="rId93">
+      <w:hyperlink r:id="rId94">
         <w:r>
           <w:rPr>
             <w:rStyle w:val="Hyperlink"/>
@@ -1717,7 +1746,7 @@
           <w:numId w:val="1001"/>
         </w:numPr>
       </w:pPr>
-      <w:hyperlink r:id="rId94">
+      <w:hyperlink r:id="rId95">
         <w:r>
           <w:rPr>
             <w:rStyle w:val="Hyperlink"/>
@@ -1734,7 +1763,7 @@
           <w:numId w:val="1001"/>
         </w:numPr>
       </w:pPr>
-      <w:hyperlink r:id="rId95">
+      <w:hyperlink r:id="rId96">
         <w:r>
           <w:rPr>
             <w:rStyle w:val="Hyperlink"/>
@@ -1751,7 +1780,7 @@
           <w:numId w:val="1001"/>
         </w:numPr>
       </w:pPr>
-      <w:hyperlink r:id="rId96">
+      <w:hyperlink r:id="rId97">
         <w:r>
           <w:rPr>
             <w:rStyle w:val="Hyperlink"/>
@@ -1768,7 +1797,7 @@
           <w:numId w:val="1001"/>
         </w:numPr>
       </w:pPr>
-      <w:hyperlink r:id="rId97">
+      <w:hyperlink r:id="rId98">
         <w:r>
           <w:rPr>
             <w:rStyle w:val="Hyperlink"/>
@@ -1785,7 +1814,7 @@
           <w:numId w:val="1001"/>
         </w:numPr>
       </w:pPr>
-      <w:hyperlink r:id="rId98">
+      <w:hyperlink r:id="rId99">
         <w:r>
           <w:rPr>
             <w:rStyle w:val="Hyperlink"/>
@@ -1802,7 +1831,7 @@
           <w:numId w:val="1001"/>
         </w:numPr>
       </w:pPr>
-      <w:hyperlink r:id="rId99">
+      <w:hyperlink r:id="rId100">
         <w:r>
           <w:rPr>
             <w:rStyle w:val="Hyperlink"/>
@@ -1825,7 +1854,7 @@
           <w:numId w:val="1001"/>
         </w:numPr>
       </w:pPr>
-      <w:hyperlink r:id="rId100">
+      <w:hyperlink r:id="rId101">
         <w:r>
           <w:rPr>
             <w:rStyle w:val="Hyperlink"/>
@@ -1842,7 +1871,7 @@
           <w:numId w:val="1001"/>
         </w:numPr>
       </w:pPr>
-      <w:hyperlink r:id="rId101">
+      <w:hyperlink r:id="rId102">
         <w:r>
           <w:rPr>
             <w:rStyle w:val="Hyperlink"/>
@@ -1865,7 +1894,7 @@
           <w:numId w:val="1001"/>
         </w:numPr>
       </w:pPr>
-      <w:hyperlink r:id="rId102">
+      <w:hyperlink r:id="rId103">
         <w:r>
           <w:rPr>
             <w:rStyle w:val="Hyperlink"/>
@@ -1882,7 +1911,7 @@
           <w:numId w:val="1001"/>
         </w:numPr>
       </w:pPr>
-      <w:hyperlink r:id="rId103">
+      <w:hyperlink r:id="rId104">
         <w:r>
           <w:rPr>
             <w:rStyle w:val="Hyperlink"/>
@@ -1899,7 +1928,7 @@
           <w:numId w:val="1001"/>
         </w:numPr>
       </w:pPr>
-      <w:hyperlink r:id="rId104">
+      <w:hyperlink r:id="rId105">
         <w:r>
           <w:rPr>
             <w:rStyle w:val="Hyperlink"/>
@@ -1916,7 +1945,7 @@
           <w:numId w:val="1001"/>
         </w:numPr>
       </w:pPr>
-      <w:hyperlink r:id="rId105">
+      <w:hyperlink r:id="rId106">
         <w:r>
           <w:rPr>
             <w:rStyle w:val="Hyperlink"/>
@@ -1933,7 +1962,7 @@
           <w:numId w:val="1001"/>
         </w:numPr>
       </w:pPr>
-      <w:hyperlink r:id="rId106">
+      <w:hyperlink r:id="rId107">
         <w:r>
           <w:rPr>
             <w:rStyle w:val="Hyperlink"/>
@@ -1950,7 +1979,7 @@
           <w:numId w:val="1001"/>
         </w:numPr>
       </w:pPr>
-      <w:hyperlink r:id="rId107">
+      <w:hyperlink r:id="rId108">
         <w:r>
           <w:rPr>
             <w:rStyle w:val="Hyperlink"/>
@@ -1967,7 +1996,7 @@
           <w:numId w:val="1001"/>
         </w:numPr>
       </w:pPr>
-      <w:hyperlink r:id="rId108">
+      <w:hyperlink r:id="rId109">
         <w:r>
           <w:rPr>
             <w:rStyle w:val="Hyperlink"/>
@@ -1984,7 +2013,7 @@
           <w:numId w:val="1001"/>
         </w:numPr>
       </w:pPr>
-      <w:hyperlink r:id="rId109">
+      <w:hyperlink r:id="rId110">
         <w:r>
           <w:rPr>
             <w:rStyle w:val="Hyperlink"/>
@@ -2001,7 +2030,7 @@
           <w:numId w:val="1001"/>
         </w:numPr>
       </w:pPr>
-      <w:hyperlink r:id="rId110">
+      <w:hyperlink r:id="rId111">
         <w:r>
           <w:rPr>
             <w:rStyle w:val="Hyperlink"/>
@@ -2018,28 +2047,28 @@
           <w:numId w:val="1001"/>
         </w:numPr>
       </w:pPr>
-      <w:hyperlink r:id="rId111">
-        <w:r>
-          <w:rPr>
-            <w:rStyle w:val="Hyperlink"/>
-          </w:rPr>
-          <w:t xml:space="preserve">ESA WorldCover 2021. Global land cover product at 10 m for 2021 based on Sentinel-1 and 2 data</w:t>
-        </w:r>
-      </w:hyperlink>
-    </w:p>
-    <w:p>
-      <w:pPr>
-        <w:pStyle w:val="Compact"/>
-        <w:numPr>
-          <w:ilvl w:val="0"/>
-          <w:numId w:val="1001"/>
-        </w:numPr>
-      </w:pPr>
       <w:hyperlink r:id="rId112">
         <w:r>
           <w:rPr>
             <w:rStyle w:val="Hyperlink"/>
           </w:rPr>
+          <w:t xml:space="preserve">ESA WorldCover. Global land cover product at 10 m based on Sentinel-1 and 2 data</w:t>
+        </w:r>
+      </w:hyperlink>
+    </w:p>
+    <w:p>
+      <w:pPr>
+        <w:pStyle w:val="Compact"/>
+        <w:numPr>
+          <w:ilvl w:val="0"/>
+          <w:numId w:val="1001"/>
+        </w:numPr>
+      </w:pPr>
+      <w:hyperlink r:id="rId113">
+        <w:r>
+          <w:rPr>
+            <w:rStyle w:val="Hyperlink"/>
+          </w:rPr>
           <w:t xml:space="preserve">España. Estadísticas de mercado de trabajo</w:t>
         </w:r>
       </w:hyperlink>
@@ -2052,7 +2081,7 @@
           <w:numId w:val="1001"/>
         </w:numPr>
       </w:pPr>
-      <w:hyperlink r:id="rId113">
+      <w:hyperlink r:id="rId114">
         <w:r>
           <w:rPr>
             <w:rStyle w:val="Hyperlink"/>
@@ -2069,7 +2098,7 @@
           <w:numId w:val="1001"/>
         </w:numPr>
       </w:pPr>
-      <w:hyperlink r:id="rId114">
+      <w:hyperlink r:id="rId115">
         <w:r>
           <w:rPr>
             <w:rStyle w:val="Hyperlink"/>
@@ -2086,7 +2115,7 @@
           <w:numId w:val="1001"/>
         </w:numPr>
       </w:pPr>
-      <w:hyperlink r:id="rId115">
+      <w:hyperlink r:id="rId116">
         <w:r>
           <w:rPr>
             <w:rStyle w:val="Hyperlink"/>
@@ -2103,7 +2132,7 @@
           <w:numId w:val="1001"/>
         </w:numPr>
       </w:pPr>
-      <w:hyperlink r:id="rId116">
+      <w:hyperlink r:id="rId117">
         <w:r>
           <w:rPr>
             <w:rStyle w:val="Hyperlink"/>
@@ -2120,7 +2149,7 @@
           <w:numId w:val="1001"/>
         </w:numPr>
       </w:pPr>
-      <w:hyperlink r:id="rId117">
+      <w:hyperlink r:id="rId118">
         <w:r>
           <w:rPr>
             <w:rStyle w:val="Hyperlink"/>
@@ -2137,7 +2166,7 @@
           <w:numId w:val="1001"/>
         </w:numPr>
       </w:pPr>
-      <w:hyperlink r:id="rId118">
+      <w:hyperlink r:id="rId119">
         <w:r>
           <w:rPr>
             <w:rStyle w:val="Hyperlink"/>
@@ -2154,7 +2183,7 @@
           <w:numId w:val="1001"/>
         </w:numPr>
       </w:pPr>
-      <w:hyperlink r:id="rId119">
+      <w:hyperlink r:id="rId120">
         <w:r>
           <w:rPr>
             <w:rStyle w:val="Hyperlink"/>
@@ -2171,7 +2200,7 @@
           <w:numId w:val="1001"/>
         </w:numPr>
       </w:pPr>
-      <w:hyperlink r:id="rId120">
+      <w:hyperlink r:id="rId121">
         <w:r>
           <w:rPr>
             <w:rStyle w:val="Hyperlink"/>
@@ -2188,7 +2217,7 @@
           <w:numId w:val="1001"/>
         </w:numPr>
       </w:pPr>
-      <w:hyperlink r:id="rId121">
+      <w:hyperlink r:id="rId122">
         <w:r>
           <w:rPr>
             <w:rStyle w:val="Hyperlink"/>
@@ -2205,7 +2234,7 @@
           <w:numId w:val="1001"/>
         </w:numPr>
       </w:pPr>
-      <w:hyperlink r:id="rId122">
+      <w:hyperlink r:id="rId123">
         <w:r>
           <w:rPr>
             <w:rStyle w:val="Hyperlink"/>
@@ -2222,7 +2251,7 @@
           <w:numId w:val="1001"/>
         </w:numPr>
       </w:pPr>
-      <w:hyperlink r:id="rId123">
+      <w:hyperlink r:id="rId124">
         <w:r>
           <w:rPr>
             <w:rStyle w:val="Hyperlink"/>
@@ -2245,7 +2274,7 @@
           <w:numId w:val="1001"/>
         </w:numPr>
       </w:pPr>
-      <w:hyperlink r:id="rId124">
+      <w:hyperlink r:id="rId125">
         <w:r>
           <w:rPr>
             <w:rStyle w:val="Hyperlink"/>
@@ -2262,7 +2291,7 @@
           <w:numId w:val="1001"/>
         </w:numPr>
       </w:pPr>
-      <w:hyperlink r:id="rId125">
+      <w:hyperlink r:id="rId126">
         <w:r>
           <w:rPr>
             <w:rStyle w:val="Hyperlink"/>
@@ -2279,7 +2308,7 @@
           <w:numId w:val="1001"/>
         </w:numPr>
       </w:pPr>
-      <w:hyperlink r:id="rId126">
+      <w:hyperlink r:id="rId127">
         <w:r>
           <w:rPr>
             <w:rStyle w:val="Hyperlink"/>
@@ -2296,7 +2325,7 @@
           <w:numId w:val="1001"/>
         </w:numPr>
       </w:pPr>
-      <w:hyperlink r:id="rId127">
+      <w:hyperlink r:id="rId128">
         <w:r>
           <w:rPr>
             <w:rStyle w:val="Hyperlink"/>
@@ -2313,7 +2342,7 @@
           <w:numId w:val="1001"/>
         </w:numPr>
       </w:pPr>
-      <w:hyperlink r:id="rId128">
+      <w:hyperlink r:id="rId129">
         <w:r>
           <w:rPr>
             <w:rStyle w:val="Hyperlink"/>
@@ -2330,7 +2359,7 @@
           <w:numId w:val="1001"/>
         </w:numPr>
       </w:pPr>
-      <w:hyperlink r:id="rId129">
+      <w:hyperlink r:id="rId130">
         <w:r>
           <w:rPr>
             <w:rStyle w:val="Hyperlink"/>
@@ -2347,7 +2376,7 @@
           <w:numId w:val="1001"/>
         </w:numPr>
       </w:pPr>
-      <w:hyperlink r:id="rId130">
+      <w:hyperlink r:id="rId131">
         <w:r>
           <w:rPr>
             <w:rStyle w:val="Hyperlink"/>
@@ -2364,7 +2393,7 @@
           <w:numId w:val="1001"/>
         </w:numPr>
       </w:pPr>
-      <w:hyperlink r:id="rId131">
+      <w:hyperlink r:id="rId132">
         <w:r>
           <w:rPr>
             <w:rStyle w:val="Hyperlink"/>
@@ -2381,7 +2410,7 @@
           <w:numId w:val="1001"/>
         </w:numPr>
       </w:pPr>
-      <w:hyperlink r:id="rId132">
+      <w:hyperlink r:id="rId133">
         <w:r>
           <w:rPr>
             <w:rStyle w:val="Hyperlink"/>
@@ -2398,7 +2427,7 @@
           <w:numId w:val="1001"/>
         </w:numPr>
       </w:pPr>
-      <w:hyperlink r:id="rId133">
+      <w:hyperlink r:id="rId134">
         <w:r>
           <w:rPr>
             <w:rStyle w:val="Hyperlink"/>
@@ -2415,7 +2444,7 @@
           <w:numId w:val="1001"/>
         </w:numPr>
       </w:pPr>
-      <w:hyperlink r:id="rId134">
+      <w:hyperlink r:id="rId135">
         <w:r>
           <w:rPr>
             <w:rStyle w:val="Hyperlink"/>
@@ -2438,7 +2467,7 @@
           <w:numId w:val="1001"/>
         </w:numPr>
       </w:pPr>
-      <w:hyperlink r:id="rId135">
+      <w:hyperlink r:id="rId136">
         <w:r>
           <w:rPr>
             <w:rStyle w:val="Hyperlink"/>
@@ -2455,7 +2484,7 @@
           <w:numId w:val="1001"/>
         </w:numPr>
       </w:pPr>
-      <w:hyperlink r:id="rId136">
+      <w:hyperlink r:id="rId137">
         <w:r>
           <w:rPr>
             <w:rStyle w:val="Hyperlink"/>
@@ -2472,7 +2501,7 @@
           <w:numId w:val="1001"/>
         </w:numPr>
       </w:pPr>
-      <w:hyperlink r:id="rId137">
+      <w:hyperlink r:id="rId138">
         <w:r>
           <w:rPr>
             <w:rStyle w:val="Hyperlink"/>
@@ -2489,7 +2518,7 @@
           <w:numId w:val="1001"/>
         </w:numPr>
       </w:pPr>
-      <w:hyperlink r:id="rId138">
+      <w:hyperlink r:id="rId139">
         <w:r>
           <w:rPr>
             <w:rStyle w:val="Hyperlink"/>
@@ -2512,7 +2541,7 @@
           <w:numId w:val="1001"/>
         </w:numPr>
       </w:pPr>
-      <w:hyperlink r:id="rId139">
+      <w:hyperlink r:id="rId140">
         <w:r>
           <w:rPr>
             <w:rStyle w:val="Hyperlink"/>
@@ -2529,7 +2558,7 @@
           <w:numId w:val="1001"/>
         </w:numPr>
       </w:pPr>
-      <w:hyperlink r:id="rId140">
+      <w:hyperlink r:id="rId141">
         <w:r>
           <w:rPr>
             <w:rStyle w:val="Hyperlink"/>
@@ -2546,7 +2575,7 @@
           <w:numId w:val="1001"/>
         </w:numPr>
       </w:pPr>
-      <w:hyperlink r:id="rId141">
+      <w:hyperlink r:id="rId142">
         <w:r>
           <w:rPr>
             <w:rStyle w:val="Hyperlink"/>
@@ -2563,7 +2592,7 @@
           <w:numId w:val="1001"/>
         </w:numPr>
       </w:pPr>
-      <w:hyperlink r:id="rId142">
+      <w:hyperlink r:id="rId143">
         <w:r>
           <w:rPr>
             <w:rStyle w:val="Hyperlink"/>
@@ -2586,7 +2615,7 @@
       <w:r>
         <w:t xml:space="preserve"> </w:t>
       </w:r>
-      <w:hyperlink r:id="rId143">
+      <w:hyperlink r:id="rId144">
         <w:r>
           <w:rPr>
             <w:rStyle w:val="Hyperlink"/>
@@ -2597,7 +2626,7 @@
       <w:r>
         <w:t xml:space="preserve"> </w:t>
       </w:r>
-      <w:hyperlink r:id="rId144">
+      <w:hyperlink r:id="rId145">
         <w:r>
           <w:rPr>
             <w:rStyle w:val="Hyperlink"/>
@@ -2608,7 +2637,7 @@
       <w:r>
         <w:t xml:space="preserve"> </w:t>
       </w:r>
-      <w:hyperlink r:id="rId145">
+      <w:hyperlink r:id="rId146">
         <w:r>
           <w:rPr>
             <w:rStyle w:val="Hyperlink"/>
@@ -2625,7 +2654,7 @@
           <w:numId w:val="1001"/>
         </w:numPr>
       </w:pPr>
-      <w:hyperlink r:id="rId146">
+      <w:hyperlink r:id="rId147">
         <w:r>
           <w:rPr>
             <w:rStyle w:val="Hyperlink"/>
@@ -2648,7 +2677,7 @@
           <w:numId w:val="1001"/>
         </w:numPr>
       </w:pPr>
-      <w:hyperlink r:id="rId147">
+      <w:hyperlink r:id="rId148">
         <w:r>
           <w:rPr>
             <w:rStyle w:val="Hyperlink"/>
@@ -2671,7 +2700,7 @@
           <w:numId w:val="1001"/>
         </w:numPr>
       </w:pPr>
-      <w:hyperlink r:id="rId148">
+      <w:hyperlink r:id="rId149">
         <w:r>
           <w:rPr>
             <w:rStyle w:val="Hyperlink"/>
@@ -2688,7 +2717,7 @@
           <w:numId w:val="1001"/>
         </w:numPr>
       </w:pPr>
-      <w:hyperlink r:id="rId149">
+      <w:hyperlink r:id="rId150">
         <w:r>
           <w:rPr>
             <w:rStyle w:val="Hyperlink"/>
@@ -2705,7 +2734,7 @@
           <w:numId w:val="1001"/>
         </w:numPr>
       </w:pPr>
-      <w:hyperlink r:id="rId150">
+      <w:hyperlink r:id="rId151">
         <w:r>
           <w:rPr>
             <w:rStyle w:val="Hyperlink"/>
@@ -2722,7 +2751,7 @@
           <w:numId w:val="1001"/>
         </w:numPr>
       </w:pPr>
-      <w:hyperlink r:id="rId151">
+      <w:hyperlink r:id="rId152">
         <w:r>
           <w:rPr>
             <w:rStyle w:val="Hyperlink"/>
@@ -2739,7 +2768,7 @@
           <w:numId w:val="1001"/>
         </w:numPr>
       </w:pPr>
-      <w:hyperlink r:id="rId152">
+      <w:hyperlink r:id="rId153">
         <w:r>
           <w:rPr>
             <w:rStyle w:val="Hyperlink"/>
@@ -2756,7 +2785,7 @@
           <w:numId w:val="1001"/>
         </w:numPr>
       </w:pPr>
-      <w:hyperlink r:id="rId153">
+      <w:hyperlink r:id="rId154">
         <w:r>
           <w:rPr>
             <w:rStyle w:val="Hyperlink"/>
@@ -2773,7 +2802,7 @@
           <w:numId w:val="1001"/>
         </w:numPr>
       </w:pPr>
-      <w:hyperlink r:id="rId154">
+      <w:hyperlink r:id="rId155">
         <w:r>
           <w:rPr>
             <w:rStyle w:val="Hyperlink"/>
@@ -2790,7 +2819,7 @@
           <w:numId w:val="1001"/>
         </w:numPr>
       </w:pPr>
-      <w:hyperlink r:id="rId155">
+      <w:hyperlink r:id="rId156">
         <w:r>
           <w:rPr>
             <w:rStyle w:val="Hyperlink"/>
@@ -2807,7 +2836,7 @@
           <w:numId w:val="1001"/>
         </w:numPr>
       </w:pPr>
-      <w:hyperlink r:id="rId156">
+      <w:hyperlink r:id="rId157">
         <w:r>
           <w:rPr>
             <w:rStyle w:val="Hyperlink"/>
@@ -2824,7 +2853,7 @@
           <w:numId w:val="1001"/>
         </w:numPr>
       </w:pPr>
-      <w:hyperlink r:id="rId157">
+      <w:hyperlink r:id="rId158">
         <w:r>
           <w:rPr>
             <w:rStyle w:val="Hyperlink"/>
@@ -2841,7 +2870,7 @@
           <w:numId w:val="1001"/>
         </w:numPr>
       </w:pPr>
-      <w:hyperlink r:id="rId158">
+      <w:hyperlink r:id="rId159">
         <w:r>
           <w:rPr>
             <w:rStyle w:val="Hyperlink"/>
@@ -2858,7 +2887,7 @@
           <w:numId w:val="1001"/>
         </w:numPr>
       </w:pPr>
-      <w:hyperlink r:id="rId159">
+      <w:hyperlink r:id="rId160">
         <w:r>
           <w:rPr>
             <w:rStyle w:val="Hyperlink"/>
@@ -2875,7 +2904,7 @@
           <w:numId w:val="1001"/>
         </w:numPr>
       </w:pPr>
-      <w:hyperlink r:id="rId160">
+      <w:hyperlink r:id="rId161">
         <w:r>
           <w:rPr>
             <w:rStyle w:val="Hyperlink"/>
@@ -2892,7 +2921,7 @@
           <w:numId w:val="1001"/>
         </w:numPr>
       </w:pPr>
-      <w:hyperlink r:id="rId161">
+      <w:hyperlink r:id="rId162">
         <w:r>
           <w:rPr>
             <w:rStyle w:val="Hyperlink"/>
@@ -2909,7 +2938,7 @@
           <w:numId w:val="1001"/>
         </w:numPr>
       </w:pPr>
-      <w:hyperlink r:id="rId162">
+      <w:hyperlink r:id="rId163">
         <w:r>
           <w:rPr>
             <w:rStyle w:val="Hyperlink"/>
@@ -2926,7 +2955,7 @@
           <w:numId w:val="1001"/>
         </w:numPr>
       </w:pPr>
-      <w:hyperlink r:id="rId163">
+      <w:hyperlink r:id="rId164">
         <w:r>
           <w:rPr>
             <w:rStyle w:val="Hyperlink"/>
@@ -2943,7 +2972,7 @@
           <w:numId w:val="1001"/>
         </w:numPr>
       </w:pPr>
-      <w:hyperlink r:id="rId164">
+      <w:hyperlink r:id="rId165">
         <w:r>
           <w:rPr>
             <w:rStyle w:val="Hyperlink"/>
@@ -2960,7 +2989,7 @@
           <w:numId w:val="1001"/>
         </w:numPr>
       </w:pPr>
-      <w:hyperlink r:id="rId165">
+      <w:hyperlink r:id="rId166">
         <w:r>
           <w:rPr>
             <w:rStyle w:val="Hyperlink"/>
@@ -2977,7 +3006,7 @@
           <w:numId w:val="1001"/>
         </w:numPr>
       </w:pPr>
-      <w:hyperlink r:id="rId166">
+      <w:hyperlink r:id="rId167">
         <w:r>
           <w:rPr>
             <w:rStyle w:val="Hyperlink"/>
@@ -2994,7 +3023,7 @@
           <w:numId w:val="1001"/>
         </w:numPr>
       </w:pPr>
-      <w:hyperlink r:id="rId167">
+      <w:hyperlink r:id="rId168">
         <w:r>
           <w:rPr>
             <w:rStyle w:val="Hyperlink"/>
@@ -3011,7 +3040,7 @@
           <w:numId w:val="1001"/>
         </w:numPr>
       </w:pPr>
-      <w:hyperlink r:id="rId168">
+      <w:hyperlink r:id="rId169">
         <w:r>
           <w:rPr>
             <w:rStyle w:val="Hyperlink"/>
@@ -3028,7 +3057,7 @@
           <w:numId w:val="1001"/>
         </w:numPr>
       </w:pPr>
-      <w:hyperlink r:id="rId169">
+      <w:hyperlink r:id="rId170">
         <w:r>
           <w:rPr>
             <w:rStyle w:val="Hyperlink"/>
@@ -3045,7 +3074,7 @@
           <w:numId w:val="1001"/>
         </w:numPr>
       </w:pPr>
-      <w:hyperlink r:id="rId170">
+      <w:hyperlink r:id="rId171">
         <w:r>
           <w:rPr>
             <w:rStyle w:val="Hyperlink"/>
@@ -3062,7 +3091,7 @@
           <w:numId w:val="1001"/>
         </w:numPr>
       </w:pPr>
-      <w:hyperlink r:id="rId171">
+      <w:hyperlink r:id="rId172">
         <w:r>
           <w:rPr>
             <w:rStyle w:val="Hyperlink"/>
@@ -3079,7 +3108,7 @@
           <w:numId w:val="1001"/>
         </w:numPr>
       </w:pPr>
-      <w:hyperlink r:id="rId172">
+      <w:hyperlink r:id="rId173">
         <w:r>
           <w:rPr>
             <w:rStyle w:val="Hyperlink"/>
@@ -3108,7 +3137,7 @@
           <w:numId w:val="1001"/>
         </w:numPr>
       </w:pPr>
-      <w:hyperlink r:id="rId173">
+      <w:hyperlink r:id="rId174">
         <w:r>
           <w:rPr>
             <w:rStyle w:val="Hyperlink"/>
@@ -3125,7 +3154,7 @@
           <w:numId w:val="1001"/>
         </w:numPr>
       </w:pPr>
-      <w:hyperlink r:id="rId174">
+      <w:hyperlink r:id="rId175">
         <w:r>
           <w:rPr>
             <w:rStyle w:val="Hyperlink"/>
@@ -3142,7 +3171,7 @@
           <w:numId w:val="1001"/>
         </w:numPr>
       </w:pPr>
-      <w:hyperlink r:id="rId175">
+      <w:hyperlink r:id="rId176">
         <w:r>
           <w:rPr>
             <w:rStyle w:val="Hyperlink"/>
@@ -3159,7 +3188,7 @@
           <w:numId w:val="1001"/>
         </w:numPr>
       </w:pPr>
-      <w:hyperlink r:id="rId176">
+      <w:hyperlink r:id="rId177">
         <w:r>
           <w:rPr>
             <w:rStyle w:val="Hyperlink"/>
@@ -3176,7 +3205,7 @@
           <w:numId w:val="1001"/>
         </w:numPr>
       </w:pPr>
-      <w:hyperlink r:id="rId177">
+      <w:hyperlink r:id="rId178">
         <w:r>
           <w:rPr>
             <w:rStyle w:val="Hyperlink"/>
@@ -3193,7 +3222,30 @@
           <w:numId w:val="1001"/>
         </w:numPr>
       </w:pPr>
-      <w:hyperlink r:id="rId178">
+      <w:hyperlink r:id="rId179">
+        <w:r>
+          <w:rPr>
+            <w:rStyle w:val="Hyperlink"/>
+          </w:rPr>
+          <w:t xml:space="preserve">Logibook</w:t>
+        </w:r>
+      </w:hyperlink>
+      <w:r>
+        <w:t xml:space="preserve"> </w:t>
+      </w:r>
+      <w:r>
+        <w:t xml:space="preserve">- Datos de referencia de comercio y logística por país: 250 países, 98 conjuntos de datos con licencia abierta (NGA World Port Index, OurAirports, UN/LOCODE, listas SMDG, UNCTAD, Banco Mundial LPI, CEPII BACI). Para España: 49 puertos, 60 aeropuertos, 1.218 ubicaciones y 23 zonas de comercio.</w:t>
+      </w:r>
+    </w:p>
+    <w:p>
+      <w:pPr>
+        <w:pStyle w:val="Compact"/>
+        <w:numPr>
+          <w:ilvl w:val="0"/>
+          <w:numId w:val="1001"/>
+        </w:numPr>
+      </w:pPr>
+      <w:hyperlink r:id="rId180">
         <w:r>
           <w:rPr>
             <w:rStyle w:val="Hyperlink"/>
@@ -3210,7 +3262,7 @@
           <w:numId w:val="1001"/>
         </w:numPr>
       </w:pPr>
-      <w:hyperlink r:id="rId179">
+      <w:hyperlink r:id="rId181">
         <w:r>
           <w:rPr>
             <w:rStyle w:val="Hyperlink"/>
@@ -3227,7 +3279,7 @@
           <w:numId w:val="1001"/>
         </w:numPr>
       </w:pPr>
-      <w:hyperlink r:id="rId180">
+      <w:hyperlink r:id="rId182">
         <w:r>
           <w:rPr>
             <w:rStyle w:val="Hyperlink"/>
@@ -3244,7 +3296,7 @@
           <w:numId w:val="1001"/>
         </w:numPr>
       </w:pPr>
-      <w:hyperlink r:id="rId181">
+      <w:hyperlink r:id="rId183">
         <w:r>
           <w:rPr>
             <w:rStyle w:val="Hyperlink"/>
@@ -3261,7 +3313,7 @@
           <w:numId w:val="1001"/>
         </w:numPr>
       </w:pPr>
-      <w:hyperlink r:id="rId182">
+      <w:hyperlink r:id="rId184">
         <w:r>
           <w:rPr>
             <w:rStyle w:val="Hyperlink"/>
@@ -3278,7 +3330,7 @@
           <w:numId w:val="1001"/>
         </w:numPr>
       </w:pPr>
-      <w:hyperlink r:id="rId183">
+      <w:hyperlink r:id="rId185">
         <w:r>
           <w:rPr>
             <w:rStyle w:val="Hyperlink"/>
@@ -3295,7 +3347,7 @@
           <w:numId w:val="1001"/>
         </w:numPr>
       </w:pPr>
-      <w:hyperlink r:id="rId184">
+      <w:hyperlink r:id="rId186">
         <w:r>
           <w:rPr>
             <w:rStyle w:val="Hyperlink"/>
@@ -3312,7 +3364,7 @@
           <w:numId w:val="1001"/>
         </w:numPr>
       </w:pPr>
-      <w:hyperlink r:id="rId185">
+      <w:hyperlink r:id="rId187">
         <w:r>
           <w:rPr>
             <w:rStyle w:val="Hyperlink"/>
@@ -3329,7 +3381,7 @@
           <w:numId w:val="1001"/>
         </w:numPr>
       </w:pPr>
-      <w:hyperlink r:id="rId186">
+      <w:hyperlink r:id="rId188">
         <w:r>
           <w:rPr>
             <w:rStyle w:val="Hyperlink"/>
@@ -3346,7 +3398,7 @@
           <w:numId w:val="1001"/>
         </w:numPr>
       </w:pPr>
-      <w:hyperlink r:id="rId187">
+      <w:hyperlink r:id="rId189">
         <w:r>
           <w:rPr>
             <w:rStyle w:val="Hyperlink"/>
@@ -3363,7 +3415,7 @@
           <w:numId w:val="1001"/>
         </w:numPr>
       </w:pPr>
-      <w:hyperlink r:id="rId188">
+      <w:hyperlink r:id="rId190">
         <w:r>
           <w:rPr>
             <w:rStyle w:val="Hyperlink"/>
@@ -3380,7 +3432,7 @@
           <w:numId w:val="1001"/>
         </w:numPr>
       </w:pPr>
-      <w:hyperlink r:id="rId189">
+      <w:hyperlink r:id="rId191">
         <w:r>
           <w:rPr>
             <w:rStyle w:val="Hyperlink"/>
@@ -3397,7 +3449,7 @@
           <w:numId w:val="1001"/>
         </w:numPr>
       </w:pPr>
-      <w:hyperlink r:id="rId190">
+      <w:hyperlink r:id="rId192">
         <w:r>
           <w:rPr>
             <w:rStyle w:val="Hyperlink"/>
@@ -3414,7 +3466,7 @@
           <w:numId w:val="1001"/>
         </w:numPr>
       </w:pPr>
-      <w:hyperlink r:id="rId191">
+      <w:hyperlink r:id="rId193">
         <w:r>
           <w:rPr>
             <w:rStyle w:val="Hyperlink"/>
@@ -3431,7 +3483,7 @@
           <w:numId w:val="1001"/>
         </w:numPr>
       </w:pPr>
-      <w:hyperlink r:id="rId192">
+      <w:hyperlink r:id="rId194">
         <w:r>
           <w:rPr>
             <w:rStyle w:val="Hyperlink"/>
@@ -3448,7 +3500,7 @@
           <w:numId w:val="1001"/>
         </w:numPr>
       </w:pPr>
-      <w:hyperlink r:id="rId193">
+      <w:hyperlink r:id="rId195">
         <w:r>
           <w:rPr>
             <w:rStyle w:val="Hyperlink"/>
@@ -3465,7 +3517,7 @@
           <w:numId w:val="1001"/>
         </w:numPr>
       </w:pPr>
-      <w:hyperlink r:id="rId194">
+      <w:hyperlink r:id="rId196">
         <w:r>
           <w:rPr>
             <w:rStyle w:val="Hyperlink"/>
@@ -3488,7 +3540,7 @@
       <w:r>
         <w:t xml:space="preserve"> </w:t>
       </w:r>
-      <w:hyperlink r:id="rId195">
+      <w:hyperlink r:id="rId197">
         <w:r>
           <w:rPr>
             <w:rStyle w:val="Hyperlink"/>
@@ -3499,7 +3551,7 @@
       <w:r>
         <w:t xml:space="preserve"> </w:t>
       </w:r>
-      <w:hyperlink r:id="rId196">
+      <w:hyperlink r:id="rId198">
         <w:r>
           <w:rPr>
             <w:rStyle w:val="Hyperlink"/>
@@ -3522,7 +3574,7 @@
           <w:numId w:val="1001"/>
         </w:numPr>
       </w:pPr>
-      <w:hyperlink r:id="rId197">
+      <w:hyperlink r:id="rId199">
         <w:r>
           <w:rPr>
             <w:rStyle w:val="Hyperlink"/>
@@ -3545,7 +3597,7 @@
           <w:numId w:val="1001"/>
         </w:numPr>
       </w:pPr>
-      <w:hyperlink r:id="rId198">
+      <w:hyperlink r:id="rId200">
         <w:r>
           <w:rPr>
             <w:rStyle w:val="Hyperlink"/>
@@ -3568,7 +3620,7 @@
           <w:numId w:val="1001"/>
         </w:numPr>
       </w:pPr>
-      <w:hyperlink r:id="rId199">
+      <w:hyperlink r:id="rId201">
         <w:r>
           <w:rPr>
             <w:rStyle w:val="Hyperlink"/>
@@ -3585,7 +3637,7 @@
           <w:numId w:val="1001"/>
         </w:numPr>
       </w:pPr>
-      <w:hyperlink r:id="rId200">
+      <w:hyperlink r:id="rId202">
         <w:r>
           <w:rPr>
             <w:rStyle w:val="Hyperlink"/>
@@ -3602,7 +3654,7 @@
           <w:numId w:val="1001"/>
         </w:numPr>
       </w:pPr>
-      <w:hyperlink r:id="rId201">
+      <w:hyperlink r:id="rId203">
         <w:r>
           <w:rPr>
             <w:rStyle w:val="Hyperlink"/>
@@ -3625,7 +3677,7 @@
           <w:numId w:val="1001"/>
         </w:numPr>
       </w:pPr>
-      <w:hyperlink r:id="rId202">
+      <w:hyperlink r:id="rId204">
         <w:r>
           <w:rPr>
             <w:rStyle w:val="Hyperlink"/>
@@ -3648,7 +3700,7 @@
           <w:numId w:val="1001"/>
         </w:numPr>
       </w:pPr>
-      <w:hyperlink r:id="rId203">
+      <w:hyperlink r:id="rId205">
         <w:r>
           <w:rPr>
             <w:rStyle w:val="Hyperlink"/>
@@ -3665,7 +3717,7 @@
           <w:numId w:val="1001"/>
         </w:numPr>
       </w:pPr>
-      <w:hyperlink r:id="rId204">
+      <w:hyperlink r:id="rId206">
         <w:r>
           <w:rPr>
             <w:rStyle w:val="Hyperlink"/>
@@ -3682,7 +3734,7 @@
           <w:numId w:val="1001"/>
         </w:numPr>
       </w:pPr>
-      <w:hyperlink r:id="rId205">
+      <w:hyperlink r:id="rId207">
         <w:r>
           <w:rPr>
             <w:rStyle w:val="Hyperlink"/>
@@ -3699,7 +3751,7 @@
           <w:numId w:val="1001"/>
         </w:numPr>
       </w:pPr>
-      <w:hyperlink r:id="rId206">
+      <w:hyperlink r:id="rId208">
         <w:r>
           <w:rPr>
             <w:rStyle w:val="Hyperlink"/>
@@ -3716,7 +3768,7 @@
           <w:numId w:val="1001"/>
         </w:numPr>
       </w:pPr>
-      <w:hyperlink r:id="rId207">
+      <w:hyperlink r:id="rId209">
         <w:r>
           <w:rPr>
             <w:rStyle w:val="Hyperlink"/>
@@ -3733,7 +3785,7 @@
           <w:numId w:val="1001"/>
         </w:numPr>
       </w:pPr>
-      <w:hyperlink r:id="rId208">
+      <w:hyperlink r:id="rId210">
         <w:r>
           <w:rPr>
             <w:rStyle w:val="Hyperlink"/>
@@ -3750,7 +3802,7 @@
           <w:numId w:val="1001"/>
         </w:numPr>
       </w:pPr>
-      <w:hyperlink r:id="rId209">
+      <w:hyperlink r:id="rId211">
         <w:r>
           <w:rPr>
             <w:rStyle w:val="Hyperlink"/>
@@ -3767,7 +3819,7 @@
           <w:numId w:val="1001"/>
         </w:numPr>
       </w:pPr>
-      <w:hyperlink r:id="rId210">
+      <w:hyperlink r:id="rId212">
         <w:r>
           <w:rPr>
             <w:rStyle w:val="Hyperlink"/>
@@ -3790,7 +3842,7 @@
           <w:numId w:val="1001"/>
         </w:numPr>
       </w:pPr>
-      <w:hyperlink r:id="rId211">
+      <w:hyperlink r:id="rId213">
         <w:r>
           <w:rPr>
             <w:rStyle w:val="Hyperlink"/>
@@ -3807,7 +3859,7 @@
           <w:numId w:val="1001"/>
         </w:numPr>
       </w:pPr>
-      <w:hyperlink r:id="rId212">
+      <w:hyperlink r:id="rId214">
         <w:r>
           <w:rPr>
             <w:rStyle w:val="Hyperlink"/>
@@ -3824,7 +3876,7 @@
           <w:numId w:val="1001"/>
         </w:numPr>
       </w:pPr>
-      <w:hyperlink r:id="rId213">
+      <w:hyperlink r:id="rId215">
         <w:r>
           <w:rPr>
             <w:rStyle w:val="Hyperlink"/>
@@ -3847,7 +3899,7 @@
           <w:numId w:val="1001"/>
         </w:numPr>
       </w:pPr>
-      <w:hyperlink r:id="rId214">
+      <w:hyperlink r:id="rId216">
         <w:r>
           <w:rPr>
             <w:rStyle w:val="Hyperlink"/>
@@ -3864,7 +3916,7 @@
           <w:numId w:val="1001"/>
         </w:numPr>
       </w:pPr>
-      <w:hyperlink r:id="rId215">
+      <w:hyperlink r:id="rId217">
         <w:r>
           <w:rPr>
             <w:rStyle w:val="Hyperlink"/>
@@ -3881,7 +3933,7 @@
           <w:numId w:val="1001"/>
         </w:numPr>
       </w:pPr>
-      <w:hyperlink r:id="rId216">
+      <w:hyperlink r:id="rId218">
         <w:r>
           <w:rPr>
             <w:rStyle w:val="Hyperlink"/>
@@ -3898,7 +3950,7 @@
           <w:numId w:val="1001"/>
         </w:numPr>
       </w:pPr>
-      <w:hyperlink r:id="rId217">
+      <w:hyperlink r:id="rId219">
         <w:r>
           <w:rPr>
             <w:rStyle w:val="Hyperlink"/>
@@ -3915,7 +3967,7 @@
           <w:numId w:val="1001"/>
         </w:numPr>
       </w:pPr>
-      <w:hyperlink r:id="rId218">
+      <w:hyperlink r:id="rId220">
         <w:r>
           <w:rPr>
             <w:rStyle w:val="Hyperlink"/>
@@ -3932,7 +3984,7 @@
           <w:numId w:val="1001"/>
         </w:numPr>
       </w:pPr>
-      <w:hyperlink r:id="rId219">
+      <w:hyperlink r:id="rId221">
         <w:r>
           <w:rPr>
             <w:rStyle w:val="Hyperlink"/>
@@ -3949,7 +4001,7 @@
           <w:numId w:val="1001"/>
         </w:numPr>
       </w:pPr>
-      <w:hyperlink r:id="rId220">
+      <w:hyperlink r:id="rId222">
         <w:r>
           <w:rPr>
             <w:rStyle w:val="Hyperlink"/>
@@ -3966,7 +4018,7 @@
           <w:numId w:val="1001"/>
         </w:numPr>
       </w:pPr>
-      <w:hyperlink r:id="rId221">
+      <w:hyperlink r:id="rId223">
         <w:r>
           <w:rPr>
             <w:rStyle w:val="Hyperlink"/>
@@ -3989,7 +4041,7 @@
           <w:numId w:val="1001"/>
         </w:numPr>
       </w:pPr>
-      <w:hyperlink r:id="rId222">
+      <w:hyperlink r:id="rId224">
         <w:r>
           <w:rPr>
             <w:rStyle w:val="Hyperlink"/>
@@ -4006,7 +4058,7 @@
           <w:numId w:val="1001"/>
         </w:numPr>
       </w:pPr>
-      <w:hyperlink r:id="rId223">
+      <w:hyperlink r:id="rId225">
         <w:r>
           <w:rPr>
             <w:rStyle w:val="Hyperlink"/>
@@ -4023,7 +4075,7 @@
           <w:numId w:val="1001"/>
         </w:numPr>
       </w:pPr>
-      <w:hyperlink r:id="rId224">
+      <w:hyperlink r:id="rId226">
         <w:r>
           <w:rPr>
             <w:rStyle w:val="Hyperlink"/>
@@ -4040,7 +4092,7 @@
           <w:numId w:val="1001"/>
         </w:numPr>
       </w:pPr>
-      <w:hyperlink r:id="rId225">
+      <w:hyperlink r:id="rId227">
         <w:r>
           <w:rPr>
             <w:rStyle w:val="Hyperlink"/>
@@ -4057,7 +4109,7 @@
           <w:numId w:val="1001"/>
         </w:numPr>
       </w:pPr>
-      <w:hyperlink r:id="rId226">
+      <w:hyperlink r:id="rId228">
         <w:r>
           <w:rPr>
             <w:rStyle w:val="Hyperlink"/>
@@ -4084,7 +4136,7 @@
           <w:numId w:val="1001"/>
         </w:numPr>
       </w:pPr>
-      <w:hyperlink r:id="rId227">
+      <w:hyperlink r:id="rId229">
         <w:r>
           <w:rPr>
             <w:rStyle w:val="Hyperlink"/>
@@ -4101,7 +4153,7 @@
           <w:numId w:val="1001"/>
         </w:numPr>
       </w:pPr>
-      <w:hyperlink r:id="rId228">
+      <w:hyperlink r:id="rId230">
         <w:r>
           <w:rPr>
             <w:rStyle w:val="Hyperlink"/>
@@ -4118,7 +4170,7 @@
           <w:numId w:val="1001"/>
         </w:numPr>
       </w:pPr>
-      <w:hyperlink r:id="rId229">
+      <w:hyperlink r:id="rId231">
         <w:r>
           <w:rPr>
             <w:rStyle w:val="Hyperlink"/>
@@ -4135,7 +4187,7 @@
           <w:numId w:val="1001"/>
         </w:numPr>
       </w:pPr>
-      <w:hyperlink r:id="rId230">
+      <w:hyperlink r:id="rId232">
         <w:r>
           <w:rPr>
             <w:rStyle w:val="Hyperlink"/>
@@ -4152,7 +4204,7 @@
           <w:numId w:val="1001"/>
         </w:numPr>
       </w:pPr>
-      <w:hyperlink r:id="rId231">
+      <w:hyperlink r:id="rId233">
         <w:r>
           <w:rPr>
             <w:rStyle w:val="Hyperlink"/>
@@ -4175,7 +4227,7 @@
       <w:r>
         <w:t xml:space="preserve"> </w:t>
       </w:r>
-      <w:hyperlink r:id="rId232">
+      <w:hyperlink r:id="rId234">
         <w:r>
           <w:rPr>
             <w:rStyle w:val="Hyperlink"/>
@@ -4186,7 +4238,7 @@
       <w:r>
         <w:t xml:space="preserve"> </w:t>
       </w:r>
-      <w:hyperlink r:id="rId233">
+      <w:hyperlink r:id="rId235">
         <w:r>
           <w:rPr>
             <w:rStyle w:val="Hyperlink"/>
@@ -4197,7 +4249,7 @@
       <w:r>
         <w:t xml:space="preserve"> </w:t>
       </w:r>
-      <w:hyperlink r:id="rId234">
+      <w:hyperlink r:id="rId236">
         <w:r>
           <w:rPr>
             <w:rStyle w:val="Hyperlink"/>
@@ -4220,7 +4272,7 @@
           <w:numId w:val="1001"/>
         </w:numPr>
       </w:pPr>
-      <w:hyperlink r:id="rId235">
+      <w:hyperlink r:id="rId237">
         <w:r>
           <w:rPr>
             <w:rStyle w:val="Hyperlink"/>
@@ -4237,7 +4289,7 @@
           <w:numId w:val="1001"/>
         </w:numPr>
       </w:pPr>
-      <w:hyperlink r:id="rId236">
+      <w:hyperlink r:id="rId238">
         <w:r>
           <w:rPr>
             <w:rStyle w:val="Hyperlink"/>
@@ -4254,7 +4306,7 @@
           <w:numId w:val="1001"/>
         </w:numPr>
       </w:pPr>
-      <w:hyperlink r:id="rId237">
+      <w:hyperlink r:id="rId239">
         <w:r>
           <w:rPr>
             <w:rStyle w:val="Hyperlink"/>
@@ -4283,7 +4335,7 @@
           <w:numId w:val="1001"/>
         </w:numPr>
       </w:pPr>
-      <w:hyperlink r:id="rId238">
+      <w:hyperlink r:id="rId240">
         <w:r>
           <w:rPr>
             <w:rStyle w:val="Hyperlink"/>
@@ -4300,7 +4352,7 @@
           <w:numId w:val="1001"/>
         </w:numPr>
       </w:pPr>
-      <w:hyperlink r:id="rId239">
+      <w:hyperlink r:id="rId241">
         <w:r>
           <w:rPr>
             <w:rStyle w:val="Hyperlink"/>
@@ -4317,7 +4369,7 @@
           <w:numId w:val="1001"/>
         </w:numPr>
       </w:pPr>
-      <w:hyperlink r:id="rId240">
+      <w:hyperlink r:id="rId242">
         <w:r>
           <w:rPr>
             <w:rStyle w:val="Hyperlink"/>
@@ -4334,7 +4386,7 @@
           <w:numId w:val="1001"/>
         </w:numPr>
       </w:pPr>
-      <w:hyperlink r:id="rId241">
+      <w:hyperlink r:id="rId243">
         <w:r>
           <w:rPr>
             <w:rStyle w:val="Hyperlink"/>
@@ -4351,7 +4403,7 @@
           <w:numId w:val="1001"/>
         </w:numPr>
       </w:pPr>
-      <w:hyperlink r:id="rId242">
+      <w:hyperlink r:id="rId244">
         <w:r>
           <w:rPr>
             <w:rStyle w:val="Hyperlink"/>
@@ -4368,7 +4420,7 @@
           <w:numId w:val="1001"/>
         </w:numPr>
       </w:pPr>
-      <w:hyperlink r:id="rId243">
+      <w:hyperlink r:id="rId245">
         <w:r>
           <w:rPr>
             <w:rStyle w:val="Hyperlink"/>
@@ -4385,7 +4437,7 @@
           <w:numId w:val="1001"/>
         </w:numPr>
       </w:pPr>
-      <w:hyperlink r:id="rId244">
+      <w:hyperlink r:id="rId246">
         <w:r>
           <w:rPr>
             <w:rStyle w:val="Hyperlink"/>
@@ -4402,7 +4454,7 @@
           <w:numId w:val="1001"/>
         </w:numPr>
       </w:pPr>
-      <w:hyperlink r:id="rId245">
+      <w:hyperlink r:id="rId247">
         <w:r>
           <w:rPr>
             <w:rStyle w:val="Hyperlink"/>
@@ -4419,7 +4471,7 @@
           <w:numId w:val="1001"/>
         </w:numPr>
       </w:pPr>
-      <w:hyperlink r:id="rId246">
+      <w:hyperlink r:id="rId248">
         <w:r>
           <w:rPr>
             <w:rStyle w:val="Hyperlink"/>
@@ -4436,7 +4488,7 @@
           <w:numId w:val="1001"/>
         </w:numPr>
       </w:pPr>
-      <w:hyperlink r:id="rId247">
+      <w:hyperlink r:id="rId249">
         <w:r>
           <w:rPr>
             <w:rStyle w:val="Hyperlink"/>
@@ -4453,7 +4505,7 @@
           <w:numId w:val="1001"/>
         </w:numPr>
       </w:pPr>
-      <w:hyperlink r:id="rId248">
+      <w:hyperlink r:id="rId250">
         <w:r>
           <w:rPr>
             <w:rStyle w:val="Hyperlink"/>
@@ -4470,7 +4522,7 @@
           <w:numId w:val="1001"/>
         </w:numPr>
       </w:pPr>
-      <w:hyperlink r:id="rId249">
+      <w:hyperlink r:id="rId251">
         <w:r>
           <w:rPr>
             <w:rStyle w:val="Hyperlink"/>
@@ -4487,7 +4539,7 @@
           <w:numId w:val="1001"/>
         </w:numPr>
       </w:pPr>
-      <w:hyperlink r:id="rId250">
+      <w:hyperlink r:id="rId252">
         <w:r>
           <w:rPr>
             <w:rStyle w:val="Hyperlink"/>
@@ -4504,7 +4556,7 @@
           <w:numId w:val="1001"/>
         </w:numPr>
       </w:pPr>
-      <w:hyperlink r:id="rId251">
+      <w:hyperlink r:id="rId253">
         <w:r>
           <w:rPr>
             <w:rStyle w:val="Hyperlink"/>
@@ -4521,7 +4573,7 @@
           <w:numId w:val="1001"/>
         </w:numPr>
       </w:pPr>
-      <w:hyperlink r:id="rId252">
+      <w:hyperlink r:id="rId254">
         <w:r>
           <w:rPr>
             <w:rStyle w:val="Hyperlink"/>
@@ -4538,7 +4590,7 @@
           <w:numId w:val="1001"/>
         </w:numPr>
       </w:pPr>
-      <w:hyperlink r:id="rId253">
+      <w:hyperlink r:id="rId255">
         <w:r>
           <w:rPr>
             <w:rStyle w:val="Hyperlink"/>
@@ -4555,7 +4607,7 @@
           <w:numId w:val="1001"/>
         </w:numPr>
       </w:pPr>
-      <w:hyperlink r:id="rId254">
+      <w:hyperlink r:id="rId256">
         <w:r>
           <w:rPr>
             <w:rStyle w:val="Hyperlink"/>
@@ -4572,7 +4624,7 @@
           <w:numId w:val="1001"/>
         </w:numPr>
       </w:pPr>
-      <w:hyperlink r:id="rId255">
+      <w:hyperlink r:id="rId257">
         <w:r>
           <w:rPr>
             <w:rStyle w:val="Hyperlink"/>
@@ -4589,7 +4641,7 @@
           <w:numId w:val="1001"/>
         </w:numPr>
       </w:pPr>
-      <w:hyperlink r:id="rId256">
+      <w:hyperlink r:id="rId258">
         <w:r>
           <w:rPr>
             <w:rStyle w:val="Hyperlink"/>
@@ -4606,7 +4658,7 @@
           <w:numId w:val="1001"/>
         </w:numPr>
       </w:pPr>
-      <w:hyperlink r:id="rId257">
+      <w:hyperlink r:id="rId259">
         <w:r>
           <w:rPr>
             <w:rStyle w:val="Hyperlink"/>
@@ -4623,7 +4675,7 @@
           <w:numId w:val="1001"/>
         </w:numPr>
       </w:pPr>
-      <w:hyperlink r:id="rId258">
+      <w:hyperlink r:id="rId260">
         <w:r>
           <w:rPr>
             <w:rStyle w:val="Hyperlink"/>
@@ -4640,7 +4692,7 @@
           <w:numId w:val="1001"/>
         </w:numPr>
       </w:pPr>
-      <w:hyperlink r:id="rId259">
+      <w:hyperlink r:id="rId261">
         <w:r>
           <w:rPr>
             <w:rStyle w:val="Hyperlink"/>
@@ -4657,7 +4709,7 @@
           <w:numId w:val="1001"/>
         </w:numPr>
       </w:pPr>
-      <w:hyperlink r:id="rId260">
+      <w:hyperlink r:id="rId262">
         <w:r>
           <w:rPr>
             <w:rStyle w:val="Hyperlink"/>
@@ -4674,7 +4726,7 @@
           <w:numId w:val="1001"/>
         </w:numPr>
       </w:pPr>
-      <w:hyperlink r:id="rId261">
+      <w:hyperlink r:id="rId263">
         <w:r>
           <w:rPr>
             <w:rStyle w:val="Hyperlink"/>
@@ -4691,7 +4743,7 @@
           <w:numId w:val="1001"/>
         </w:numPr>
       </w:pPr>
-      <w:hyperlink r:id="rId262">
+      <w:hyperlink r:id="rId264">
         <w:r>
           <w:rPr>
             <w:rStyle w:val="Hyperlink"/>
@@ -4708,7 +4760,7 @@
           <w:numId w:val="1001"/>
         </w:numPr>
       </w:pPr>
-      <w:hyperlink r:id="rId263">
+      <w:hyperlink r:id="rId265">
         <w:r>
           <w:rPr>
             <w:rStyle w:val="Hyperlink"/>
@@ -4725,7 +4777,7 @@
           <w:numId w:val="1001"/>
         </w:numPr>
       </w:pPr>
-      <w:hyperlink r:id="rId264">
+      <w:hyperlink r:id="rId266">
         <w:r>
           <w:rPr>
             <w:rStyle w:val="Hyperlink"/>
@@ -4745,7 +4797,7 @@
       <w:r>
         <w:t xml:space="preserve">Socioeconomic Data and Applications Center (SEDAC)</w:t>
       </w:r>
-      <w:hyperlink r:id="rId265">
+      <w:hyperlink r:id="rId267">
         <w:r>
           <w:rPr>
             <w:rStyle w:val="Hyperlink"/>
@@ -4762,7 +4814,7 @@
       <w:r>
         <w:t xml:space="preserve"> </w:t>
       </w:r>
-      <w:hyperlink r:id="rId266">
+      <w:hyperlink r:id="rId268">
         <w:r>
           <w:rPr>
             <w:rStyle w:val="Hyperlink"/>
@@ -4779,7 +4831,7 @@
           <w:numId w:val="1001"/>
         </w:numPr>
       </w:pPr>
-      <w:hyperlink r:id="rId267">
+      <w:hyperlink r:id="rId269">
         <w:r>
           <w:rPr>
             <w:rStyle w:val="Hyperlink"/>
@@ -4796,7 +4848,7 @@
           <w:numId w:val="1001"/>
         </w:numPr>
       </w:pPr>
-      <w:hyperlink r:id="rId268">
+      <w:hyperlink r:id="rId270">
         <w:r>
           <w:rPr>
             <w:rStyle w:val="Hyperlink"/>
@@ -4813,7 +4865,7 @@
           <w:numId w:val="1001"/>
         </w:numPr>
       </w:pPr>
-      <w:hyperlink r:id="rId269">
+      <w:hyperlink r:id="rId271">
         <w:r>
           <w:rPr>
             <w:rStyle w:val="Hyperlink"/>
@@ -4830,7 +4882,7 @@
           <w:numId w:val="1001"/>
         </w:numPr>
       </w:pPr>
-      <w:hyperlink r:id="rId270">
+      <w:hyperlink r:id="rId272">
         <w:r>
           <w:rPr>
             <w:rStyle w:val="Hyperlink"/>
@@ -4847,7 +4899,7 @@
           <w:numId w:val="1001"/>
         </w:numPr>
       </w:pPr>
-      <w:hyperlink r:id="rId271">
+      <w:hyperlink r:id="rId273">
         <w:r>
           <w:rPr>
             <w:rStyle w:val="Hyperlink"/>
@@ -4864,7 +4916,7 @@
           <w:numId w:val="1001"/>
         </w:numPr>
       </w:pPr>
-      <w:hyperlink r:id="rId272">
+      <w:hyperlink r:id="rId274">
         <w:r>
           <w:rPr>
             <w:rStyle w:val="Hyperlink"/>
@@ -4881,7 +4933,7 @@
           <w:numId w:val="1001"/>
         </w:numPr>
       </w:pPr>
-      <w:hyperlink r:id="rId273">
+      <w:hyperlink r:id="rId275">
         <w:r>
           <w:rPr>
             <w:rStyle w:val="Hyperlink"/>
@@ -4898,7 +4950,7 @@
           <w:numId w:val="1001"/>
         </w:numPr>
       </w:pPr>
-      <w:hyperlink r:id="rId274">
+      <w:hyperlink r:id="rId276">
         <w:r>
           <w:rPr>
             <w:rStyle w:val="Hyperlink"/>
@@ -4921,7 +4973,7 @@
           <w:numId w:val="1001"/>
         </w:numPr>
       </w:pPr>
-      <w:hyperlink r:id="rId275">
+      <w:hyperlink r:id="rId277">
         <w:r>
           <w:rPr>
             <w:rStyle w:val="Hyperlink"/>
@@ -4938,7 +4990,7 @@
           <w:numId w:val="1001"/>
         </w:numPr>
       </w:pPr>
-      <w:hyperlink r:id="rId276">
+      <w:hyperlink r:id="rId278">
         <w:r>
           <w:rPr>
             <w:rStyle w:val="Hyperlink"/>
@@ -4955,7 +5007,7 @@
           <w:numId w:val="1001"/>
         </w:numPr>
       </w:pPr>
-      <w:hyperlink r:id="rId277">
+      <w:hyperlink r:id="rId279">
         <w:r>
           <w:rPr>
             <w:rStyle w:val="Hyperlink"/>
@@ -4972,7 +5024,7 @@
           <w:numId w:val="1001"/>
         </w:numPr>
       </w:pPr>
-      <w:hyperlink r:id="rId278">
+      <w:hyperlink r:id="rId280">
         <w:r>
           <w:rPr>
             <w:rStyle w:val="Hyperlink"/>
@@ -4995,7 +5047,7 @@
           <w:numId w:val="1001"/>
         </w:numPr>
       </w:pPr>
-      <w:hyperlink r:id="rId279">
+      <w:hyperlink r:id="rId281">
         <w:r>
           <w:rPr>
             <w:rStyle w:val="Hyperlink"/>
@@ -5012,7 +5064,7 @@
           <w:numId w:val="1001"/>
         </w:numPr>
       </w:pPr>
-      <w:hyperlink r:id="rId280">
+      <w:hyperlink r:id="rId282">
         <w:r>
           <w:rPr>
             <w:rStyle w:val="Hyperlink"/>
@@ -5029,7 +5081,7 @@
           <w:numId w:val="1001"/>
         </w:numPr>
       </w:pPr>
-      <w:hyperlink r:id="rId281">
+      <w:hyperlink r:id="rId283">
         <w:r>
           <w:rPr>
             <w:rStyle w:val="Hyperlink"/>
@@ -5046,7 +5098,7 @@
           <w:numId w:val="1001"/>
         </w:numPr>
       </w:pPr>
-      <w:hyperlink r:id="rId282">
+      <w:hyperlink r:id="rId284">
         <w:r>
           <w:rPr>
             <w:rStyle w:val="Hyperlink"/>
@@ -5063,7 +5115,7 @@
           <w:numId w:val="1001"/>
         </w:numPr>
       </w:pPr>
-      <w:hyperlink r:id="rId283">
+      <w:hyperlink r:id="rId285">
         <w:r>
           <w:rPr>
             <w:rStyle w:val="Hyperlink"/>
@@ -5080,7 +5132,7 @@
           <w:numId w:val="1001"/>
         </w:numPr>
       </w:pPr>
-      <w:hyperlink r:id="rId284">
+      <w:hyperlink r:id="rId286">
         <w:r>
           <w:rPr>
             <w:rStyle w:val="Hyperlink"/>
@@ -5097,7 +5149,7 @@
           <w:numId w:val="1001"/>
         </w:numPr>
       </w:pPr>
-      <w:hyperlink r:id="rId285">
+      <w:hyperlink r:id="rId287">
         <w:r>
           <w:rPr>
             <w:rStyle w:val="Hyperlink"/>
@@ -5114,7 +5166,7 @@
           <w:numId w:val="1001"/>
         </w:numPr>
       </w:pPr>
-      <w:hyperlink r:id="rId286">
+      <w:hyperlink r:id="rId288">
         <w:r>
           <w:rPr>
             <w:rStyle w:val="Hyperlink"/>
@@ -5131,7 +5183,7 @@
           <w:numId w:val="1001"/>
         </w:numPr>
       </w:pPr>
-      <w:hyperlink r:id="rId287">
+      <w:hyperlink r:id="rId289">
         <w:r>
           <w:rPr>
             <w:rStyle w:val="Hyperlink"/>
@@ -5148,7 +5200,7 @@
           <w:numId w:val="1001"/>
         </w:numPr>
       </w:pPr>
-      <w:hyperlink r:id="rId288">
+      <w:hyperlink r:id="rId290">
         <w:r>
           <w:rPr>
             <w:rStyle w:val="Hyperlink"/>
@@ -5165,7 +5217,7 @@
           <w:numId w:val="1001"/>
         </w:numPr>
       </w:pPr>
-      <w:hyperlink r:id="rId289">
+      <w:hyperlink r:id="rId291">
         <w:r>
           <w:rPr>
             <w:rStyle w:val="Hyperlink"/>
@@ -5182,7 +5234,7 @@
           <w:numId w:val="1001"/>
         </w:numPr>
       </w:pPr>
-      <w:hyperlink r:id="rId290">
+      <w:hyperlink r:id="rId292">
         <w:r>
           <w:rPr>
             <w:rStyle w:val="Hyperlink"/>
@@ -5199,7 +5251,7 @@
           <w:numId w:val="1001"/>
         </w:numPr>
       </w:pPr>
-      <w:hyperlink r:id="rId291">
+      <w:hyperlink r:id="rId293">
         <w:r>
           <w:rPr>
             <w:rStyle w:val="Hyperlink"/>
@@ -5216,7 +5268,7 @@
           <w:numId w:val="1001"/>
         </w:numPr>
       </w:pPr>
-      <w:hyperlink r:id="rId292">
+      <w:hyperlink r:id="rId294">
         <w:r>
           <w:rPr>
             <w:rStyle w:val="Hyperlink"/>
@@ -5233,7 +5285,7 @@
           <w:numId w:val="1001"/>
         </w:numPr>
       </w:pPr>
-      <w:hyperlink r:id="rId293">
+      <w:hyperlink r:id="rId295">
         <w:r>
           <w:rPr>
             <w:rStyle w:val="Hyperlink"/>
@@ -5250,7 +5302,7 @@
           <w:numId w:val="1001"/>
         </w:numPr>
       </w:pPr>
-      <w:hyperlink r:id="rId294">
+      <w:hyperlink r:id="rId296">
         <w:r>
           <w:rPr>
             <w:rStyle w:val="Hyperlink"/>
@@ -5267,7 +5319,7 @@
           <w:numId w:val="1001"/>
         </w:numPr>
       </w:pPr>
-      <w:hyperlink r:id="rId295">
+      <w:hyperlink r:id="rId297">
         <w:r>
           <w:rPr>
             <w:rStyle w:val="Hyperlink"/>
@@ -5284,7 +5336,7 @@
           <w:numId w:val="1001"/>
         </w:numPr>
       </w:pPr>
-      <w:hyperlink r:id="rId296">
+      <w:hyperlink r:id="rId298">
         <w:r>
           <w:rPr>
             <w:rStyle w:val="Hyperlink"/>
@@ -5301,7 +5353,7 @@
           <w:numId w:val="1001"/>
         </w:numPr>
       </w:pPr>
-      <w:hyperlink r:id="rId297">
+      <w:hyperlink r:id="rId299">
         <w:r>
           <w:rPr>
             <w:rStyle w:val="Hyperlink"/>
@@ -5318,7 +5370,7 @@
           <w:numId w:val="1001"/>
         </w:numPr>
       </w:pPr>
-      <w:hyperlink r:id="rId298">
+      <w:hyperlink r:id="rId300">
         <w:r>
           <w:rPr>
             <w:rStyle w:val="Hyperlink"/>
@@ -5335,7 +5387,7 @@
           <w:numId w:val="1001"/>
         </w:numPr>
       </w:pPr>
-      <w:hyperlink r:id="rId299">
+      <w:hyperlink r:id="rId301">
         <w:r>
           <w:rPr>
             <w:rStyle w:val="Hyperlink"/>
@@ -5352,7 +5404,7 @@
           <w:numId w:val="1001"/>
         </w:numPr>
       </w:pPr>
-      <w:hyperlink r:id="rId300">
+      <w:hyperlink r:id="rId302">
         <w:r>
           <w:rPr>
             <w:rStyle w:val="Hyperlink"/>
@@ -5369,7 +5421,7 @@
           <w:numId w:val="1001"/>
         </w:numPr>
       </w:pPr>
-      <w:hyperlink r:id="rId301">
+      <w:hyperlink r:id="rId303">
         <w:r>
           <w:rPr>
             <w:rStyle w:val="Hyperlink"/>
@@ -5386,7 +5438,7 @@
           <w:numId w:val="1001"/>
         </w:numPr>
       </w:pPr>
-      <w:hyperlink r:id="rId302">
+      <w:hyperlink r:id="rId304">
         <w:r>
           <w:rPr>
             <w:rStyle w:val="Hyperlink"/>
@@ -5403,7 +5455,7 @@
           <w:numId w:val="1001"/>
         </w:numPr>
       </w:pPr>
-      <w:hyperlink r:id="rId303">
+      <w:hyperlink r:id="rId305">
         <w:r>
           <w:rPr>
             <w:rStyle w:val="Hyperlink"/>
@@ -5420,7 +5472,7 @@
           <w:numId w:val="1001"/>
         </w:numPr>
       </w:pPr>
-      <w:hyperlink r:id="rId304">
+      <w:hyperlink r:id="rId306">
         <w:r>
           <w:rPr>
             <w:rStyle w:val="Hyperlink"/>
@@ -5437,7 +5489,7 @@
           <w:numId w:val="1001"/>
         </w:numPr>
       </w:pPr>
-      <w:hyperlink r:id="rId305">
+      <w:hyperlink r:id="rId307">
         <w:r>
           <w:rPr>
             <w:rStyle w:val="Hyperlink"/>
@@ -5460,7 +5512,7 @@
           <w:numId w:val="1001"/>
         </w:numPr>
       </w:pPr>
-      <w:hyperlink r:id="rId306">
+      <w:hyperlink r:id="rId308">
         <w:r>
           <w:rPr>
             <w:rStyle w:val="Hyperlink"/>
@@ -5483,7 +5535,7 @@
           <w:numId w:val="1001"/>
         </w:numPr>
       </w:pPr>
-      <w:hyperlink r:id="rId307">
+      <w:hyperlink r:id="rId309">
         <w:r>
           <w:rPr>
             <w:rStyle w:val="Hyperlink"/>
@@ -5500,7 +5552,7 @@
           <w:numId w:val="1001"/>
         </w:numPr>
       </w:pPr>
-      <w:hyperlink r:id="rId308">
+      <w:hyperlink r:id="rId310">
         <w:r>
           <w:rPr>
             <w:rStyle w:val="Hyperlink"/>
@@ -5517,7 +5569,7 @@
           <w:numId w:val="1001"/>
         </w:numPr>
       </w:pPr>
-      <w:hyperlink r:id="rId309">
+      <w:hyperlink r:id="rId311">
         <w:r>
           <w:rPr>
             <w:rStyle w:val="Hyperlink"/>
@@ -5537,7 +5589,7 @@
       <w:r>
         <w:t xml:space="preserve">WorldCereal open global harmonized reference data repository [Data]](</w:t>
       </w:r>
-      <w:hyperlink r:id="rId310">
+      <w:hyperlink r:id="rId312">
         <w:r>
           <w:rPr>
             <w:rStyle w:val="Hyperlink"/>
@@ -5551,7 +5603,7 @@
       <w:r>
         <w:t xml:space="preserve"> </w:t>
       </w:r>
-      <w:hyperlink r:id="rId311">
+      <w:hyperlink r:id="rId313">
         <w:r>
           <w:rPr>
             <w:rStyle w:val="Hyperlink"/>
@@ -5568,7 +5620,7 @@
           <w:numId w:val="1001"/>
         </w:numPr>
       </w:pPr>
-      <w:hyperlink r:id="rId312">
+      <w:hyperlink r:id="rId314">
         <w:r>
           <w:rPr>
             <w:rStyle w:val="Hyperlink"/>
@@ -5585,7 +5637,7 @@
       <w:r>
         <w:t xml:space="preserve"> </w:t>
       </w:r>
-      <w:hyperlink r:id="rId313">
+      <w:hyperlink r:id="rId315">
         <w:r>
           <w:rPr>
             <w:rStyle w:val="Hyperlink"/>
@@ -5602,7 +5654,7 @@
           <w:numId w:val="1001"/>
         </w:numPr>
       </w:pPr>
-      <w:hyperlink r:id="rId314">
+      <w:hyperlink r:id="rId316">
         <w:r>
           <w:rPr>
             <w:rStyle w:val="Hyperlink"/>
@@ -5619,7 +5671,7 @@
           <w:numId w:val="1001"/>
         </w:numPr>
       </w:pPr>
-      <w:hyperlink r:id="rId315">
+      <w:hyperlink r:id="rId317">
         <w:r>
           <w:rPr>
             <w:rStyle w:val="Hyperlink"/>
@@ -5642,7 +5694,7 @@
       <w:r>
         <w:t xml:space="preserve"> </w:t>
       </w:r>
-      <w:hyperlink r:id="rId316">
+      <w:hyperlink r:id="rId318">
         <w:r>
           <w:rPr>
             <w:rStyle w:val="Hyperlink"/>
@@ -5659,7 +5711,7 @@
       <w:r>
         <w:t xml:space="preserve"> </w:t>
       </w:r>
-      <w:hyperlink r:id="rId317">
+      <w:hyperlink r:id="rId319">
         <w:r>
           <w:rPr>
             <w:rStyle w:val="Hyperlink"/>
@@ -5682,7 +5734,7 @@
       <w:r>
         <w:t xml:space="preserve"> </w:t>
       </w:r>
-      <w:hyperlink r:id="rId318">
+      <w:hyperlink r:id="rId320">
         <w:r>
           <w:rPr>
             <w:rStyle w:val="Hyperlink"/>
@@ -5693,7 +5745,7 @@
       <w:r>
         <w:t xml:space="preserve"> </w:t>
       </w:r>
-      <w:hyperlink r:id="rId319">
+      <w:hyperlink r:id="rId321">
         <w:r>
           <w:rPr>
             <w:rStyle w:val="Hyperlink"/>
@@ -5713,7 +5765,7 @@
       <w:r>
         <w:t xml:space="preserve">Facebook Neural-Code-Search-Evaluation-Dataset [dataset]](</w:t>
       </w:r>
-      <w:hyperlink r:id="rId320">
+      <w:hyperlink r:id="rId322">
         <w:r>
           <w:rPr>
             <w:rStyle w:val="Hyperlink"/>
@@ -5727,7 +5779,7 @@
       <w:r>
         <w:t xml:space="preserve"> </w:t>
       </w:r>
-      <w:hyperlink r:id="rId321">
+      <w:hyperlink r:id="rId323">
         <w:r>
           <w:rPr>
             <w:rStyle w:val="Hyperlink"/>
@@ -5750,7 +5802,7 @@
       <w:r>
         <w:t xml:space="preserve"> </w:t>
       </w:r>
-      <w:hyperlink r:id="rId322">
+      <w:hyperlink r:id="rId324">
         <w:r>
           <w:rPr>
             <w:rStyle w:val="Hyperlink"/>
@@ -5767,7 +5819,7 @@
       <w:r>
         <w:t xml:space="preserve"> </w:t>
       </w:r>
-      <w:hyperlink r:id="rId323">
+      <w:hyperlink r:id="rId325">
         <w:r>
           <w:rPr>
             <w:rStyle w:val="Hyperlink"/>
@@ -5790,7 +5842,7 @@
       <w:r>
         <w:t xml:space="preserve"> </w:t>
       </w:r>
-      <w:hyperlink r:id="rId324">
+      <w:hyperlink r:id="rId326">
         <w:r>
           <w:rPr>
             <w:rStyle w:val="Hyperlink"/>
@@ -5807,7 +5859,7 @@
       <w:r>
         <w:t xml:space="preserve"> </w:t>
       </w:r>
-      <w:hyperlink r:id="rId325">
+      <w:hyperlink r:id="rId327">
         <w:r>
           <w:rPr>
             <w:rStyle w:val="Hyperlink"/>
@@ -5830,7 +5882,7 @@
       <w:r>
         <w:t xml:space="preserve"> </w:t>
       </w:r>
-      <w:hyperlink r:id="rId326">
+      <w:hyperlink r:id="rId328">
         <w:r>
           <w:rPr>
             <w:rStyle w:val="Hyperlink"/>
@@ -5847,7 +5899,7 @@
       <w:r>
         <w:t xml:space="preserve"> </w:t>
       </w:r>
-      <w:hyperlink r:id="rId327">
+      <w:hyperlink r:id="rId329">
         <w:r>
           <w:rPr>
             <w:rStyle w:val="Hyperlink"/>
@@ -5864,7 +5916,7 @@
           <w:numId w:val="1001"/>
         </w:numPr>
       </w:pPr>
-      <w:hyperlink r:id="rId328">
+      <w:hyperlink r:id="rId330">
         <w:r>
           <w:rPr>
             <w:rStyle w:val="Hyperlink"/>
@@ -5887,7 +5939,7 @@
       <w:r>
         <w:t xml:space="preserve"> </w:t>
       </w:r>
-      <w:hyperlink r:id="rId329">
+      <w:hyperlink r:id="rId331">
         <w:r>
           <w:rPr>
             <w:rStyle w:val="Hyperlink"/>
@@ -5904,7 +5956,7 @@
       <w:r>
         <w:t xml:space="preserve"> </w:t>
       </w:r>
-      <w:hyperlink r:id="rId330">
+      <w:hyperlink r:id="rId332">
         <w:r>
           <w:rPr>
             <w:rStyle w:val="Hyperlink"/>
@@ -5927,7 +5979,7 @@
       <w:r>
         <w:t xml:space="preserve"> </w:t>
       </w:r>
-      <w:hyperlink r:id="rId331">
+      <w:hyperlink r:id="rId333">
         <w:r>
           <w:rPr>
             <w:rStyle w:val="Hyperlink"/>
@@ -5944,7 +5996,7 @@
       <w:r>
         <w:t xml:space="preserve"> </w:t>
       </w:r>
-      <w:hyperlink r:id="rId332">
+      <w:hyperlink r:id="rId334">
         <w:r>
           <w:rPr>
             <w:rStyle w:val="Hyperlink"/>
@@ -5967,7 +6019,7 @@
       <w:r>
         <w:t xml:space="preserve"> </w:t>
       </w:r>
-      <w:hyperlink r:id="rId333">
+      <w:hyperlink r:id="rId335">
         <w:r>
           <w:rPr>
             <w:rStyle w:val="Hyperlink"/>
@@ -5978,7 +6030,7 @@
       <w:r>
         <w:t xml:space="preserve"> </w:t>
       </w:r>
-      <w:hyperlink r:id="rId334">
+      <w:hyperlink r:id="rId336">
         <w:r>
           <w:rPr>
             <w:rStyle w:val="Hyperlink"/>
@@ -6001,7 +6053,7 @@
       <w:r>
         <w:t xml:space="preserve"> </w:t>
       </w:r>
-      <w:hyperlink r:id="rId335">
+      <w:hyperlink r:id="rId337">
         <w:r>
           <w:rPr>
             <w:rStyle w:val="Hyperlink"/>
@@ -6018,7 +6070,7 @@
       <w:r>
         <w:t xml:space="preserve"> </w:t>
       </w:r>
-      <w:hyperlink r:id="rId336">
+      <w:hyperlink r:id="rId338">
         <w:r>
           <w:rPr>
             <w:rStyle w:val="Hyperlink"/>
@@ -6027,8 +6079,8 @@
         </w:r>
       </w:hyperlink>
     </w:p>
-    <w:bookmarkEnd w:id="337"/>
-    <w:bookmarkStart w:id="455" w:name="otras-referencias-interesantes"/>
+    <w:bookmarkEnd w:id="339"/>
+    <w:bookmarkStart w:id="457" w:name="otras-referencias-interesantes"/>
     <w:p>
       <w:pPr>
         <w:pStyle w:val="Heading2"/>
@@ -6045,7 +6097,7 @@
           <w:numId w:val="1002"/>
         </w:numPr>
       </w:pPr>
-      <w:hyperlink r:id="rId338">
+      <w:hyperlink r:id="rId340">
         <w:r>
           <w:rPr>
             <w:rStyle w:val="Hyperlink"/>
@@ -6062,7 +6114,7 @@
           <w:numId w:val="1002"/>
         </w:numPr>
       </w:pPr>
-      <w:hyperlink r:id="rId339">
+      <w:hyperlink r:id="rId341">
         <w:r>
           <w:rPr>
             <w:rStyle w:val="Hyperlink"/>
@@ -6079,7 +6131,7 @@
           <w:numId w:val="1002"/>
         </w:numPr>
       </w:pPr>
-      <w:hyperlink r:id="rId340">
+      <w:hyperlink r:id="rId342">
         <w:r>
           <w:rPr>
             <w:rStyle w:val="Hyperlink"/>
@@ -6096,7 +6148,7 @@
           <w:numId w:val="1002"/>
         </w:numPr>
       </w:pPr>
-      <w:hyperlink r:id="rId341">
+      <w:hyperlink r:id="rId343">
         <w:r>
           <w:rPr>
             <w:rStyle w:val="Hyperlink"/>
@@ -6113,7 +6165,7 @@
           <w:numId w:val="1002"/>
         </w:numPr>
       </w:pPr>
-      <w:hyperlink r:id="rId342">
+      <w:hyperlink r:id="rId344">
         <w:r>
           <w:rPr>
             <w:rStyle w:val="Hyperlink"/>
@@ -6130,7 +6182,7 @@
           <w:numId w:val="1002"/>
         </w:numPr>
       </w:pPr>
-      <w:hyperlink r:id="rId343">
+      <w:hyperlink r:id="rId345">
         <w:r>
           <w:rPr>
             <w:rStyle w:val="Hyperlink"/>
@@ -6147,7 +6199,7 @@
           <w:numId w:val="1002"/>
         </w:numPr>
       </w:pPr>
-      <w:hyperlink r:id="rId344">
+      <w:hyperlink r:id="rId346">
         <w:r>
           <w:rPr>
             <w:rStyle w:val="Hyperlink"/>
@@ -6164,7 +6216,7 @@
           <w:numId w:val="1002"/>
         </w:numPr>
       </w:pPr>
-      <w:hyperlink r:id="rId345">
+      <w:hyperlink r:id="rId347">
         <w:r>
           <w:rPr>
             <w:rStyle w:val="Hyperlink"/>
@@ -6181,7 +6233,7 @@
           <w:numId w:val="1002"/>
         </w:numPr>
       </w:pPr>
-      <w:hyperlink r:id="rId346">
+      <w:hyperlink r:id="rId348">
         <w:r>
           <w:rPr>
             <w:rStyle w:val="Hyperlink"/>
@@ -6198,7 +6250,7 @@
           <w:numId w:val="1002"/>
         </w:numPr>
       </w:pPr>
-      <w:hyperlink r:id="rId347">
+      <w:hyperlink r:id="rId349">
         <w:r>
           <w:rPr>
             <w:rStyle w:val="Hyperlink"/>
@@ -6215,7 +6267,7 @@
           <w:numId w:val="1002"/>
         </w:numPr>
       </w:pPr>
-      <w:hyperlink r:id="rId348">
+      <w:hyperlink r:id="rId350">
         <w:r>
           <w:rPr>
             <w:rStyle w:val="Hyperlink"/>
@@ -6232,7 +6284,7 @@
           <w:numId w:val="1002"/>
         </w:numPr>
       </w:pPr>
-      <w:hyperlink r:id="rId349">
+      <w:hyperlink r:id="rId351">
         <w:r>
           <w:rPr>
             <w:rStyle w:val="Hyperlink"/>
@@ -6249,7 +6301,7 @@
           <w:numId w:val="1002"/>
         </w:numPr>
       </w:pPr>
-      <w:hyperlink r:id="rId350">
+      <w:hyperlink r:id="rId352">
         <w:r>
           <w:rPr>
             <w:rStyle w:val="Hyperlink"/>
@@ -6266,7 +6318,7 @@
       <w:r>
         <w:t xml:space="preserve"> </w:t>
       </w:r>
-      <w:hyperlink r:id="rId351">
+      <w:hyperlink r:id="rId353">
         <w:r>
           <w:rPr>
             <w:rStyle w:val="Hyperlink"/>
@@ -6283,7 +6335,7 @@
           <w:numId w:val="1002"/>
         </w:numPr>
       </w:pPr>
-      <w:hyperlink r:id="rId352">
+      <w:hyperlink r:id="rId354">
         <w:r>
           <w:rPr>
             <w:rStyle w:val="Hyperlink"/>
@@ -6303,7 +6355,7 @@
           <w:numId w:val="1002"/>
         </w:numPr>
       </w:pPr>
-      <w:hyperlink r:id="rId353">
+      <w:hyperlink r:id="rId355">
         <w:r>
           <w:rPr>
             <w:rStyle w:val="Hyperlink"/>
@@ -6320,7 +6372,7 @@
           <w:numId w:val="1002"/>
         </w:numPr>
       </w:pPr>
-      <w:hyperlink r:id="rId354">
+      <w:hyperlink r:id="rId356">
         <w:r>
           <w:rPr>
             <w:rStyle w:val="Hyperlink"/>
@@ -6337,7 +6389,7 @@
           <w:numId w:val="1002"/>
         </w:numPr>
       </w:pPr>
-      <w:hyperlink r:id="rId355">
+      <w:hyperlink r:id="rId357">
         <w:r>
           <w:rPr>
             <w:rStyle w:val="Hyperlink"/>
@@ -6354,7 +6406,7 @@
           <w:numId w:val="1002"/>
         </w:numPr>
       </w:pPr>
-      <w:hyperlink r:id="rId356">
+      <w:hyperlink r:id="rId358">
         <w:r>
           <w:rPr>
             <w:rStyle w:val="Hyperlink"/>
@@ -6371,7 +6423,7 @@
           <w:numId w:val="1002"/>
         </w:numPr>
       </w:pPr>
-      <w:hyperlink r:id="rId357">
+      <w:hyperlink r:id="rId359">
         <w:r>
           <w:rPr>
             <w:rStyle w:val="Hyperlink"/>
@@ -6388,7 +6440,7 @@
           <w:numId w:val="1002"/>
         </w:numPr>
       </w:pPr>
-      <w:hyperlink r:id="rId358">
+      <w:hyperlink r:id="rId360">
         <w:r>
           <w:rPr>
             <w:rStyle w:val="Hyperlink"/>
@@ -6405,7 +6457,7 @@
           <w:numId w:val="1002"/>
         </w:numPr>
       </w:pPr>
-      <w:hyperlink r:id="rId359">
+      <w:hyperlink r:id="rId361">
         <w:r>
           <w:rPr>
             <w:rStyle w:val="Hyperlink"/>
@@ -6422,7 +6474,7 @@
           <w:numId w:val="1002"/>
         </w:numPr>
       </w:pPr>
-      <w:hyperlink r:id="rId360">
+      <w:hyperlink r:id="rId362">
         <w:r>
           <w:rPr>
             <w:rStyle w:val="Hyperlink"/>
@@ -6439,7 +6491,7 @@
           <w:numId w:val="1002"/>
         </w:numPr>
       </w:pPr>
-      <w:hyperlink r:id="rId361">
+      <w:hyperlink r:id="rId363">
         <w:r>
           <w:rPr>
             <w:rStyle w:val="Hyperlink"/>
@@ -6456,7 +6508,7 @@
           <w:numId w:val="1002"/>
         </w:numPr>
       </w:pPr>
-      <w:hyperlink r:id="rId362">
+      <w:hyperlink r:id="rId364">
         <w:r>
           <w:rPr>
             <w:rStyle w:val="Hyperlink"/>
@@ -6473,7 +6525,7 @@
           <w:numId w:val="1002"/>
         </w:numPr>
       </w:pPr>
-      <w:hyperlink r:id="rId363">
+      <w:hyperlink r:id="rId365">
         <w:r>
           <w:rPr>
             <w:rStyle w:val="Hyperlink"/>
@@ -6490,7 +6542,7 @@
           <w:numId w:val="1002"/>
         </w:numPr>
       </w:pPr>
-      <w:hyperlink r:id="rId364">
+      <w:hyperlink r:id="rId366">
         <w:r>
           <w:rPr>
             <w:rStyle w:val="Hyperlink"/>
@@ -6507,7 +6559,7 @@
           <w:numId w:val="1002"/>
         </w:numPr>
       </w:pPr>
-      <w:hyperlink r:id="rId365">
+      <w:hyperlink r:id="rId367">
         <w:r>
           <w:rPr>
             <w:rStyle w:val="Hyperlink"/>
@@ -6524,7 +6576,7 @@
           <w:numId w:val="1002"/>
         </w:numPr>
       </w:pPr>
-      <w:hyperlink r:id="rId366">
+      <w:hyperlink r:id="rId368">
         <w:r>
           <w:rPr>
             <w:rStyle w:val="Hyperlink"/>
@@ -6541,7 +6593,7 @@
           <w:numId w:val="1002"/>
         </w:numPr>
       </w:pPr>
-      <w:hyperlink r:id="rId367">
+      <w:hyperlink r:id="rId369">
         <w:r>
           <w:rPr>
             <w:rStyle w:val="Hyperlink"/>
@@ -6558,7 +6610,7 @@
           <w:numId w:val="1002"/>
         </w:numPr>
       </w:pPr>
-      <w:hyperlink r:id="rId368">
+      <w:hyperlink r:id="rId370">
         <w:r>
           <w:rPr>
             <w:rStyle w:val="Hyperlink"/>
@@ -6575,7 +6627,7 @@
           <w:numId w:val="1002"/>
         </w:numPr>
       </w:pPr>
-      <w:hyperlink r:id="rId369">
+      <w:hyperlink r:id="rId371">
         <w:r>
           <w:rPr>
             <w:rStyle w:val="Hyperlink"/>
@@ -6592,7 +6644,7 @@
           <w:numId w:val="1002"/>
         </w:numPr>
       </w:pPr>
-      <w:hyperlink r:id="rId370">
+      <w:hyperlink r:id="rId372">
         <w:r>
           <w:rPr>
             <w:rStyle w:val="Hyperlink"/>
@@ -6609,7 +6661,7 @@
           <w:numId w:val="1002"/>
         </w:numPr>
       </w:pPr>
-      <w:hyperlink r:id="rId371">
+      <w:hyperlink r:id="rId373">
         <w:r>
           <w:rPr>
             <w:rStyle w:val="Hyperlink"/>
@@ -6626,7 +6678,7 @@
           <w:numId w:val="1002"/>
         </w:numPr>
       </w:pPr>
-      <w:hyperlink r:id="rId372">
+      <w:hyperlink r:id="rId374">
         <w:r>
           <w:rPr>
             <w:rStyle w:val="Hyperlink"/>
@@ -6643,7 +6695,7 @@
           <w:numId w:val="1002"/>
         </w:numPr>
       </w:pPr>
-      <w:hyperlink r:id="rId373">
+      <w:hyperlink r:id="rId375">
         <w:r>
           <w:rPr>
             <w:rStyle w:val="Hyperlink"/>
@@ -6660,7 +6712,7 @@
           <w:numId w:val="1002"/>
         </w:numPr>
       </w:pPr>
-      <w:hyperlink r:id="rId374">
+      <w:hyperlink r:id="rId376">
         <w:r>
           <w:rPr>
             <w:rStyle w:val="Hyperlink"/>
@@ -6677,7 +6729,7 @@
           <w:numId w:val="1002"/>
         </w:numPr>
       </w:pPr>
-      <w:hyperlink r:id="rId375">
+      <w:hyperlink r:id="rId377">
         <w:r>
           <w:rPr>
             <w:rStyle w:val="Hyperlink"/>
@@ -6694,7 +6746,7 @@
           <w:numId w:val="1002"/>
         </w:numPr>
       </w:pPr>
-      <w:hyperlink r:id="rId376">
+      <w:hyperlink r:id="rId378">
         <w:r>
           <w:rPr>
             <w:rStyle w:val="Hyperlink"/>
@@ -6711,7 +6763,7 @@
           <w:numId w:val="1002"/>
         </w:numPr>
       </w:pPr>
-      <w:hyperlink r:id="rId377">
+      <w:hyperlink r:id="rId379">
         <w:r>
           <w:rPr>
             <w:rStyle w:val="Hyperlink"/>
@@ -6728,7 +6780,7 @@
           <w:numId w:val="1002"/>
         </w:numPr>
       </w:pPr>
-      <w:hyperlink r:id="rId378">
+      <w:hyperlink r:id="rId380">
         <w:r>
           <w:rPr>
             <w:rStyle w:val="Hyperlink"/>
@@ -6745,7 +6797,7 @@
           <w:numId w:val="1002"/>
         </w:numPr>
       </w:pPr>
-      <w:hyperlink r:id="rId379">
+      <w:hyperlink r:id="rId381">
         <w:r>
           <w:rPr>
             <w:rStyle w:val="Hyperlink"/>
@@ -6762,7 +6814,7 @@
           <w:numId w:val="1002"/>
         </w:numPr>
       </w:pPr>
-      <w:hyperlink r:id="rId380">
+      <w:hyperlink r:id="rId382">
         <w:r>
           <w:rPr>
             <w:rStyle w:val="Hyperlink"/>
@@ -6779,7 +6831,7 @@
           <w:numId w:val="1002"/>
         </w:numPr>
       </w:pPr>
-      <w:hyperlink r:id="rId381">
+      <w:hyperlink r:id="rId383">
         <w:r>
           <w:rPr>
             <w:rStyle w:val="Hyperlink"/>
@@ -6796,7 +6848,7 @@
           <w:numId w:val="1002"/>
         </w:numPr>
       </w:pPr>
-      <w:hyperlink r:id="rId382">
+      <w:hyperlink r:id="rId384">
         <w:r>
           <w:rPr>
             <w:rStyle w:val="Hyperlink"/>
@@ -6813,7 +6865,7 @@
           <w:numId w:val="1002"/>
         </w:numPr>
       </w:pPr>
-      <w:hyperlink r:id="rId383">
+      <w:hyperlink r:id="rId385">
         <w:r>
           <w:rPr>
             <w:rStyle w:val="Hyperlink"/>
@@ -6830,7 +6882,7 @@
           <w:numId w:val="1002"/>
         </w:numPr>
       </w:pPr>
-      <w:hyperlink r:id="rId384">
+      <w:hyperlink r:id="rId386">
         <w:r>
           <w:rPr>
             <w:rStyle w:val="Hyperlink"/>
@@ -6847,7 +6899,7 @@
           <w:numId w:val="1002"/>
         </w:numPr>
       </w:pPr>
-      <w:hyperlink r:id="rId385">
+      <w:hyperlink r:id="rId387">
         <w:r>
           <w:rPr>
             <w:rStyle w:val="Hyperlink"/>
@@ -6864,7 +6916,7 @@
           <w:numId w:val="1002"/>
         </w:numPr>
       </w:pPr>
-      <w:hyperlink r:id="rId386">
+      <w:hyperlink r:id="rId388">
         <w:r>
           <w:rPr>
             <w:rStyle w:val="Hyperlink"/>
@@ -6884,7 +6936,7 @@
           <w:numId w:val="1002"/>
         </w:numPr>
       </w:pPr>
-      <w:hyperlink r:id="rId387">
+      <w:hyperlink r:id="rId389">
         <w:r>
           <w:rPr>
             <w:rStyle w:val="Hyperlink"/>
@@ -6901,7 +6953,7 @@
           <w:numId w:val="1002"/>
         </w:numPr>
       </w:pPr>
-      <w:hyperlink r:id="rId388">
+      <w:hyperlink r:id="rId390">
         <w:r>
           <w:rPr>
             <w:rStyle w:val="Hyperlink"/>
@@ -6918,7 +6970,7 @@
           <w:numId w:val="1002"/>
         </w:numPr>
       </w:pPr>
-      <w:hyperlink r:id="rId389">
+      <w:hyperlink r:id="rId391">
         <w:r>
           <w:rPr>
             <w:rStyle w:val="Hyperlink"/>
@@ -6935,7 +6987,7 @@
           <w:numId w:val="1002"/>
         </w:numPr>
       </w:pPr>
-      <w:hyperlink r:id="rId390">
+      <w:hyperlink r:id="rId392">
         <w:r>
           <w:rPr>
             <w:rStyle w:val="Hyperlink"/>
@@ -6952,7 +7004,7 @@
           <w:numId w:val="1002"/>
         </w:numPr>
       </w:pPr>
-      <w:hyperlink r:id="rId391">
+      <w:hyperlink r:id="rId393">
         <w:r>
           <w:rPr>
             <w:rStyle w:val="Hyperlink"/>
@@ -6969,7 +7021,7 @@
           <w:numId w:val="1002"/>
         </w:numPr>
       </w:pPr>
-      <w:hyperlink r:id="rId392">
+      <w:hyperlink r:id="rId394">
         <w:r>
           <w:rPr>
             <w:rStyle w:val="Hyperlink"/>
@@ -6986,7 +7038,7 @@
           <w:numId w:val="1002"/>
         </w:numPr>
       </w:pPr>
-      <w:hyperlink r:id="rId393">
+      <w:hyperlink r:id="rId395">
         <w:r>
           <w:rPr>
             <w:rStyle w:val="Hyperlink"/>
@@ -7003,7 +7055,7 @@
           <w:numId w:val="1002"/>
         </w:numPr>
       </w:pPr>
-      <w:hyperlink r:id="rId394">
+      <w:hyperlink r:id="rId396">
         <w:r>
           <w:rPr>
             <w:rStyle w:val="Hyperlink"/>
@@ -7020,7 +7072,7 @@
           <w:numId w:val="1002"/>
         </w:numPr>
       </w:pPr>
-      <w:hyperlink r:id="rId395">
+      <w:hyperlink r:id="rId397">
         <w:r>
           <w:rPr>
             <w:rStyle w:val="Hyperlink"/>
@@ -7037,7 +7089,7 @@
           <w:numId w:val="1002"/>
         </w:numPr>
       </w:pPr>
-      <w:hyperlink r:id="rId396">
+      <w:hyperlink r:id="rId398">
         <w:r>
           <w:rPr>
             <w:rStyle w:val="Hyperlink"/>
@@ -7054,7 +7106,7 @@
           <w:numId w:val="1002"/>
         </w:numPr>
       </w:pPr>
-      <w:hyperlink r:id="rId397">
+      <w:hyperlink r:id="rId399">
         <w:r>
           <w:rPr>
             <w:rStyle w:val="Hyperlink"/>
@@ -7071,7 +7123,7 @@
           <w:numId w:val="1002"/>
         </w:numPr>
       </w:pPr>
-      <w:hyperlink r:id="rId398">
+      <w:hyperlink r:id="rId400">
         <w:r>
           <w:rPr>
             <w:rStyle w:val="Hyperlink"/>
@@ -7088,7 +7140,7 @@
           <w:numId w:val="1002"/>
         </w:numPr>
       </w:pPr>
-      <w:hyperlink r:id="rId399">
+      <w:hyperlink r:id="rId401">
         <w:r>
           <w:rPr>
             <w:rStyle w:val="Hyperlink"/>
@@ -7105,7 +7157,7 @@
           <w:numId w:val="1002"/>
         </w:numPr>
       </w:pPr>
-      <w:hyperlink r:id="rId400">
+      <w:hyperlink r:id="rId402">
         <w:r>
           <w:rPr>
             <w:rStyle w:val="Hyperlink"/>
@@ -7122,7 +7174,7 @@
           <w:numId w:val="1002"/>
         </w:numPr>
       </w:pPr>
-      <w:hyperlink r:id="rId401">
+      <w:hyperlink r:id="rId403">
         <w:r>
           <w:rPr>
             <w:rStyle w:val="Hyperlink"/>
@@ -7139,7 +7191,7 @@
           <w:numId w:val="1002"/>
         </w:numPr>
       </w:pPr>
-      <w:hyperlink r:id="rId402">
+      <w:hyperlink r:id="rId404">
         <w:r>
           <w:rPr>
             <w:rStyle w:val="Hyperlink"/>
@@ -7156,7 +7208,7 @@
           <w:numId w:val="1002"/>
         </w:numPr>
       </w:pPr>
-      <w:hyperlink r:id="rId403">
+      <w:hyperlink r:id="rId405">
         <w:r>
           <w:rPr>
             <w:rStyle w:val="Hyperlink"/>
@@ -7173,7 +7225,7 @@
           <w:numId w:val="1002"/>
         </w:numPr>
       </w:pPr>
-      <w:hyperlink r:id="rId404">
+      <w:hyperlink r:id="rId406">
         <w:r>
           <w:rPr>
             <w:rStyle w:val="Hyperlink"/>
@@ -7190,7 +7242,7 @@
           <w:numId w:val="1002"/>
         </w:numPr>
       </w:pPr>
-      <w:hyperlink r:id="rId405">
+      <w:hyperlink r:id="rId407">
         <w:r>
           <w:rPr>
             <w:rStyle w:val="Hyperlink"/>
@@ -7207,7 +7259,7 @@
           <w:numId w:val="1002"/>
         </w:numPr>
       </w:pPr>
-      <w:hyperlink r:id="rId406">
+      <w:hyperlink r:id="rId408">
         <w:r>
           <w:rPr>
             <w:rStyle w:val="Hyperlink"/>
@@ -7224,7 +7276,7 @@
           <w:numId w:val="1002"/>
         </w:numPr>
       </w:pPr>
-      <w:hyperlink r:id="rId407">
+      <w:hyperlink r:id="rId409">
         <w:r>
           <w:rPr>
             <w:rStyle w:val="Hyperlink"/>
@@ -7241,7 +7293,7 @@
           <w:numId w:val="1002"/>
         </w:numPr>
       </w:pPr>
-      <w:hyperlink r:id="rId408">
+      <w:hyperlink r:id="rId410">
         <w:r>
           <w:rPr>
             <w:rStyle w:val="Hyperlink"/>
@@ -7258,7 +7310,7 @@
           <w:numId w:val="1002"/>
         </w:numPr>
       </w:pPr>
-      <w:hyperlink r:id="rId409">
+      <w:hyperlink r:id="rId411">
         <w:r>
           <w:rPr>
             <w:rStyle w:val="Hyperlink"/>
@@ -7275,7 +7327,7 @@
           <w:numId w:val="1002"/>
         </w:numPr>
       </w:pPr>
-      <w:hyperlink r:id="rId410">
+      <w:hyperlink r:id="rId412">
         <w:r>
           <w:rPr>
             <w:rStyle w:val="Hyperlink"/>
@@ -7292,7 +7344,7 @@
           <w:numId w:val="1002"/>
         </w:numPr>
       </w:pPr>
-      <w:hyperlink r:id="rId411">
+      <w:hyperlink r:id="rId413">
         <w:r>
           <w:rPr>
             <w:rStyle w:val="Hyperlink"/>
@@ -7309,7 +7361,7 @@
           <w:numId w:val="1002"/>
         </w:numPr>
       </w:pPr>
-      <w:hyperlink r:id="rId412">
+      <w:hyperlink r:id="rId414">
         <w:r>
           <w:rPr>
             <w:rStyle w:val="Hyperlink"/>
@@ -7326,7 +7378,7 @@
           <w:numId w:val="1002"/>
         </w:numPr>
       </w:pPr>
-      <w:hyperlink r:id="rId413">
+      <w:hyperlink r:id="rId415">
         <w:r>
           <w:rPr>
             <w:rStyle w:val="Hyperlink"/>
@@ -7343,7 +7395,7 @@
           <w:numId w:val="1002"/>
         </w:numPr>
       </w:pPr>
-      <w:hyperlink r:id="rId414">
+      <w:hyperlink r:id="rId416">
         <w:r>
           <w:rPr>
             <w:rStyle w:val="Hyperlink"/>
@@ -7360,7 +7412,7 @@
           <w:numId w:val="1002"/>
         </w:numPr>
       </w:pPr>
-      <w:hyperlink r:id="rId415">
+      <w:hyperlink r:id="rId417">
         <w:r>
           <w:rPr>
             <w:rStyle w:val="Hyperlink"/>
@@ -7377,7 +7429,7 @@
           <w:numId w:val="1002"/>
         </w:numPr>
       </w:pPr>
-      <w:hyperlink r:id="rId416">
+      <w:hyperlink r:id="rId418">
         <w:r>
           <w:rPr>
             <w:rStyle w:val="Hyperlink"/>
@@ -7394,7 +7446,7 @@
           <w:numId w:val="1002"/>
         </w:numPr>
       </w:pPr>
-      <w:hyperlink r:id="rId417">
+      <w:hyperlink r:id="rId419">
         <w:r>
           <w:rPr>
             <w:rStyle w:val="Hyperlink"/>
@@ -7411,7 +7463,7 @@
           <w:numId w:val="1002"/>
         </w:numPr>
       </w:pPr>
-      <w:hyperlink r:id="rId418">
+      <w:hyperlink r:id="rId420">
         <w:r>
           <w:rPr>
             <w:rStyle w:val="Hyperlink"/>
@@ -7428,7 +7480,7 @@
           <w:numId w:val="1002"/>
         </w:numPr>
       </w:pPr>
-      <w:hyperlink r:id="rId419">
+      <w:hyperlink r:id="rId421">
         <w:r>
           <w:rPr>
             <w:rStyle w:val="Hyperlink"/>
@@ -7445,7 +7497,7 @@
           <w:numId w:val="1002"/>
         </w:numPr>
       </w:pPr>
-      <w:hyperlink r:id="rId420">
+      <w:hyperlink r:id="rId422">
         <w:r>
           <w:rPr>
             <w:rStyle w:val="Hyperlink"/>
@@ -7462,7 +7514,7 @@
           <w:numId w:val="1002"/>
         </w:numPr>
       </w:pPr>
-      <w:hyperlink r:id="rId421">
+      <w:hyperlink r:id="rId423">
         <w:r>
           <w:rPr>
             <w:rStyle w:val="Hyperlink"/>
@@ -7479,7 +7531,7 @@
           <w:numId w:val="1002"/>
         </w:numPr>
       </w:pPr>
-      <w:hyperlink r:id="rId422">
+      <w:hyperlink r:id="rId424">
         <w:r>
           <w:rPr>
             <w:rStyle w:val="Hyperlink"/>
@@ -7496,7 +7548,7 @@
           <w:numId w:val="1002"/>
         </w:numPr>
       </w:pPr>
-      <w:hyperlink r:id="rId423">
+      <w:hyperlink r:id="rId425">
         <w:r>
           <w:rPr>
             <w:rStyle w:val="Hyperlink"/>
@@ -7513,7 +7565,7 @@
           <w:numId w:val="1002"/>
         </w:numPr>
       </w:pPr>
-      <w:hyperlink r:id="rId424">
+      <w:hyperlink r:id="rId426">
         <w:r>
           <w:rPr>
             <w:rStyle w:val="Hyperlink"/>
@@ -7530,7 +7582,7 @@
           <w:numId w:val="1002"/>
         </w:numPr>
       </w:pPr>
-      <w:hyperlink r:id="rId425">
+      <w:hyperlink r:id="rId427">
         <w:r>
           <w:rPr>
             <w:rStyle w:val="Hyperlink"/>
@@ -7547,7 +7599,7 @@
           <w:numId w:val="1002"/>
         </w:numPr>
       </w:pPr>
-      <w:hyperlink r:id="rId426">
+      <w:hyperlink r:id="rId428">
         <w:r>
           <w:rPr>
             <w:rStyle w:val="Hyperlink"/>
@@ -7564,7 +7616,7 @@
           <w:numId w:val="1002"/>
         </w:numPr>
       </w:pPr>
-      <w:hyperlink r:id="rId427">
+      <w:hyperlink r:id="rId429">
         <w:r>
           <w:rPr>
             <w:rStyle w:val="Hyperlink"/>
@@ -7581,7 +7633,7 @@
           <w:numId w:val="1002"/>
         </w:numPr>
       </w:pPr>
-      <w:hyperlink r:id="rId428">
+      <w:hyperlink r:id="rId430">
         <w:r>
           <w:rPr>
             <w:rStyle w:val="Hyperlink"/>
@@ -7598,7 +7650,7 @@
           <w:numId w:val="1002"/>
         </w:numPr>
       </w:pPr>
-      <w:hyperlink r:id="rId429">
+      <w:hyperlink r:id="rId431">
         <w:r>
           <w:rPr>
             <w:rStyle w:val="Hyperlink"/>
@@ -7615,7 +7667,7 @@
           <w:numId w:val="1002"/>
         </w:numPr>
       </w:pPr>
-      <w:hyperlink r:id="rId430">
+      <w:hyperlink r:id="rId432">
         <w:r>
           <w:rPr>
             <w:rStyle w:val="Hyperlink"/>
@@ -7632,7 +7684,7 @@
           <w:numId w:val="1002"/>
         </w:numPr>
       </w:pPr>
-      <w:hyperlink r:id="rId431">
+      <w:hyperlink r:id="rId433">
         <w:r>
           <w:rPr>
             <w:rStyle w:val="Hyperlink"/>
@@ -7649,7 +7701,7 @@
           <w:numId w:val="1002"/>
         </w:numPr>
       </w:pPr>
-      <w:hyperlink r:id="rId432">
+      <w:hyperlink r:id="rId434">
         <w:r>
           <w:rPr>
             <w:rStyle w:val="Hyperlink"/>
@@ -7666,7 +7718,7 @@
           <w:numId w:val="1002"/>
         </w:numPr>
       </w:pPr>
-      <w:hyperlink r:id="rId433">
+      <w:hyperlink r:id="rId435">
         <w:r>
           <w:rPr>
             <w:rStyle w:val="Hyperlink"/>
@@ -7683,7 +7735,7 @@
           <w:numId w:val="1002"/>
         </w:numPr>
       </w:pPr>
-      <w:hyperlink r:id="rId434">
+      <w:hyperlink r:id="rId436">
         <w:r>
           <w:rPr>
             <w:rStyle w:val="Hyperlink"/>
@@ -7700,7 +7752,7 @@
           <w:numId w:val="1002"/>
         </w:numPr>
       </w:pPr>
-      <w:hyperlink r:id="rId435">
+      <w:hyperlink r:id="rId437">
         <w:r>
           <w:rPr>
             <w:rStyle w:val="Hyperlink"/>
@@ -7723,7 +7775,7 @@
       <w:r>
         <w:t xml:space="preserve"> </w:t>
       </w:r>
-      <w:hyperlink r:id="rId436">
+      <w:hyperlink r:id="rId438">
         <w:r>
           <w:rPr>
             <w:rStyle w:val="Hyperlink"/>
@@ -7740,7 +7792,7 @@
       <w:r>
         <w:t xml:space="preserve"> </w:t>
       </w:r>
-      <w:hyperlink r:id="rId437">
+      <w:hyperlink r:id="rId439">
         <w:r>
           <w:rPr>
             <w:rStyle w:val="Hyperlink"/>
@@ -7757,7 +7809,7 @@
           <w:numId w:val="1002"/>
         </w:numPr>
       </w:pPr>
-      <w:hyperlink r:id="rId438">
+      <w:hyperlink r:id="rId440">
         <w:r>
           <w:rPr>
             <w:rStyle w:val="Hyperlink"/>
@@ -7774,7 +7826,7 @@
           <w:numId w:val="1002"/>
         </w:numPr>
       </w:pPr>
-      <w:hyperlink r:id="rId439">
+      <w:hyperlink r:id="rId441">
         <w:r>
           <w:rPr>
             <w:rStyle w:val="Hyperlink"/>
@@ -7797,7 +7849,7 @@
       <w:r>
         <w:t xml:space="preserve"> </w:t>
       </w:r>
-      <w:hyperlink r:id="rId440">
+      <w:hyperlink r:id="rId442">
         <w:r>
           <w:rPr>
             <w:rStyle w:val="Hyperlink"/>
@@ -7811,7 +7863,7 @@
       <w:r>
         <w:t xml:space="preserve"> </w:t>
       </w:r>
-      <w:hyperlink r:id="rId441">
+      <w:hyperlink r:id="rId443">
         <w:r>
           <w:rPr>
             <w:rStyle w:val="Hyperlink"/>
@@ -7825,7 +7877,7 @@
       <w:r>
         <w:t xml:space="preserve"> </w:t>
       </w:r>
-      <w:hyperlink r:id="rId442">
+      <w:hyperlink r:id="rId444">
         <w:r>
           <w:rPr>
             <w:rStyle w:val="Hyperlink"/>
@@ -7839,7 +7891,7 @@
       <w:r>
         <w:t xml:space="preserve"> </w:t>
       </w:r>
-      <w:hyperlink r:id="rId443">
+      <w:hyperlink r:id="rId445">
         <w:r>
           <w:rPr>
             <w:rStyle w:val="Hyperlink"/>
@@ -7856,7 +7908,7 @@
       <w:r>
         <w:t xml:space="preserve"> </w:t>
       </w:r>
-      <w:hyperlink r:id="rId444">
+      <w:hyperlink r:id="rId446">
         <w:r>
           <w:rPr>
             <w:rStyle w:val="Hyperlink"/>
@@ -7879,7 +7931,7 @@
       <w:r>
         <w:t xml:space="preserve"> </w:t>
       </w:r>
-      <w:hyperlink r:id="rId445">
+      <w:hyperlink r:id="rId447">
         <w:r>
           <w:rPr>
             <w:rStyle w:val="Hyperlink"/>
@@ -7902,7 +7954,7 @@
       <w:r>
         <w:t xml:space="preserve"> </w:t>
       </w:r>
-      <w:hyperlink r:id="rId446">
+      <w:hyperlink r:id="rId448">
         <w:r>
           <w:rPr>
             <w:rStyle w:val="Hyperlink"/>
@@ -7916,7 +7968,7 @@
       <w:r>
         <w:t xml:space="preserve"> </w:t>
       </w:r>
-      <w:hyperlink r:id="rId447">
+      <w:hyperlink r:id="rId449">
         <w:r>
           <w:rPr>
             <w:rStyle w:val="Hyperlink"/>
@@ -7933,7 +7985,7 @@
       <w:r>
         <w:t xml:space="preserve"> </w:t>
       </w:r>
-      <w:hyperlink r:id="rId448">
+      <w:hyperlink r:id="rId450">
         <w:r>
           <w:rPr>
             <w:rStyle w:val="Hyperlink"/>
@@ -7956,7 +8008,7 @@
       <w:r>
         <w:t xml:space="preserve"> </w:t>
       </w:r>
-      <w:hyperlink r:id="rId449">
+      <w:hyperlink r:id="rId451">
         <w:r>
           <w:rPr>
             <w:rStyle w:val="Hyperlink"/>
@@ -7973,7 +8025,7 @@
       <w:r>
         <w:t xml:space="preserve"> </w:t>
       </w:r>
-      <w:hyperlink r:id="rId450">
+      <w:hyperlink r:id="rId452">
         <w:r>
           <w:rPr>
             <w:rStyle w:val="Hyperlink"/>
@@ -7996,7 +8048,7 @@
       <w:r>
         <w:t xml:space="preserve"> </w:t>
       </w:r>
-      <w:hyperlink r:id="rId451">
+      <w:hyperlink r:id="rId453">
         <w:r>
           <w:rPr>
             <w:rStyle w:val="Hyperlink"/>
@@ -8010,7 +8062,7 @@
       <w:r>
         <w:t xml:space="preserve"> </w:t>
       </w:r>
-      <w:hyperlink r:id="rId452">
+      <w:hyperlink r:id="rId454">
         <w:r>
           <w:rPr>
             <w:rStyle w:val="Hyperlink"/>
@@ -8024,7 +8076,7 @@
       <w:r>
         <w:t xml:space="preserve"> </w:t>
       </w:r>
-      <w:hyperlink r:id="rId453">
+      <w:hyperlink r:id="rId455">
         <w:r>
           <w:rPr>
             <w:rStyle w:val="Hyperlink"/>
@@ -8041,7 +8093,7 @@
       <w:r>
         <w:t xml:space="preserve"> </w:t>
       </w:r>
-      <w:hyperlink r:id="rId454">
+      <w:hyperlink r:id="rId456">
         <w:r>
           <w:rPr>
             <w:rStyle w:val="Hyperlink"/>
@@ -8050,8 +8102,8 @@
         </w:r>
       </w:hyperlink>
     </w:p>
-    <w:bookmarkEnd w:id="455"/>
-    <w:bookmarkStart w:id="591" w:name="libros"/>
+    <w:bookmarkEnd w:id="457"/>
+    <w:bookmarkStart w:id="593" w:name="libros"/>
     <w:p>
       <w:pPr>
         <w:pStyle w:val="Heading2"/>
@@ -8068,7 +8120,7 @@
           <w:numId w:val="1003"/>
         </w:numPr>
       </w:pPr>
-      <w:hyperlink r:id="rId456">
+      <w:hyperlink r:id="rId458">
         <w:r>
           <w:rPr>
             <w:rStyle w:val="Hyperlink"/>
@@ -8085,7 +8137,7 @@
           <w:numId w:val="1003"/>
         </w:numPr>
       </w:pPr>
-      <w:hyperlink r:id="rId457">
+      <w:hyperlink r:id="rId459">
         <w:r>
           <w:rPr>
             <w:rStyle w:val="Hyperlink"/>
@@ -8102,7 +8154,7 @@
           <w:numId w:val="1003"/>
         </w:numPr>
       </w:pPr>
-      <w:hyperlink r:id="rId458">
+      <w:hyperlink r:id="rId460">
         <w:r>
           <w:rPr>
             <w:rStyle w:val="Hyperlink"/>
@@ -8119,7 +8171,7 @@
           <w:numId w:val="1003"/>
         </w:numPr>
       </w:pPr>
-      <w:hyperlink r:id="rId459">
+      <w:hyperlink r:id="rId461">
         <w:r>
           <w:rPr>
             <w:rStyle w:val="Hyperlink"/>
@@ -8136,7 +8188,7 @@
           <w:numId w:val="1003"/>
         </w:numPr>
       </w:pPr>
-      <w:hyperlink r:id="rId460">
+      <w:hyperlink r:id="rId462">
         <w:r>
           <w:rPr>
             <w:rStyle w:val="Hyperlink"/>
@@ -8153,7 +8205,7 @@
           <w:numId w:val="1003"/>
         </w:numPr>
       </w:pPr>
-      <w:hyperlink r:id="rId461">
+      <w:hyperlink r:id="rId463">
         <w:r>
           <w:rPr>
             <w:rStyle w:val="Hyperlink"/>
@@ -8170,7 +8222,7 @@
           <w:numId w:val="1003"/>
         </w:numPr>
       </w:pPr>
-      <w:hyperlink r:id="rId462">
+      <w:hyperlink r:id="rId464">
         <w:r>
           <w:rPr>
             <w:rStyle w:val="Hyperlink"/>
@@ -8187,7 +8239,7 @@
           <w:numId w:val="1003"/>
         </w:numPr>
       </w:pPr>
-      <w:hyperlink r:id="rId463">
+      <w:hyperlink r:id="rId465">
         <w:r>
           <w:rPr>
             <w:rStyle w:val="Hyperlink"/>
@@ -8204,7 +8256,7 @@
           <w:numId w:val="1003"/>
         </w:numPr>
       </w:pPr>
-      <w:hyperlink r:id="rId464">
+      <w:hyperlink r:id="rId466">
         <w:r>
           <w:rPr>
             <w:rStyle w:val="Hyperlink"/>
@@ -8221,7 +8273,7 @@
           <w:numId w:val="1003"/>
         </w:numPr>
       </w:pPr>
-      <w:hyperlink r:id="rId465">
+      <w:hyperlink r:id="rId467">
         <w:r>
           <w:rPr>
             <w:rStyle w:val="Hyperlink"/>
@@ -8238,7 +8290,7 @@
           <w:numId w:val="1003"/>
         </w:numPr>
       </w:pPr>
-      <w:hyperlink r:id="rId466">
+      <w:hyperlink r:id="rId468">
         <w:r>
           <w:rPr>
             <w:rStyle w:val="Hyperlink"/>
@@ -8255,7 +8307,7 @@
           <w:numId w:val="1003"/>
         </w:numPr>
       </w:pPr>
-      <w:hyperlink r:id="rId467">
+      <w:hyperlink r:id="rId469">
         <w:r>
           <w:rPr>
             <w:rStyle w:val="Hyperlink"/>
@@ -8272,7 +8324,7 @@
           <w:numId w:val="1003"/>
         </w:numPr>
       </w:pPr>
-      <w:hyperlink r:id="rId468">
+      <w:hyperlink r:id="rId470">
         <w:r>
           <w:rPr>
             <w:rStyle w:val="Hyperlink"/>
@@ -8289,7 +8341,7 @@
           <w:numId w:val="1003"/>
         </w:numPr>
       </w:pPr>
-      <w:hyperlink r:id="rId469">
+      <w:hyperlink r:id="rId471">
         <w:r>
           <w:rPr>
             <w:rStyle w:val="Hyperlink"/>
@@ -8306,7 +8358,7 @@
           <w:numId w:val="1003"/>
         </w:numPr>
       </w:pPr>
-      <w:hyperlink r:id="rId470">
+      <w:hyperlink r:id="rId472">
         <w:r>
           <w:rPr>
             <w:rStyle w:val="Hyperlink"/>
@@ -8323,7 +8375,7 @@
           <w:numId w:val="1003"/>
         </w:numPr>
       </w:pPr>
-      <w:hyperlink r:id="rId471">
+      <w:hyperlink r:id="rId473">
         <w:r>
           <w:rPr>
             <w:rStyle w:val="Hyperlink"/>
@@ -8340,7 +8392,7 @@
           <w:numId w:val="1003"/>
         </w:numPr>
       </w:pPr>
-      <w:hyperlink r:id="rId472">
+      <w:hyperlink r:id="rId474">
         <w:r>
           <w:rPr>
             <w:rStyle w:val="Hyperlink"/>
@@ -8357,7 +8409,7 @@
           <w:numId w:val="1003"/>
         </w:numPr>
       </w:pPr>
-      <w:hyperlink r:id="rId473">
+      <w:hyperlink r:id="rId475">
         <w:r>
           <w:rPr>
             <w:rStyle w:val="Hyperlink"/>
@@ -8374,7 +8426,7 @@
           <w:numId w:val="1003"/>
         </w:numPr>
       </w:pPr>
-      <w:hyperlink r:id="rId474">
+      <w:hyperlink r:id="rId476">
         <w:r>
           <w:rPr>
             <w:rStyle w:val="Hyperlink"/>
@@ -8391,7 +8443,7 @@
           <w:numId w:val="1003"/>
         </w:numPr>
       </w:pPr>
-      <w:hyperlink r:id="rId475">
+      <w:hyperlink r:id="rId477">
         <w:r>
           <w:rPr>
             <w:rStyle w:val="Hyperlink"/>
@@ -8408,7 +8460,7 @@
           <w:numId w:val="1003"/>
         </w:numPr>
       </w:pPr>
-      <w:hyperlink r:id="rId476">
+      <w:hyperlink r:id="rId478">
         <w:r>
           <w:rPr>
             <w:rStyle w:val="Hyperlink"/>
@@ -8425,7 +8477,7 @@
           <w:numId w:val="1003"/>
         </w:numPr>
       </w:pPr>
-      <w:hyperlink r:id="rId477">
+      <w:hyperlink r:id="rId479">
         <w:r>
           <w:rPr>
             <w:rStyle w:val="Hyperlink"/>
@@ -8442,7 +8494,7 @@
           <w:numId w:val="1003"/>
         </w:numPr>
       </w:pPr>
-      <w:hyperlink r:id="rId478">
+      <w:hyperlink r:id="rId480">
         <w:r>
           <w:rPr>
             <w:rStyle w:val="Hyperlink"/>
@@ -8459,7 +8511,7 @@
           <w:numId w:val="1003"/>
         </w:numPr>
       </w:pPr>
-      <w:hyperlink r:id="rId479">
+      <w:hyperlink r:id="rId481">
         <w:r>
           <w:rPr>
             <w:rStyle w:val="Hyperlink"/>
@@ -8476,7 +8528,7 @@
           <w:numId w:val="1003"/>
         </w:numPr>
       </w:pPr>
-      <w:hyperlink r:id="rId480">
+      <w:hyperlink r:id="rId482">
         <w:r>
           <w:rPr>
             <w:rStyle w:val="Hyperlink"/>
@@ -8493,7 +8545,7 @@
           <w:numId w:val="1003"/>
         </w:numPr>
       </w:pPr>
-      <w:hyperlink r:id="rId481">
+      <w:hyperlink r:id="rId483">
         <w:r>
           <w:rPr>
             <w:rStyle w:val="Hyperlink"/>
@@ -8510,7 +8562,7 @@
           <w:numId w:val="1003"/>
         </w:numPr>
       </w:pPr>
-      <w:hyperlink r:id="rId482">
+      <w:hyperlink r:id="rId484">
         <w:r>
           <w:rPr>
             <w:rStyle w:val="Hyperlink"/>
@@ -8527,7 +8579,7 @@
           <w:numId w:val="1003"/>
         </w:numPr>
       </w:pPr>
-      <w:hyperlink r:id="rId483">
+      <w:hyperlink r:id="rId485">
         <w:r>
           <w:rPr>
             <w:rStyle w:val="Hyperlink"/>
@@ -8544,7 +8596,7 @@
           <w:numId w:val="1003"/>
         </w:numPr>
       </w:pPr>
-      <w:hyperlink r:id="rId484">
+      <w:hyperlink r:id="rId486">
         <w:r>
           <w:rPr>
             <w:rStyle w:val="Hyperlink"/>
@@ -8561,7 +8613,7 @@
           <w:numId w:val="1003"/>
         </w:numPr>
       </w:pPr>
-      <w:hyperlink r:id="rId485">
+      <w:hyperlink r:id="rId487">
         <w:r>
           <w:rPr>
             <w:rStyle w:val="Hyperlink"/>
@@ -8578,7 +8630,7 @@
           <w:numId w:val="1003"/>
         </w:numPr>
       </w:pPr>
-      <w:hyperlink r:id="rId486">
+      <w:hyperlink r:id="rId488">
         <w:r>
           <w:rPr>
             <w:rStyle w:val="Hyperlink"/>
@@ -8595,7 +8647,7 @@
           <w:numId w:val="1003"/>
         </w:numPr>
       </w:pPr>
-      <w:hyperlink r:id="rId487">
+      <w:hyperlink r:id="rId489">
         <w:r>
           <w:rPr>
             <w:rStyle w:val="Hyperlink"/>
@@ -8612,7 +8664,7 @@
           <w:numId w:val="1003"/>
         </w:numPr>
       </w:pPr>
-      <w:hyperlink r:id="rId488">
+      <w:hyperlink r:id="rId490">
         <w:r>
           <w:rPr>
             <w:rStyle w:val="Hyperlink"/>
@@ -8629,7 +8681,7 @@
           <w:numId w:val="1003"/>
         </w:numPr>
       </w:pPr>
-      <w:hyperlink r:id="rId489">
+      <w:hyperlink r:id="rId491">
         <w:r>
           <w:rPr>
             <w:rStyle w:val="Hyperlink"/>
@@ -8646,7 +8698,7 @@
           <w:numId w:val="1003"/>
         </w:numPr>
       </w:pPr>
-      <w:hyperlink r:id="rId490">
+      <w:hyperlink r:id="rId492">
         <w:r>
           <w:rPr>
             <w:rStyle w:val="Hyperlink"/>
@@ -8663,7 +8715,7 @@
           <w:numId w:val="1003"/>
         </w:numPr>
       </w:pPr>
-      <w:hyperlink r:id="rId491">
+      <w:hyperlink r:id="rId493">
         <w:r>
           <w:rPr>
             <w:rStyle w:val="Hyperlink"/>
@@ -8680,7 +8732,7 @@
           <w:numId w:val="1003"/>
         </w:numPr>
       </w:pPr>
-      <w:hyperlink r:id="rId492">
+      <w:hyperlink r:id="rId494">
         <w:r>
           <w:rPr>
             <w:rStyle w:val="Hyperlink"/>
@@ -8697,7 +8749,7 @@
           <w:numId w:val="1003"/>
         </w:numPr>
       </w:pPr>
-      <w:hyperlink r:id="rId493">
+      <w:hyperlink r:id="rId495">
         <w:r>
           <w:rPr>
             <w:rStyle w:val="Hyperlink"/>
@@ -8714,7 +8766,7 @@
           <w:numId w:val="1003"/>
         </w:numPr>
       </w:pPr>
-      <w:hyperlink r:id="rId494">
+      <w:hyperlink r:id="rId496">
         <w:r>
           <w:rPr>
             <w:rStyle w:val="Hyperlink"/>
@@ -8731,7 +8783,7 @@
           <w:numId w:val="1003"/>
         </w:numPr>
       </w:pPr>
-      <w:hyperlink r:id="rId495">
+      <w:hyperlink r:id="rId497">
         <w:r>
           <w:rPr>
             <w:rStyle w:val="Hyperlink"/>
@@ -8748,7 +8800,7 @@
           <w:numId w:val="1003"/>
         </w:numPr>
       </w:pPr>
-      <w:hyperlink r:id="rId496">
+      <w:hyperlink r:id="rId498">
         <w:r>
           <w:rPr>
             <w:rStyle w:val="Hyperlink"/>
@@ -8765,7 +8817,7 @@
           <w:numId w:val="1003"/>
         </w:numPr>
       </w:pPr>
-      <w:hyperlink r:id="rId497">
+      <w:hyperlink r:id="rId499">
         <w:r>
           <w:rPr>
             <w:rStyle w:val="Hyperlink"/>
@@ -8782,7 +8834,7 @@
           <w:numId w:val="1003"/>
         </w:numPr>
       </w:pPr>
-      <w:hyperlink r:id="rId498">
+      <w:hyperlink r:id="rId500">
         <w:r>
           <w:rPr>
             <w:rStyle w:val="Hyperlink"/>
@@ -8799,7 +8851,7 @@
           <w:numId w:val="1003"/>
         </w:numPr>
       </w:pPr>
-      <w:hyperlink r:id="rId499">
+      <w:hyperlink r:id="rId501">
         <w:r>
           <w:rPr>
             <w:rStyle w:val="Hyperlink"/>
@@ -8816,7 +8868,7 @@
           <w:numId w:val="1003"/>
         </w:numPr>
       </w:pPr>
-      <w:hyperlink r:id="rId500">
+      <w:hyperlink r:id="rId502">
         <w:r>
           <w:rPr>
             <w:rStyle w:val="Hyperlink"/>
@@ -8833,7 +8885,7 @@
           <w:numId w:val="1003"/>
         </w:numPr>
       </w:pPr>
-      <w:hyperlink r:id="rId501">
+      <w:hyperlink r:id="rId503">
         <w:r>
           <w:rPr>
             <w:rStyle w:val="Hyperlink"/>
@@ -8850,7 +8902,7 @@
           <w:numId w:val="1003"/>
         </w:numPr>
       </w:pPr>
-      <w:hyperlink r:id="rId502">
+      <w:hyperlink r:id="rId504">
         <w:r>
           <w:rPr>
             <w:rStyle w:val="Hyperlink"/>
@@ -8867,7 +8919,7 @@
           <w:numId w:val="1003"/>
         </w:numPr>
       </w:pPr>
-      <w:hyperlink r:id="rId503">
+      <w:hyperlink r:id="rId505">
         <w:r>
           <w:rPr>
             <w:rStyle w:val="Hyperlink"/>
@@ -8884,7 +8936,7 @@
           <w:numId w:val="1003"/>
         </w:numPr>
       </w:pPr>
-      <w:hyperlink r:id="rId504">
+      <w:hyperlink r:id="rId506">
         <w:r>
           <w:rPr>
             <w:rStyle w:val="Hyperlink"/>
@@ -8901,7 +8953,7 @@
           <w:numId w:val="1003"/>
         </w:numPr>
       </w:pPr>
-      <w:hyperlink r:id="rId505">
+      <w:hyperlink r:id="rId507">
         <w:r>
           <w:rPr>
             <w:rStyle w:val="Hyperlink"/>
@@ -8918,7 +8970,7 @@
           <w:numId w:val="1003"/>
         </w:numPr>
       </w:pPr>
-      <w:hyperlink r:id="rId506">
+      <w:hyperlink r:id="rId508">
         <w:r>
           <w:rPr>
             <w:rStyle w:val="Hyperlink"/>
@@ -8935,7 +8987,7 @@
           <w:numId w:val="1003"/>
         </w:numPr>
       </w:pPr>
-      <w:hyperlink r:id="rId507">
+      <w:hyperlink r:id="rId509">
         <w:r>
           <w:rPr>
             <w:rStyle w:val="Hyperlink"/>
@@ -8952,7 +9004,7 @@
           <w:numId w:val="1003"/>
         </w:numPr>
       </w:pPr>
-      <w:hyperlink r:id="rId508">
+      <w:hyperlink r:id="rId510">
         <w:r>
           <w:rPr>
             <w:rStyle w:val="Hyperlink"/>
@@ -8969,7 +9021,7 @@
           <w:numId w:val="1003"/>
         </w:numPr>
       </w:pPr>
-      <w:hyperlink r:id="rId509">
+      <w:hyperlink r:id="rId511">
         <w:r>
           <w:rPr>
             <w:rStyle w:val="Hyperlink"/>
@@ -8986,7 +9038,7 @@
           <w:numId w:val="1003"/>
         </w:numPr>
       </w:pPr>
-      <w:hyperlink r:id="rId510">
+      <w:hyperlink r:id="rId512">
         <w:r>
           <w:rPr>
             <w:rStyle w:val="Hyperlink"/>
@@ -9003,7 +9055,7 @@
           <w:numId w:val="1003"/>
         </w:numPr>
       </w:pPr>
-      <w:hyperlink r:id="rId511">
+      <w:hyperlink r:id="rId513">
         <w:r>
           <w:rPr>
             <w:rStyle w:val="Hyperlink"/>
@@ -9020,7 +9072,7 @@
           <w:numId w:val="1003"/>
         </w:numPr>
       </w:pPr>
-      <w:hyperlink r:id="rId512">
+      <w:hyperlink r:id="rId514">
         <w:r>
           <w:rPr>
             <w:rStyle w:val="Hyperlink"/>
@@ -9037,7 +9089,7 @@
           <w:numId w:val="1003"/>
         </w:numPr>
       </w:pPr>
-      <w:hyperlink r:id="rId513">
+      <w:hyperlink r:id="rId515">
         <w:r>
           <w:rPr>
             <w:rStyle w:val="Hyperlink"/>
@@ -9054,7 +9106,7 @@
           <w:numId w:val="1003"/>
         </w:numPr>
       </w:pPr>
-      <w:hyperlink r:id="rId514">
+      <w:hyperlink r:id="rId516">
         <w:r>
           <w:rPr>
             <w:rStyle w:val="Hyperlink"/>
@@ -9071,7 +9123,7 @@
           <w:numId w:val="1003"/>
         </w:numPr>
       </w:pPr>
-      <w:hyperlink r:id="rId515">
+      <w:hyperlink r:id="rId517">
         <w:r>
           <w:rPr>
             <w:rStyle w:val="Hyperlink"/>
@@ -9088,7 +9140,7 @@
           <w:numId w:val="1003"/>
         </w:numPr>
       </w:pPr>
-      <w:hyperlink r:id="rId516">
+      <w:hyperlink r:id="rId518">
         <w:r>
           <w:rPr>
             <w:rStyle w:val="Hyperlink"/>
@@ -9105,7 +9157,7 @@
           <w:numId w:val="1003"/>
         </w:numPr>
       </w:pPr>
-      <w:hyperlink r:id="rId517">
+      <w:hyperlink r:id="rId519">
         <w:r>
           <w:rPr>
             <w:rStyle w:val="Hyperlink"/>
@@ -9122,7 +9174,7 @@
           <w:numId w:val="1003"/>
         </w:numPr>
       </w:pPr>
-      <w:hyperlink r:id="rId518">
+      <w:hyperlink r:id="rId520">
         <w:r>
           <w:rPr>
             <w:rStyle w:val="Hyperlink"/>
@@ -9139,7 +9191,7 @@
           <w:numId w:val="1003"/>
         </w:numPr>
       </w:pPr>
-      <w:hyperlink r:id="rId519">
+      <w:hyperlink r:id="rId521">
         <w:r>
           <w:rPr>
             <w:rStyle w:val="Hyperlink"/>
@@ -9156,7 +9208,7 @@
           <w:numId w:val="1003"/>
         </w:numPr>
       </w:pPr>
-      <w:hyperlink r:id="rId520">
+      <w:hyperlink r:id="rId522">
         <w:r>
           <w:rPr>
             <w:rStyle w:val="Hyperlink"/>
@@ -9173,7 +9225,7 @@
           <w:numId w:val="1003"/>
         </w:numPr>
       </w:pPr>
-      <w:hyperlink r:id="rId521">
+      <w:hyperlink r:id="rId523">
         <w:r>
           <w:rPr>
             <w:rStyle w:val="Hyperlink"/>
@@ -9190,7 +9242,7 @@
           <w:numId w:val="1003"/>
         </w:numPr>
       </w:pPr>
-      <w:hyperlink r:id="rId522">
+      <w:hyperlink r:id="rId524">
         <w:r>
           <w:rPr>
             <w:rStyle w:val="Hyperlink"/>
@@ -9207,7 +9259,7 @@
           <w:numId w:val="1003"/>
         </w:numPr>
       </w:pPr>
-      <w:hyperlink r:id="rId523">
+      <w:hyperlink r:id="rId525">
         <w:r>
           <w:rPr>
             <w:rStyle w:val="Hyperlink"/>
@@ -9224,7 +9276,7 @@
           <w:numId w:val="1003"/>
         </w:numPr>
       </w:pPr>
-      <w:hyperlink r:id="rId524">
+      <w:hyperlink r:id="rId526">
         <w:r>
           <w:rPr>
             <w:rStyle w:val="Hyperlink"/>
@@ -9241,7 +9293,7 @@
           <w:numId w:val="1003"/>
         </w:numPr>
       </w:pPr>
-      <w:hyperlink r:id="rId525">
+      <w:hyperlink r:id="rId527">
         <w:r>
           <w:rPr>
             <w:rStyle w:val="Hyperlink"/>
@@ -9258,7 +9310,7 @@
           <w:numId w:val="1003"/>
         </w:numPr>
       </w:pPr>
-      <w:hyperlink r:id="rId526">
+      <w:hyperlink r:id="rId528">
         <w:r>
           <w:rPr>
             <w:rStyle w:val="Hyperlink"/>
@@ -9275,7 +9327,7 @@
           <w:numId w:val="1003"/>
         </w:numPr>
       </w:pPr>
-      <w:hyperlink r:id="rId527">
+      <w:hyperlink r:id="rId529">
         <w:r>
           <w:rPr>
             <w:rStyle w:val="Hyperlink"/>
@@ -9292,7 +9344,7 @@
           <w:numId w:val="1003"/>
         </w:numPr>
       </w:pPr>
-      <w:hyperlink r:id="rId528">
+      <w:hyperlink r:id="rId530">
         <w:r>
           <w:rPr>
             <w:rStyle w:val="Hyperlink"/>
@@ -9309,7 +9361,7 @@
           <w:numId w:val="1003"/>
         </w:numPr>
       </w:pPr>
-      <w:hyperlink r:id="rId529">
+      <w:hyperlink r:id="rId531">
         <w:r>
           <w:rPr>
             <w:rStyle w:val="Hyperlink"/>
@@ -9326,7 +9378,7 @@
           <w:numId w:val="1003"/>
         </w:numPr>
       </w:pPr>
-      <w:hyperlink r:id="rId530">
+      <w:hyperlink r:id="rId532">
         <w:r>
           <w:rPr>
             <w:rStyle w:val="Hyperlink"/>
@@ -9343,7 +9395,7 @@
           <w:numId w:val="1003"/>
         </w:numPr>
       </w:pPr>
-      <w:hyperlink r:id="rId531">
+      <w:hyperlink r:id="rId533">
         <w:r>
           <w:rPr>
             <w:rStyle w:val="Hyperlink"/>
@@ -9360,7 +9412,7 @@
           <w:numId w:val="1003"/>
         </w:numPr>
       </w:pPr>
-      <w:hyperlink r:id="rId532">
+      <w:hyperlink r:id="rId534">
         <w:r>
           <w:rPr>
             <w:rStyle w:val="Hyperlink"/>
@@ -9377,7 +9429,7 @@
           <w:numId w:val="1003"/>
         </w:numPr>
       </w:pPr>
-      <w:hyperlink r:id="rId533">
+      <w:hyperlink r:id="rId535">
         <w:r>
           <w:rPr>
             <w:rStyle w:val="Hyperlink"/>
@@ -9394,7 +9446,7 @@
           <w:numId w:val="1003"/>
         </w:numPr>
       </w:pPr>
-      <w:hyperlink r:id="rId534">
+      <w:hyperlink r:id="rId536">
         <w:r>
           <w:rPr>
             <w:rStyle w:val="Hyperlink"/>
@@ -9411,7 +9463,7 @@
           <w:numId w:val="1003"/>
         </w:numPr>
       </w:pPr>
-      <w:hyperlink r:id="rId535">
+      <w:hyperlink r:id="rId537">
         <w:r>
           <w:rPr>
             <w:rStyle w:val="Hyperlink"/>
@@ -9428,7 +9480,7 @@
           <w:numId w:val="1003"/>
         </w:numPr>
       </w:pPr>
-      <w:hyperlink r:id="rId536">
+      <w:hyperlink r:id="rId538">
         <w:r>
           <w:rPr>
             <w:rStyle w:val="Hyperlink"/>
@@ -9445,7 +9497,7 @@
           <w:numId w:val="1003"/>
         </w:numPr>
       </w:pPr>
-      <w:hyperlink r:id="rId537">
+      <w:hyperlink r:id="rId539">
         <w:r>
           <w:rPr>
             <w:rStyle w:val="Hyperlink"/>
@@ -9462,7 +9514,7 @@
           <w:numId w:val="1003"/>
         </w:numPr>
       </w:pPr>
-      <w:hyperlink r:id="rId538">
+      <w:hyperlink r:id="rId540">
         <w:r>
           <w:rPr>
             <w:rStyle w:val="Hyperlink"/>
@@ -9479,7 +9531,7 @@
           <w:numId w:val="1003"/>
         </w:numPr>
       </w:pPr>
-      <w:hyperlink r:id="rId539">
+      <w:hyperlink r:id="rId541">
         <w:r>
           <w:rPr>
             <w:rStyle w:val="Hyperlink"/>
@@ -9496,7 +9548,7 @@
           <w:numId w:val="1003"/>
         </w:numPr>
       </w:pPr>
-      <w:hyperlink r:id="rId540">
+      <w:hyperlink r:id="rId542">
         <w:r>
           <w:rPr>
             <w:rStyle w:val="Hyperlink"/>
@@ -9513,7 +9565,7 @@
           <w:numId w:val="1003"/>
         </w:numPr>
       </w:pPr>
-      <w:hyperlink r:id="rId541">
+      <w:hyperlink r:id="rId543">
         <w:r>
           <w:rPr>
             <w:rStyle w:val="Hyperlink"/>
@@ -9530,7 +9582,7 @@
           <w:numId w:val="1003"/>
         </w:numPr>
       </w:pPr>
-      <w:hyperlink r:id="rId542">
+      <w:hyperlink r:id="rId544">
         <w:r>
           <w:rPr>
             <w:rStyle w:val="Hyperlink"/>
@@ -9547,7 +9599,7 @@
           <w:numId w:val="1003"/>
         </w:numPr>
       </w:pPr>
-      <w:hyperlink r:id="rId543">
+      <w:hyperlink r:id="rId545">
         <w:r>
           <w:rPr>
             <w:rStyle w:val="Hyperlink"/>
@@ -9564,7 +9616,7 @@
           <w:numId w:val="1003"/>
         </w:numPr>
       </w:pPr>
-      <w:hyperlink r:id="rId544">
+      <w:hyperlink r:id="rId546">
         <w:r>
           <w:rPr>
             <w:rStyle w:val="Hyperlink"/>
@@ -9581,7 +9633,7 @@
           <w:numId w:val="1003"/>
         </w:numPr>
       </w:pPr>
-      <w:hyperlink r:id="rId545">
+      <w:hyperlink r:id="rId547">
         <w:r>
           <w:rPr>
             <w:rStyle w:val="Hyperlink"/>
@@ -9598,7 +9650,7 @@
           <w:numId w:val="1003"/>
         </w:numPr>
       </w:pPr>
-      <w:hyperlink r:id="rId546">
+      <w:hyperlink r:id="rId548">
         <w:r>
           <w:rPr>
             <w:rStyle w:val="Hyperlink"/>
@@ -9615,7 +9667,7 @@
           <w:numId w:val="1003"/>
         </w:numPr>
       </w:pPr>
-      <w:hyperlink r:id="rId547">
+      <w:hyperlink r:id="rId549">
         <w:r>
           <w:rPr>
             <w:rStyle w:val="Hyperlink"/>
@@ -9632,7 +9684,7 @@
           <w:numId w:val="1003"/>
         </w:numPr>
       </w:pPr>
-      <w:hyperlink r:id="rId548">
+      <w:hyperlink r:id="rId550">
         <w:r>
           <w:rPr>
             <w:rStyle w:val="Hyperlink"/>
@@ -9649,7 +9701,7 @@
           <w:numId w:val="1003"/>
         </w:numPr>
       </w:pPr>
-      <w:hyperlink r:id="rId549">
+      <w:hyperlink r:id="rId551">
         <w:r>
           <w:rPr>
             <w:rStyle w:val="Hyperlink"/>
@@ -9666,7 +9718,7 @@
           <w:numId w:val="1003"/>
         </w:numPr>
       </w:pPr>
-      <w:hyperlink r:id="rId550">
+      <w:hyperlink r:id="rId552">
         <w:r>
           <w:rPr>
             <w:rStyle w:val="Hyperlink"/>
@@ -9683,7 +9735,7 @@
           <w:numId w:val="1003"/>
         </w:numPr>
       </w:pPr>
-      <w:hyperlink r:id="rId551">
+      <w:hyperlink r:id="rId553">
         <w:r>
           <w:rPr>
             <w:rStyle w:val="Hyperlink"/>
@@ -9700,7 +9752,7 @@
           <w:numId w:val="1003"/>
         </w:numPr>
       </w:pPr>
-      <w:hyperlink r:id="rId552">
+      <w:hyperlink r:id="rId554">
         <w:r>
           <w:rPr>
             <w:rStyle w:val="Hyperlink"/>
@@ -9717,7 +9769,7 @@
           <w:numId w:val="1003"/>
         </w:numPr>
       </w:pPr>
-      <w:hyperlink r:id="rId553">
+      <w:hyperlink r:id="rId555">
         <w:r>
           <w:rPr>
             <w:rStyle w:val="Hyperlink"/>
@@ -9734,7 +9786,7 @@
           <w:numId w:val="1003"/>
         </w:numPr>
       </w:pPr>
-      <w:hyperlink r:id="rId554">
+      <w:hyperlink r:id="rId556">
         <w:r>
           <w:rPr>
             <w:rStyle w:val="Hyperlink"/>
@@ -9751,7 +9803,7 @@
           <w:numId w:val="1003"/>
         </w:numPr>
       </w:pPr>
-      <w:hyperlink r:id="rId555">
+      <w:hyperlink r:id="rId557">
         <w:r>
           <w:rPr>
             <w:rStyle w:val="Hyperlink"/>
@@ -9768,7 +9820,7 @@
           <w:numId w:val="1003"/>
         </w:numPr>
       </w:pPr>
-      <w:hyperlink r:id="rId556">
+      <w:hyperlink r:id="rId558">
         <w:r>
           <w:rPr>
             <w:rStyle w:val="Hyperlink"/>
@@ -9785,7 +9837,7 @@
           <w:numId w:val="1003"/>
         </w:numPr>
       </w:pPr>
-      <w:hyperlink r:id="rId557">
+      <w:hyperlink r:id="rId559">
         <w:r>
           <w:rPr>
             <w:rStyle w:val="Hyperlink"/>
@@ -9802,7 +9854,7 @@
           <w:numId w:val="1003"/>
         </w:numPr>
       </w:pPr>
-      <w:hyperlink r:id="rId558">
+      <w:hyperlink r:id="rId560">
         <w:r>
           <w:rPr>
             <w:rStyle w:val="Hyperlink"/>
@@ -9819,7 +9871,7 @@
           <w:numId w:val="1003"/>
         </w:numPr>
       </w:pPr>
-      <w:hyperlink r:id="rId559">
+      <w:hyperlink r:id="rId561">
         <w:r>
           <w:rPr>
             <w:rStyle w:val="Hyperlink"/>
@@ -9836,7 +9888,7 @@
           <w:numId w:val="1003"/>
         </w:numPr>
       </w:pPr>
-      <w:hyperlink r:id="rId560">
+      <w:hyperlink r:id="rId562">
         <w:r>
           <w:rPr>
             <w:rStyle w:val="Hyperlink"/>
@@ -9853,7 +9905,7 @@
           <w:numId w:val="1003"/>
         </w:numPr>
       </w:pPr>
-      <w:hyperlink r:id="rId561">
+      <w:hyperlink r:id="rId563">
         <w:r>
           <w:rPr>
             <w:rStyle w:val="Hyperlink"/>
@@ -9870,7 +9922,7 @@
           <w:numId w:val="1003"/>
         </w:numPr>
       </w:pPr>
-      <w:hyperlink r:id="rId562">
+      <w:hyperlink r:id="rId564">
         <w:r>
           <w:rPr>
             <w:rStyle w:val="Hyperlink"/>
@@ -9887,7 +9939,7 @@
           <w:numId w:val="1003"/>
         </w:numPr>
       </w:pPr>
-      <w:hyperlink r:id="rId563">
+      <w:hyperlink r:id="rId565">
         <w:r>
           <w:rPr>
             <w:rStyle w:val="Hyperlink"/>
@@ -9904,7 +9956,7 @@
           <w:numId w:val="1003"/>
         </w:numPr>
       </w:pPr>
-      <w:hyperlink r:id="rId564">
+      <w:hyperlink r:id="rId566">
         <w:r>
           <w:rPr>
             <w:rStyle w:val="Hyperlink"/>
@@ -9921,7 +9973,7 @@
           <w:numId w:val="1003"/>
         </w:numPr>
       </w:pPr>
-      <w:hyperlink r:id="rId565">
+      <w:hyperlink r:id="rId567">
         <w:r>
           <w:rPr>
             <w:rStyle w:val="Hyperlink"/>
@@ -9938,7 +9990,7 @@
           <w:numId w:val="1003"/>
         </w:numPr>
       </w:pPr>
-      <w:hyperlink r:id="rId566">
+      <w:hyperlink r:id="rId568">
         <w:r>
           <w:rPr>
             <w:rStyle w:val="Hyperlink"/>
@@ -9955,7 +10007,7 @@
           <w:numId w:val="1003"/>
         </w:numPr>
       </w:pPr>
-      <w:hyperlink r:id="rId567">
+      <w:hyperlink r:id="rId569">
         <w:r>
           <w:rPr>
             <w:rStyle w:val="Hyperlink"/>
@@ -9972,7 +10024,7 @@
           <w:numId w:val="1003"/>
         </w:numPr>
       </w:pPr>
-      <w:hyperlink r:id="rId568">
+      <w:hyperlink r:id="rId570">
         <w:r>
           <w:rPr>
             <w:rStyle w:val="Hyperlink"/>
@@ -9989,7 +10041,7 @@
           <w:numId w:val="1003"/>
         </w:numPr>
       </w:pPr>
-      <w:hyperlink r:id="rId569">
+      <w:hyperlink r:id="rId571">
         <w:r>
           <w:rPr>
             <w:rStyle w:val="Hyperlink"/>
@@ -10006,7 +10058,7 @@
           <w:numId w:val="1003"/>
         </w:numPr>
       </w:pPr>
-      <w:hyperlink r:id="rId570">
+      <w:hyperlink r:id="rId572">
         <w:r>
           <w:rPr>
             <w:rStyle w:val="Hyperlink"/>
@@ -10023,7 +10075,7 @@
           <w:numId w:val="1003"/>
         </w:numPr>
       </w:pPr>
-      <w:hyperlink r:id="rId571">
+      <w:hyperlink r:id="rId573">
         <w:r>
           <w:rPr>
             <w:rStyle w:val="Hyperlink"/>
@@ -10040,7 +10092,7 @@
           <w:numId w:val="1003"/>
         </w:numPr>
       </w:pPr>
-      <w:hyperlink r:id="rId572">
+      <w:hyperlink r:id="rId574">
         <w:r>
           <w:rPr>
             <w:rStyle w:val="Hyperlink"/>
@@ -10063,7 +10115,7 @@
       <w:r>
         <w:t xml:space="preserve"> </w:t>
       </w:r>
-      <w:hyperlink r:id="rId573">
+      <w:hyperlink r:id="rId575">
         <w:r>
           <w:rPr>
             <w:rStyle w:val="Hyperlink"/>
@@ -10080,7 +10132,7 @@
       <w:r>
         <w:t xml:space="preserve"> </w:t>
       </w:r>
-      <w:hyperlink r:id="rId574">
+      <w:hyperlink r:id="rId576">
         <w:r>
           <w:rPr>
             <w:rStyle w:val="Hyperlink"/>
@@ -10103,7 +10155,7 @@
       <w:r>
         <w:t xml:space="preserve"> </w:t>
       </w:r>
-      <w:hyperlink r:id="rId575">
+      <w:hyperlink r:id="rId577">
         <w:r>
           <w:rPr>
             <w:rStyle w:val="Hyperlink"/>
@@ -10120,7 +10172,7 @@
       <w:r>
         <w:t xml:space="preserve"> </w:t>
       </w:r>
-      <w:hyperlink r:id="rId576">
+      <w:hyperlink r:id="rId578">
         <w:r>
           <w:rPr>
             <w:rStyle w:val="Hyperlink"/>
@@ -10143,7 +10195,7 @@
       <w:r>
         <w:t xml:space="preserve"> </w:t>
       </w:r>
-      <w:hyperlink r:id="rId577">
+      <w:hyperlink r:id="rId579">
         <w:r>
           <w:rPr>
             <w:rStyle w:val="Hyperlink"/>
@@ -10160,7 +10212,7 @@
       <w:r>
         <w:t xml:space="preserve"> </w:t>
       </w:r>
-      <w:hyperlink r:id="rId578">
+      <w:hyperlink r:id="rId580">
         <w:r>
           <w:rPr>
             <w:rStyle w:val="Hyperlink"/>
@@ -10183,7 +10235,7 @@
       <w:r>
         <w:t xml:space="preserve"> </w:t>
       </w:r>
-      <w:hyperlink r:id="rId579">
+      <w:hyperlink r:id="rId581">
         <w:r>
           <w:rPr>
             <w:rStyle w:val="Hyperlink"/>
@@ -10200,7 +10252,7 @@
       <w:r>
         <w:t xml:space="preserve"> </w:t>
       </w:r>
-      <w:hyperlink r:id="rId580">
+      <w:hyperlink r:id="rId582">
         <w:r>
           <w:rPr>
             <w:rStyle w:val="Hyperlink"/>
@@ -10223,7 +10275,7 @@
       <w:r>
         <w:t xml:space="preserve"> </w:t>
       </w:r>
-      <w:hyperlink r:id="rId581">
+      <w:hyperlink r:id="rId583">
         <w:r>
           <w:rPr>
             <w:rStyle w:val="Hyperlink"/>
@@ -10240,7 +10292,7 @@
       <w:r>
         <w:t xml:space="preserve"> </w:t>
       </w:r>
-      <w:hyperlink r:id="rId582">
+      <w:hyperlink r:id="rId584">
         <w:r>
           <w:rPr>
             <w:rStyle w:val="Hyperlink"/>
@@ -10263,7 +10315,7 @@
       <w:r>
         <w:t xml:space="preserve"> </w:t>
       </w:r>
-      <w:hyperlink r:id="rId583">
+      <w:hyperlink r:id="rId585">
         <w:r>
           <w:rPr>
             <w:rStyle w:val="Hyperlink"/>
@@ -10280,7 +10332,7 @@
       <w:r>
         <w:t xml:space="preserve"> </w:t>
       </w:r>
-      <w:hyperlink r:id="rId584">
+      <w:hyperlink r:id="rId586">
         <w:r>
           <w:rPr>
             <w:rStyle w:val="Hyperlink"/>
@@ -10303,7 +10355,7 @@
       <w:r>
         <w:t xml:space="preserve"> </w:t>
       </w:r>
-      <w:hyperlink r:id="rId585">
+      <w:hyperlink r:id="rId587">
         <w:r>
           <w:rPr>
             <w:rStyle w:val="Hyperlink"/>
@@ -10320,7 +10372,7 @@
       <w:r>
         <w:t xml:space="preserve"> </w:t>
       </w:r>
-      <w:hyperlink r:id="rId586">
+      <w:hyperlink r:id="rId588">
         <w:r>
           <w:rPr>
             <w:rStyle w:val="Hyperlink"/>
@@ -10343,7 +10395,7 @@
       <w:r>
         <w:t xml:space="preserve"> </w:t>
       </w:r>
-      <w:hyperlink r:id="rId587">
+      <w:hyperlink r:id="rId589">
         <w:r>
           <w:rPr>
             <w:rStyle w:val="Hyperlink"/>
@@ -10360,7 +10412,7 @@
       <w:r>
         <w:t xml:space="preserve"> </w:t>
       </w:r>
-      <w:hyperlink r:id="rId588">
+      <w:hyperlink r:id="rId590">
         <w:r>
           <w:rPr>
             <w:rStyle w:val="Hyperlink"/>
@@ -10383,7 +10435,7 @@
       <w:r>
         <w:t xml:space="preserve"> </w:t>
       </w:r>
-      <w:hyperlink r:id="rId589">
+      <w:hyperlink r:id="rId591">
         <w:r>
           <w:rPr>
             <w:rStyle w:val="Hyperlink"/>
@@ -10400,7 +10452,7 @@
       <w:r>
         <w:t xml:space="preserve"> </w:t>
       </w:r>
-      <w:hyperlink r:id="rId590">
+      <w:hyperlink r:id="rId592">
         <w:r>
           <w:rPr>
             <w:rStyle w:val="Hyperlink"/>
@@ -10409,8 +10461,8 @@
         </w:r>
       </w:hyperlink>
     </w:p>
-    <w:bookmarkEnd w:id="591"/>
-    <w:bookmarkStart w:id="594" w:name="revisar-los-links"/>
+    <w:bookmarkEnd w:id="593"/>
+    <w:bookmarkStart w:id="596" w:name="revisar-los-links"/>
     <w:p>
       <w:pPr>
         <w:pStyle w:val="Heading2"/>
@@ -10429,7 +10481,7 @@
       <w:r>
         <w:t xml:space="preserve"> </w:t>
       </w:r>
-      <w:hyperlink r:id="rId592">
+      <w:hyperlink r:id="rId594">
         <w:r>
           <w:rPr>
             <w:rStyle w:val="VerbatimChar"/>
@@ -10463,7 +10515,7 @@
       <w:r>
         <w:t xml:space="preserve"> </w:t>
       </w:r>
-      <w:hyperlink r:id="rId593">
+      <w:hyperlink r:id="rId595">
         <w:r>
           <w:rPr>
             <w:rStyle w:val="Hyperlink"/>
@@ -10487,7 +10539,7 @@
         <w:t xml:space="preserve">.</w:t>
       </w:r>
     </w:p>
-    <w:bookmarkEnd w:id="594"/>
+    <w:bookmarkEnd w:id="596"/>
     <w:sectPr>
       <w:footnotePr>
         <w:numRestart w:val="eachSect"/>

</xml_diff>